<commit_message>
Add Space contents and agent scope-test evidence
Screenshots of the finished Space (dataset, three research reports,
Market Analysis, Reliability Evaluation, both briefs and the Research
Brief) and of the agent refusing IRR, stock-pick and post-2030 requests.
The brief and README now reference both.
</commit_message>
<xml_diff>
--- a/deliverables/Market_Intelligence_Research_Brief.docx
+++ b/deliverables/Market_Intelligence_Research_Brief.docx
@@ -731,6 +731,23 @@
       </w:r>
     </w:p>
     <w:p>
+      <w:pPr>
+        <w:ind w:left="360" w:hanging="216"/>
+      </w:pPr>
+      <w:r>
+        <w:t xml:space="preserve">• </w:t>
+      </w:r>
+      <w:r>
+        <w:rPr>
+          <w:b/>
+        </w:rPr>
+        <w:t>Scope test:</w:t>
+      </w:r>
+      <w:r>
+        <w:t xml:space="preserve"> a request for IRR/payback, a stock pick and a 2035 EV-fleet forecast. The agent refused all three and cited its scope limits (screenshot 16).</w:t>
+      </w:r>
+    </w:p>
+    <w:p>
       <w:r>
         <w:t>Outside Quick, a standard-library Python script re-derived every dataset metric, and 10 cited figures were checked against their primary sources.</w:t>
       </w:r>
@@ -747,7 +764,7 @@
         <w:t>screenshots/</w:t>
       </w:r>
       <w:r>
-        <w:t>: Space set-up (01), research set-up and plan (02–03), agent configuration and first test (04–07), research reports (08–10), Market Analysis (11a–11e), Reliability Evaluation (12a–12e), Brief v1 (13a–13d), Brief v2 (14a–14c), and the charts from the research reports (</w:t>
+        <w:t>: Space set-up (01), research set-up and plan (02–03), agent configuration and first test (04–07), research reports (08–10), Market Analysis (11a–11e), Reliability Evaluation (12a–12e), Brief v1 (13a–13d), Brief v2 (14a–14c), the Space contents (15a), a scope test (16), and the charts from the research reports (</w:t>
       </w:r>
       <w:r>
         <w:rPr>
@@ -4210,7 +4227,7 @@
               <w:rPr>
                 <w:sz w:val="17"/>
               </w:rPr>
-              <w:t>Market Analysis and Reliability Evaluation (agent document)</w:t>
+              <w:t>Market Analysis - EV Fast Charging 2026-2028.docx (agent document)</w:t>
             </w:r>
           </w:p>
         </w:tc>
@@ -4225,19 +4242,6 @@
                 <w:sz w:val="17"/>
               </w:rPr>
               <w:t>screenshots/11*</w:t>
-            </w:r>
-            <w:r>
-              <w:rPr>
-                <w:sz w:val="17"/>
-              </w:rPr>
-              <w:t xml:space="preserve">, </w:t>
-            </w:r>
-            <w:r>
-              <w:rPr>
-                <w:rFonts w:ascii="Menlo" w:hAnsi="Menlo"/>
-                <w:sz w:val="17"/>
-              </w:rPr>
-              <w:t>screenshots/12*</w:t>
             </w:r>
           </w:p>
         </w:tc>
@@ -4252,7 +4256,7 @@
               <w:rPr>
                 <w:sz w:val="17"/>
               </w:rPr>
-              <w:t>Market Intelligence Brief v1 and v2 (agent documents)</w:t>
+              <w:t>Reliability Evaluation - EV Fast Charging 2026-2028.docx (agent document)</w:t>
             </w:r>
           </w:p>
         </w:tc>
@@ -4266,20 +4270,7 @@
                 <w:rFonts w:ascii="Menlo" w:hAnsi="Menlo"/>
                 <w:sz w:val="17"/>
               </w:rPr>
-              <w:t>screenshots/13*</w:t>
-            </w:r>
-            <w:r>
-              <w:rPr>
-                <w:sz w:val="17"/>
-              </w:rPr>
-              <w:t xml:space="preserve">, </w:t>
-            </w:r>
-            <w:r>
-              <w:rPr>
-                <w:rFonts w:ascii="Menlo" w:hAnsi="Menlo"/>
-                <w:sz w:val="17"/>
-              </w:rPr>
-              <w:t>screenshots/14*</w:t>
+              <w:t>screenshots/12*</w:t>
             </w:r>
           </w:p>
         </w:tc>
@@ -4294,7 +4285,49 @@
               <w:rPr>
                 <w:sz w:val="17"/>
               </w:rPr>
-              <w:t>This Research Brief</w:t>
+              <w:t>Market Intelligence Brief (v1) and Market Intelligence Brief v2 (.docx, agent documents)</w:t>
+            </w:r>
+          </w:p>
+        </w:tc>
+        <w:tc>
+          <w:tcPr>
+            <w:tcW w:type="dxa" w:w="4680"/>
+          </w:tcPr>
+          <w:p>
+            <w:r>
+              <w:rPr>
+                <w:rFonts w:ascii="Menlo" w:hAnsi="Menlo"/>
+                <w:sz w:val="17"/>
+              </w:rPr>
+              <w:t>screenshots/13*</w:t>
+            </w:r>
+            <w:r>
+              <w:rPr>
+                <w:sz w:val="17"/>
+              </w:rPr>
+              <w:t xml:space="preserve">, </w:t>
+            </w:r>
+            <w:r>
+              <w:rPr>
+                <w:rFonts w:ascii="Menlo" w:hAnsi="Menlo"/>
+                <w:sz w:val="17"/>
+              </w:rPr>
+              <w:t>screenshots/14*</w:t>
+            </w:r>
+          </w:p>
+        </w:tc>
+      </w:tr>
+      <w:tr>
+        <w:tc>
+          <w:tcPr>
+            <w:tcW w:type="dxa" w:w="4680"/>
+          </w:tcPr>
+          <w:p>
+            <w:r>
+              <w:rPr>
+                <w:sz w:val="17"/>
+              </w:rPr>
+              <w:t>Market_Intelligence_Research_Brief.pdf (this brief)</w:t>
             </w:r>
           </w:p>
         </w:tc>

</xml_diff>

<commit_message>
Add the agent's Word outputs and its generated charts
Downloads the Market Analysis, Reliability Evaluation, both leadership
brief versions and the combined analysis document from the Space and
chat. Two agent charts are added as visual evidence; two others are
flagged in the brief as errors (Tesla share renormalised, BEV shares
mixing a monthly peak with annual figures).
</commit_message>
<xml_diff>
--- a/deliverables/Market_Intelligence_Research_Brief.docx
+++ b/deliverables/Market_Intelligence_Research_Brief.docx
@@ -727,1195 +727,1205 @@
         <w:t>Agent features:</w:t>
       </w:r>
       <w:r>
-        <w:t xml:space="preserve"> code execution for dataset arithmetic, table views, and document artifacts added to the Space as Word files.</w:t>
-      </w:r>
-    </w:p>
-    <w:p>
-      <w:pPr>
-        <w:ind w:left="360" w:hanging="216"/>
-      </w:pPr>
-      <w:r>
-        <w:t xml:space="preserve">• </w:t>
-      </w:r>
-      <w:r>
-        <w:rPr>
-          <w:b/>
-        </w:rPr>
-        <w:t>Scope test:</w:t>
-      </w:r>
-      <w:r>
-        <w:t xml:space="preserve"> a request for IRR/payback, a stock pick and a 2035 EV-fleet forecast. The agent refused all three and cited its scope limits (screenshot 16).</w:t>
-      </w:r>
-    </w:p>
-    <w:p>
-      <w:r>
-        <w:t>Outside Quick, a standard-library Python script re-derived every dataset metric, and 10 cited figures were checked against their primary sources.</w:t>
-      </w:r>
-    </w:p>
-    <w:p>
-      <w:r>
-        <w:t xml:space="preserve">Evidence of AI-assisted work is in </w:t>
+        <w:t xml:space="preserve"> code execution for dataset arithmetic and charts, table views, and document artifacts added to the Space as Word files (downloaded to </w:t>
       </w:r>
       <w:r>
         <w:rPr>
           <w:rFonts w:ascii="Menlo" w:hAnsi="Menlo"/>
           <w:sz w:val="18"/>
         </w:rPr>
-        <w:t>screenshots/</w:t>
-      </w:r>
-      <w:r>
-        <w:t>: Space set-up (01), research set-up and plan (02–03), agent configuration and first test (04–07), research reports (08–10), Market Analysis (11a–11e), Reliability Evaluation (12a–12e), Brief v1 (13a–13d), Brief v2 (14a–14c), the Space contents (15a), a scope test (16), and the charts from the research reports (</w:t>
+        <w:t>deliverables/agent_outputs/</w:t>
+      </w:r>
+      <w:r>
+        <w:t>).</w:t>
+      </w:r>
+    </w:p>
+    <w:p>
+      <w:pPr>
+        <w:ind w:left="360" w:hanging="216"/>
+      </w:pPr>
+      <w:r>
+        <w:t xml:space="preserve">• </w:t>
+      </w:r>
+      <w:r>
+        <w:rPr>
+          <w:b/>
+        </w:rPr>
+        <w:t>Scope test:</w:t>
+      </w:r>
+      <w:r>
+        <w:t xml:space="preserve"> a request for IRR/payback, a stock pick and a 2035 EV-fleet forecast. The agent refused all three and cited its scope limits (screenshot 16).</w:t>
+      </w:r>
+    </w:p>
+    <w:p>
+      <w:r>
+        <w:t>Outside Quick, a standard-library Python script re-derived every dataset metric, and 10 cited figures were checked against their primary sources.</w:t>
+      </w:r>
+    </w:p>
+    <w:p>
+      <w:r>
+        <w:t xml:space="preserve">Evidence of AI-assisted work is in </w:t>
       </w:r>
       <w:r>
         <w:rPr>
           <w:rFonts w:ascii="Menlo" w:hAnsi="Menlo"/>
           <w:sz w:val="18"/>
         </w:rPr>
-        <w:t>visuals/</w:t>
-      </w:r>
-      <w:r>
-        <w:t>).</w:t>
-      </w:r>
-    </w:p>
-    <w:p>
-      <w:pPr>
-        <w:pStyle w:val="Heading2"/>
-      </w:pPr>
-      <w:r>
-        <w:t>4. Key Market Insights</w:t>
-      </w:r>
-    </w:p>
-    <w:p>
-      <w:pPr>
-        <w:pStyle w:val="Heading3"/>
-      </w:pPr>
-      <w:r>
-        <w:t>Insight 1: The 2023 "charging gap" has largely closed; build-out is now outrunning the fleet in every market</w:t>
-      </w:r>
-    </w:p>
-    <w:p>
-      <w:pPr>
-        <w:ind w:left="360" w:hanging="216"/>
-      </w:pPr>
-      <w:r>
-        <w:t xml:space="preserve">• </w:t>
-      </w:r>
-      <w:r>
-        <w:rPr>
-          <w:b/>
-        </w:rPr>
-        <w:t>Insight Summary:</w:t>
-      </w:r>
-      <w:r>
-        <w:t xml:space="preserve"> The internal dataset shows EVs per public fast charger rising in the UK from 69 in 2018 to 158 in 2023, which reads as a widening undersupply. The 2024–2026 evidence reverses that: charger counts grew faster than the fleet in all four markets. A 2026 entry thesis built on national undersupply is out of date. The case now rests on where individual sites are still thin, and on how well they are used.</w:t>
-      </w:r>
-    </w:p>
-    <w:p>
-      <w:pPr>
-        <w:ind w:left="360" w:hanging="216"/>
-      </w:pPr>
-      <w:r>
-        <w:t xml:space="preserve">• </w:t>
-      </w:r>
-      <w:r>
-        <w:rPr>
-          <w:b/>
-        </w:rPr>
-        <w:t>Supporting Evidence or Signals:</w:t>
-      </w:r>
-    </w:p>
-    <w:p>
-      <w:pPr>
-        <w:ind w:left="720" w:hanging="216"/>
-      </w:pPr>
-      <w:r>
-        <w:t xml:space="preserve">• </w:t>
-      </w:r>
-      <w:r>
-        <w:rPr>
-          <w:b/>
-        </w:rPr>
-        <w:t>Dataset, 2023</w:t>
-      </w:r>
-      <w:r>
-        <w:t xml:space="preserve"> (IEA Global EV Data 2024; EVs per public fast charger, chargers above 22 kW, BEV+PHEV): UK 158 (1.58 M EVs ÷ 10,000 chargers); US 112 (4.82 M ÷ 43,000); Germany 119 (2.50 M ÷ 21,000); France 79 (1.57 M ÷ 20,000); EU27 99, where fast chargers grew +67% in 2023.</w:t>
-      </w:r>
-    </w:p>
-    <w:p>
-      <w:pPr>
-        <w:ind w:left="720" w:hanging="216"/>
-      </w:pPr>
-      <w:r>
-        <w:t xml:space="preserve">• </w:t>
-      </w:r>
-      <w:r>
-        <w:rPr>
-          <w:b/>
-        </w:rPr>
-        <w:t>UK:</w:t>
-      </w:r>
-      <w:r>
-        <w:t xml:space="preserve"> 50 kW+ chargers went from 10,118 (Jan 2024) to 28,887 (1 Jul 2026) [Research: UK report; DfT statistics, verified]. That is about 66 BEVs per 50 kW+ charger by mid-2026 [Research: UK report, DfT Apr 2026]. The BEV fleet grew from about 1.33 M (end-2024) to about 2.1 M (mid-2026). That is +58%; the report's claim that it "doubled" is wrong.</w:t>
-      </w:r>
-    </w:p>
-    <w:p>
-      <w:pPr>
-        <w:ind w:left="720" w:hanging="216"/>
-      </w:pPr>
-      <w:r>
-        <w:t xml:space="preserve">• </w:t>
-      </w:r>
-      <w:r>
-        <w:rPr>
-          <w:b/>
-        </w:rPr>
-        <w:t>Germany:</w:t>
-      </w:r>
-      <w:r>
-        <w:t xml:space="preserve"> DC fast points went from 21,000 (2023) to 40,777 (Jul 2025) to 48,729 (Jan 2026) to 54,341 (Jul 2026) [Research: EU report; Bundesnetzagentur via heise/electrive, verified]. That gives about 71 EVs per fast charger in mid-2025.</w:t>
-      </w:r>
-    </w:p>
-    <w:p>
-      <w:pPr>
-        <w:ind w:left="720" w:hanging="216"/>
-      </w:pPr>
-      <w:r>
-        <w:t xml:space="preserve">• </w:t>
-      </w:r>
-      <w:r>
-        <w:rPr>
-          <w:b/>
-        </w:rPr>
-        <w:t>France:</w:t>
-      </w:r>
-      <w:r>
-        <w:t xml:space="preserve"> 150 kW+ points went from 19,848 (Feb 2024) to 31,335 (Feb 2025) [Research: EU report; Avere-France]. That gives about 46 EVs per high-power point.</w:t>
-      </w:r>
-    </w:p>
-    <w:p>
-      <w:pPr>
-        <w:ind w:left="720" w:hanging="216"/>
-      </w:pPr>
-      <w:r>
-        <w:t xml:space="preserve">• </w:t>
-      </w:r>
-      <w:r>
-        <w:rPr>
-          <w:b/>
-        </w:rPr>
-        <w:t>US:</w:t>
-      </w:r>
-      <w:r>
-        <w:t xml:space="preserve"> DC fast ports went from 43,000 (2023) to 50,428 (Dec 2024), about 68,000 (end-2025) and 76,236 (Sep 2026) [Research: US report; evchargingstations.com, verified]. That gives about 96–106 EVs per port.</w:t>
-      </w:r>
-    </w:p>
-    <w:p>
-      <w:pPr>
-        <w:ind w:left="360" w:hanging="216"/>
-      </w:pPr>
-      <w:r>
-        <w:t xml:space="preserve">• </w:t>
-      </w:r>
-      <w:r>
-        <w:rPr>
-          <w:b/>
-        </w:rPr>
-        <w:t>Why This Insight Matters:</w:t>
-      </w:r>
-      <w:r>
-        <w:t xml:space="preserve"> Each charger now serves fewer EVs than in 2023, so revenue per charger falls unless a site sits where demand is still concentrated. It changes the question leadership should ask, from "which country is short of chargers?" to "which sites are short of chargers, and can we win them?". It also means the 2023 dataset alone would have pointed the operator the wrong way.</w:t>
-      </w:r>
-    </w:p>
-    <w:p>
-      <w:pPr>
-        <w:ind w:left="360" w:hanging="216"/>
-      </w:pPr>
-      <w:r>
-        <w:t xml:space="preserve">• </w:t>
-      </w:r>
-      <w:r>
-        <w:rPr>
-          <w:b/>
-        </w:rPr>
-        <w:t>Signal freshness:</w:t>
-      </w:r>
-      <w:r>
-        <w:t xml:space="preserve"> UK 1 Jul 2026 (DfT, published 27 Aug 2026); Germany Jul 2026; US Sep 2026; France Feb 2025. The France figure is the oldest; the other three are current.</w:t>
-      </w:r>
-    </w:p>
-    <w:p>
-      <w:pPr>
-        <w:ind w:left="360" w:hanging="216"/>
-      </w:pPr>
-      <w:r>
-        <w:t xml:space="preserve">• </w:t>
-      </w:r>
-      <w:r>
-        <w:rPr>
-          <w:b/>
-        </w:rPr>
-        <w:t>What would change our mind:</w:t>
-      </w:r>
-      <w:r>
-        <w:t xml:space="preserve"> Q3/Q4 2026 statistics showing BEV fleet growth outpacing charger growth again, or UK BEVs per 50 kW+ charger rising back above ~80.</w:t>
-      </w:r>
-    </w:p>
-    <w:p>
-      <w:pPr>
-        <w:pStyle w:val="Heading3"/>
-      </w:pPr>
-      <w:r>
-        <w:t>Insight 2: EV demand is policy-driven and diverging; the UK has a statutory floor, France has momentum, the US has lost its federal support</w:t>
-      </w:r>
-    </w:p>
-    <w:p>
-      <w:pPr>
-        <w:ind w:left="360" w:hanging="216"/>
-      </w:pPr>
-      <w:r>
-        <w:t xml:space="preserve">• </w:t>
-      </w:r>
-      <w:r>
-        <w:rPr>
-          <w:b/>
-        </w:rPr>
-        <w:t>Insight Summary:</w:t>
-      </w:r>
-      <w:r>
-        <w:t xml:space="preserve"> New-car demand in all four markets tracks policy almost one-for-one. The UK ZEV mandate sets a legal floor that rises steeply to 2028. France is accelerating with subsidies extended. Germany recovered after cutting and then reintroducing grants. The US fell sharply once the federal credit expired.</w:t>
-      </w:r>
-    </w:p>
-    <w:p>
-      <w:pPr>
-        <w:ind w:left="360" w:hanging="216"/>
-      </w:pPr>
-      <w:r>
-        <w:t xml:space="preserve">• </w:t>
-      </w:r>
-      <w:r>
-        <w:rPr>
-          <w:b/>
-        </w:rPr>
-        <w:t>Supporting Evidence or Signals:</w:t>
-      </w:r>
-    </w:p>
-    <w:p>
-      <w:pPr>
-        <w:ind w:left="720" w:hanging="216"/>
-      </w:pPr>
-      <w:r>
-        <w:t xml:space="preserve">• </w:t>
-      </w:r>
-      <w:r>
-        <w:rPr>
-          <w:b/>
-        </w:rPr>
-        <w:t>UK:</w:t>
-      </w:r>
-    </w:p>
-    <w:p>
-      <w:pPr>
-        <w:ind w:left="1080" w:hanging="216"/>
-      </w:pPr>
-      <w:r>
-        <w:t xml:space="preserve">• </w:t>
-      </w:r>
-      <w:r>
-        <w:t>BEV share was 19.6% in 2024 (381,970 cars) and 23.4% in 2025 (473,348) [SMMT, verified].</w:t>
-      </w:r>
-    </w:p>
-    <w:p>
-      <w:pPr>
-        <w:ind w:left="1080" w:hanging="216"/>
-      </w:pPr>
-      <w:r>
-        <w:t xml:space="preserve">• </w:t>
-      </w:r>
-      <w:r>
-        <w:t>The mandate targets 28% for 2025, 33% for 2026 and 52% for 2028 [Research: UK report; VETS Order].</w:t>
-      </w:r>
-    </w:p>
-    <w:p>
-      <w:pPr>
-        <w:ind w:left="1080" w:hanging="216"/>
-      </w:pPr>
-      <w:r>
-        <w:t xml:space="preserve">• </w:t>
-      </w:r>
-      <w:r>
-        <w:t>A formal review of the mandate launched in August 2026 [Research: UK report; gov.uk].</w:t>
-      </w:r>
-    </w:p>
-    <w:p>
-      <w:pPr>
-        <w:ind w:left="1080" w:hanging="216"/>
-      </w:pPr>
-      <w:r>
-        <w:t xml:space="preserve">• </w:t>
-      </w:r>
-      <w:r>
-        <w:t>Two 2026 year-to-date shares conflict: about 25% (H1 2026, Car Magazine) and about 29.8% (Jan–Aug 2026, EY/Roadgenius). Both are shown and neither is averaged.</w:t>
-      </w:r>
-    </w:p>
-    <w:p>
-      <w:pPr>
-        <w:ind w:left="720" w:hanging="216"/>
-      </w:pPr>
-      <w:r>
-        <w:t xml:space="preserve">• </w:t>
-      </w:r>
-      <w:r>
-        <w:rPr>
-          <w:b/>
-        </w:rPr>
-        <w:t>France:</w:t>
-      </w:r>
-      <w:r>
-        <w:t xml:space="preserve"> BEV share rose from 16.9% (2024) to 20.0% (2025). H1 2026 registrations were +62.9% year on year [ACEA, verified], and August 2026 set a monthly record of 38.8% [Research: EU report; Avere-France].</w:t>
-      </w:r>
-    </w:p>
-    <w:p>
-      <w:pPr>
-        <w:ind w:left="720" w:hanging="216"/>
-      </w:pPr>
-      <w:r>
-        <w:t xml:space="preserve">• </w:t>
-      </w:r>
-      <w:r>
-        <w:rPr>
-          <w:b/>
-        </w:rPr>
-        <w:t>Germany:</w:t>
-      </w:r>
-      <w:r>
-        <w:t xml:space="preserve"> BEV share fell from 18.4% (2023) to 13.5% (2024) after the purchase subsidy (Umweltbonus) ended, then rose to 19.1% (2025). H1 2026 was +48%, helped by a new grant of up to €6,000 from January 2026 [Research: EU report; ADAC/KBA/heise].</w:t>
-      </w:r>
-    </w:p>
-    <w:p>
-      <w:pPr>
-        <w:ind w:left="720" w:hanging="216"/>
-      </w:pPr>
-      <w:r>
-        <w:t xml:space="preserve">• </w:t>
-      </w:r>
-      <w:r>
-        <w:rPr>
-          <w:b/>
-        </w:rPr>
-        <w:t>US:</w:t>
-      </w:r>
-    </w:p>
-    <w:p>
-      <w:pPr>
-        <w:ind w:left="1080" w:hanging="216"/>
-      </w:pPr>
-      <w:r>
-        <w:t xml:space="preserve">• </w:t>
-      </w:r>
-      <w:r>
-        <w:t>The $7,500 credit expired on 30 Sep 2025. BEV share hit 12% that September, then fell below 6% in Q4 2025 [EIA, verified].</w:t>
-      </w:r>
-    </w:p>
-    <w:p>
-      <w:pPr>
-        <w:ind w:left="1080" w:hanging="216"/>
-      </w:pPr>
-      <w:r>
-        <w:t xml:space="preserve">• </w:t>
-      </w:r>
-      <w:r>
-        <w:t>BEV share was 7.7% for 2025 [NADA].</w:t>
-      </w:r>
-    </w:p>
-    <w:p>
-      <w:pPr>
-        <w:ind w:left="1080" w:hanging="216"/>
-      </w:pPr>
-      <w:r>
-        <w:t xml:space="preserve">• </w:t>
-      </w:r>
-      <w:r>
-        <w:t>Mid-2026 registrations were down about 31% year on year [Research: US report; single press source].</w:t>
-      </w:r>
-    </w:p>
-    <w:p>
-      <w:pPr>
-        <w:ind w:left="1080" w:hanging="216"/>
-      </w:pPr>
-      <w:r>
-        <w:t xml:space="preserve">• </w:t>
-      </w:r>
-      <w:r>
-        <w:t>IEA STEPS had projected 20% for 2025 [Dataset, projection].</w:t>
-      </w:r>
-    </w:p>
-    <w:p>
-      <w:pPr>
-        <w:ind w:left="360" w:hanging="216"/>
-      </w:pPr>
-      <w:r>
-        <w:t xml:space="preserve">• </w:t>
-      </w:r>
-      <w:r>
-        <w:rPr>
-          <w:b/>
-        </w:rPr>
-        <w:t>Why This Insight Matters:</w:t>
-      </w:r>
-      <w:r>
-        <w:t xml:space="preserve"> For a 2026–2028 horizon, the operator is effectively betting on policy. The UK floor and French subsidies reduce downside risk on demand. The US needs a new incentive before demand growth resumes.</w:t>
-      </w:r>
-    </w:p>
-    <w:p>
-      <w:pPr>
-        <w:ind w:left="360" w:hanging="216"/>
-      </w:pPr>
-      <w:r>
-        <w:t xml:space="preserve">• </w:t>
-      </w:r>
-      <w:r>
-        <w:rPr>
-          <w:b/>
-        </w:rPr>
-        <w:t>Signal freshness:</w:t>
-      </w:r>
-      <w:r>
-        <w:t xml:space="preserve"> All figures are from Jan–Sep 2026 except the US 2025 annual figure. The UK review outcome is still open; the consultation runs August–October 2026.</w:t>
-      </w:r>
-    </w:p>
-    <w:p>
-      <w:pPr>
-        <w:ind w:left="360" w:hanging="216"/>
-      </w:pPr>
-      <w:r>
-        <w:t xml:space="preserve">• </w:t>
-      </w:r>
-      <w:r>
-        <w:rPr>
-          <w:b/>
-        </w:rPr>
-        <w:t>What would change our mind:</w:t>
-      </w:r>
-      <w:r>
-        <w:t xml:space="preserve"> A UK review that materially cuts the 2027–2028 targets, or a new US federal purchase incentive.</w:t>
-      </w:r>
-    </w:p>
-    <w:p>
-      <w:pPr>
-        <w:pStyle w:val="Heading3"/>
-      </w:pPr>
-      <w:r>
-        <w:t>Insight 3: Utilisation and grid cost, not EV demand, are the binding constraint on returns</w:t>
-      </w:r>
-    </w:p>
-    <w:p>
-      <w:pPr>
-        <w:ind w:left="360" w:hanging="216"/>
-      </w:pPr>
-      <w:r>
-        <w:t xml:space="preserve">• </w:t>
-      </w:r>
-      <w:r>
-        <w:rPr>
-          <w:b/>
-        </w:rPr>
-        <w:t>Insight Summary:</w:t>
-      </w:r>
-      <w:r>
-        <w:t xml:space="preserve"> In every market with data, chargers are used for a small share of the day, and fixed grid costs are large. The ability to secure cheap, timely grid capacity decides returns more than the size of the EV fleet does.</w:t>
-      </w:r>
-    </w:p>
-    <w:p>
-      <w:pPr>
-        <w:ind w:left="360" w:hanging="216"/>
-      </w:pPr>
-      <w:r>
-        <w:t xml:space="preserve">• </w:t>
-      </w:r>
-      <w:r>
-        <w:rPr>
-          <w:b/>
-        </w:rPr>
-        <w:t>Supporting Evidence or Signals:</w:t>
-      </w:r>
-    </w:p>
-    <w:p>
-      <w:pPr>
-        <w:ind w:left="720" w:hanging="216"/>
-      </w:pPr>
-      <w:r>
-        <w:t xml:space="preserve">• </w:t>
-      </w:r>
-      <w:r>
-        <w:rPr>
-          <w:b/>
-        </w:rPr>
-        <w:t>UK:</w:t>
-      </w:r>
-    </w:p>
-    <w:p>
-      <w:pPr>
-        <w:ind w:left="1080" w:hanging="216"/>
-      </w:pPr>
-      <w:r>
-        <w:t xml:space="preserve">• </w:t>
-      </w:r>
-      <w:r>
-        <w:t>Utilisation is about 8% (about 2 hours a day). Our fact-check found this is the Zapmap average for all public chargers, not rapid chargers as the research report implied.</w:t>
-      </w:r>
-    </w:p>
-    <w:p>
-      <w:pPr>
-        <w:ind w:left="1080" w:hanging="216"/>
-      </w:pPr>
-      <w:r>
-        <w:t xml:space="preserve">• </w:t>
-      </w:r>
-      <w:r>
-        <w:t>Rapid and ultra-rapid devices handle 72% of sessions from 23% of devices [Research: UK report; Zapmap].</w:t>
-      </w:r>
-    </w:p>
-    <w:p>
-      <w:pPr>
-        <w:ind w:left="1080" w:hanging="216"/>
-      </w:pPr>
-      <w:r>
-        <w:t xml:space="preserve">• </w:t>
-      </w:r>
-      <w:r>
-        <w:t>Grid standing charges for an ultra-rapid hub rose from £99 a year (2022) to £8,600 (2024), according to an operator source (Osprey).</w:t>
-      </w:r>
-    </w:p>
-    <w:p>
-      <w:pPr>
-        <w:ind w:left="1080" w:hanging="216"/>
-      </w:pPr>
-      <w:r>
-        <w:t xml:space="preserve">• </w:t>
-      </w:r>
-      <w:r>
-        <w:t>The average gap between requested and offered grid-connection dates is 5.5 years, for all connecting customers [Research: UK report].</w:t>
-      </w:r>
-    </w:p>
-    <w:p>
-      <w:pPr>
-        <w:ind w:left="1080" w:hanging="216"/>
-      </w:pPr>
-      <w:r>
-        <w:t xml:space="preserve">• </w:t>
-      </w:r>
-      <w:r>
-        <w:t>The average rapid price is about 77p/kWh, against 7–8p on a home smart tariff [Research: UK report].</w:t>
-      </w:r>
-    </w:p>
-    <w:p>
-      <w:pPr>
-        <w:ind w:left="720" w:hanging="216"/>
-      </w:pPr>
-      <w:r>
-        <w:t xml:space="preserve">• </w:t>
-      </w:r>
-      <w:r>
-        <w:rPr>
-          <w:b/>
-        </w:rPr>
-        <w:t>US:</w:t>
-      </w:r>
-    </w:p>
-    <w:p>
-      <w:pPr>
-        <w:ind w:left="1080" w:hanging="216"/>
-      </w:pPr>
-      <w:r>
-        <w:t xml:space="preserve">• </w:t>
-      </w:r>
-      <w:r>
-        <w:t>National DC fast utilisation was 16.6% (Q1 2025) and 16.1% (mid-2025) [Paren].</w:t>
-      </w:r>
-    </w:p>
-    <w:p>
-      <w:pPr>
-        <w:ind w:left="1080" w:hanging="216"/>
-      </w:pPr>
-      <w:r>
-        <w:t xml:space="preserve">• </w:t>
-      </w:r>
-      <w:r>
-        <w:t>The profitability threshold is estimated at about 15% [Stable Auto via Fortune, 2024].</w:t>
-      </w:r>
-    </w:p>
-    <w:p>
-      <w:pPr>
-        <w:ind w:left="1080" w:hanging="216"/>
-      </w:pPr>
-      <w:r>
-        <w:t xml:space="preserve">• </w:t>
-      </w:r>
-      <w:r>
-        <w:t>At low utilisation, demand charges can exceed 90% of a station's electricity cost [RMI].</w:t>
-      </w:r>
-    </w:p>
-    <w:p>
-      <w:pPr>
-        <w:ind w:left="720" w:hanging="216"/>
-      </w:pPr>
-      <w:r>
-        <w:t xml:space="preserve">• </w:t>
-      </w:r>
-      <w:r>
-        <w:rPr>
-          <w:b/>
-        </w:rPr>
-        <w:t>EU:</w:t>
-      </w:r>
-    </w:p>
-    <w:p>
-      <w:pPr>
-        <w:ind w:left="1080" w:hanging="216"/>
-      </w:pPr>
-      <w:r>
-        <w:t xml:space="preserve">• </w:t>
-      </w:r>
-      <w:r>
-        <w:t>Estimated payback is 6–12 years [Springer, 2025].</w:t>
-      </w:r>
-    </w:p>
-    <w:p>
-      <w:pPr>
-        <w:ind w:left="1080" w:hanging="216"/>
-      </w:pPr>
-      <w:r>
-        <w:t xml:space="preserve">• </w:t>
-      </w:r>
-      <w:r>
-        <w:t>No German or French utilisation data was found. This is a gap, not a finding.</w:t>
-      </w:r>
-    </w:p>
-    <w:p>
-      <w:pPr>
-        <w:ind w:left="360" w:hanging="216"/>
-      </w:pPr>
-      <w:r>
-        <w:t xml:space="preserve">• </w:t>
-      </w:r>
-      <w:r>
-        <w:rPr>
-          <w:b/>
-        </w:rPr>
-        <w:t>Why This Insight Matters:</w:t>
-      </w:r>
-      <w:r>
-        <w:t xml:space="preserve"> Site choice should favour locations that already have grid capacity or funded network upgrades. Examples are motorway service areas (Ofgem's £300 M Green Recovery Scheme upgraded 37 of them), retail forecourts, and battery-buffered sites. Utilisation data by charger speed is the most valuable missing input.</w:t>
-      </w:r>
-    </w:p>
-    <w:p>
-      <w:pPr>
-        <w:ind w:left="360" w:hanging="216"/>
-      </w:pPr>
-      <w:r>
-        <w:t xml:space="preserve">• </w:t>
-      </w:r>
-      <w:r>
-        <w:rPr>
-          <w:b/>
-        </w:rPr>
-        <w:t>Signal freshness:</w:t>
-      </w:r>
-      <w:r>
-        <w:t xml:space="preserve"> UK utilisation is updated quarterly (the page blocked direct access; wording checked via search results). US utilisation data is 2025. The grid-cost figures are 2024–2026.</w:t>
-      </w:r>
-    </w:p>
-    <w:p>
-      <w:pPr>
-        <w:ind w:left="360" w:hanging="216"/>
-      </w:pPr>
-      <w:r>
-        <w:t xml:space="preserve">• </w:t>
-      </w:r>
-      <w:r>
-        <w:rPr>
-          <w:b/>
-        </w:rPr>
-        <w:t>What would change our mind:</w:t>
-      </w:r>
-      <w:r>
-        <w:t xml:space="preserve"> Published UK rapid-specific utilisation consistently above 15%, or Ofgem's demand-connection reform (launched Feb 2026) materially cutting queue times for charging sites.</w:t>
-      </w:r>
-    </w:p>
-    <w:p>
-      <w:pPr>
-        <w:pStyle w:val="Heading3"/>
-      </w:pPr>
-      <w:r>
-        <w:t>Insight 4: Competition is concentrated in the US and Germany and fragmented, but consolidating, in the UK and France</w:t>
-      </w:r>
-    </w:p>
-    <w:p>
-      <w:pPr>
-        <w:ind w:left="360" w:hanging="216"/>
-      </w:pPr>
-      <w:r>
-        <w:t xml:space="preserve">• </w:t>
-      </w:r>
-      <w:r>
-        <w:rPr>
-          <w:b/>
-        </w:rPr>
-        <w:t>Insight Summary:</w:t>
-      </w:r>
-      <w:r>
-        <w:t xml:space="preserve"> A mid-size entrant faces scale incumbents in the US (Tesla) and Germany (EnBW, plus the subsidised Deutschlandnetz). The UK and France have more room, but consolidation is under way and capital intensity is high.</w:t>
-      </w:r>
-    </w:p>
-    <w:p>
-      <w:pPr>
-        <w:ind w:left="360" w:hanging="216"/>
-      </w:pPr>
-      <w:r>
-        <w:t xml:space="preserve">• </w:t>
-      </w:r>
-      <w:r>
-        <w:rPr>
-          <w:b/>
-        </w:rPr>
-        <w:t>Supporting Evidence or Signals:</w:t>
-      </w:r>
-    </w:p>
-    <w:p>
-      <w:pPr>
-        <w:ind w:left="720" w:hanging="216"/>
-      </w:pPr>
-      <w:r>
-        <w:t xml:space="preserve">• </w:t>
-      </w:r>
-      <w:r>
-        <w:rPr>
-          <w:b/>
-        </w:rPr>
-        <w:t>US:</w:t>
-      </w:r>
-      <w:r>
-        <w:t xml:space="preserve"> Tesla has 37,995 of 76,236 DC ports (49.8%, Sep 2026), down from about 54.6% in Jul 2025. The "Other" network category grew 44% year on year [evchargingstations.com, verified]. IONNA, backed by automakers, targets 30,000 sites [Research: US report].</w:t>
-      </w:r>
-    </w:p>
-    <w:p>
-      <w:pPr>
-        <w:ind w:left="720" w:hanging="216"/>
-      </w:pPr>
-      <w:r>
-        <w:t xml:space="preserve">• </w:t>
-      </w:r>
-      <w:r>
-        <w:rPr>
-          <w:b/>
-        </w:rPr>
-        <w:t>Germany (end-2024 fast chargers):</w:t>
-      </w:r>
-      <w:r>
-        <w:t xml:space="preserve"> EnBW 6,005, Tesla 3,110, Aral pulse 2,317, Allego 1,541, Ionity 1,084. The Deutschlandnetz programme has about 9,000 points of 200 kW or more at more than 1,000 locations [Research: EU report].</w:t>
-      </w:r>
-    </w:p>
-    <w:p>
-      <w:pPr>
-        <w:ind w:left="720" w:hanging="216"/>
-      </w:pPr>
-      <w:r>
-        <w:t xml:space="preserve">• </w:t>
-      </w:r>
-      <w:r>
-        <w:rPr>
-          <w:b/>
-        </w:rPr>
-        <w:t>UK:</w:t>
-      </w:r>
-    </w:p>
-    <w:p>
-      <w:pPr>
-        <w:ind w:left="1080" w:hanging="216"/>
-      </w:pPr>
-      <w:r>
-        <w:t xml:space="preserve">• </w:t>
-      </w:r>
-      <w:r>
-        <w:t>About 100–150 CPOs; the top 5 hold about a third of the market; industry leaders expect consolidation to 5–6 players [Research: UK report; Guardian Feb 2026].</w:t>
-      </w:r>
-    </w:p>
-    <w:p>
-      <w:pPr>
-        <w:ind w:left="1080" w:hanging="216"/>
-      </w:pPr>
-      <w:r>
-        <w:t xml:space="preserve">• </w:t>
-      </w:r>
-      <w:r>
-        <w:t>Rapid-charger leaders in Feb 2026: MFG EV Power 2,789, Osprey 2,578, BP Pulse 2,506 [Zapmap].</w:t>
-      </w:r>
-    </w:p>
-    <w:p>
-      <w:pPr>
-        <w:ind w:left="1080" w:hanging="216"/>
-      </w:pPr>
-      <w:r>
-        <w:t xml:space="preserve">• </w:t>
-      </w:r>
-      <w:r>
-        <w:t>More than £460 M was raised in 2025–26 by InstaVolt (£250 M), Osprey (£110 M) and Gridserve (£100 M).</w:t>
-      </w:r>
-    </w:p>
-    <w:p>
-      <w:pPr>
-        <w:ind w:left="720" w:hanging="216"/>
-      </w:pPr>
-      <w:r>
-        <w:t xml:space="preserve">• </w:t>
-      </w:r>
-      <w:r>
-        <w:rPr>
-          <w:b/>
-        </w:rPr>
-        <w:t>France (May 2025, high-power points):</w:t>
-      </w:r>
-      <w:r>
-        <w:t xml:space="preserve"> Tesla 3,019, TotalEnergies 1,543, Electra 1,504 (after a €304 M Series B), Ionity 688, Fastned 265 [Research: EU report; EV Boosters].</w:t>
-      </w:r>
-    </w:p>
-    <w:p>
-      <w:pPr>
-        <w:ind w:left="360" w:hanging="216"/>
-      </w:pPr>
-      <w:r>
-        <w:t xml:space="preserve">• </w:t>
-      </w:r>
-      <w:r>
-        <w:rPr>
-          <w:b/>
-        </w:rPr>
-        <w:t>Why This Insight Matters:</w:t>
-      </w:r>
-      <w:r>
-        <w:t xml:space="preserve"> In the US, winning share means competing against Tesla's cost base and IONNA's automaker funding. In the UK and France, fragmentation leaves room for a mid-size operator, but the capital raised by rivals sets a high bar for site acquisition.</w:t>
-      </w:r>
-    </w:p>
-    <w:p>
-      <w:pPr>
-        <w:ind w:left="360" w:hanging="216"/>
-      </w:pPr>
-      <w:r>
-        <w:t xml:space="preserve">• </w:t>
-      </w:r>
-      <w:r>
-        <w:rPr>
-          <w:b/>
-        </w:rPr>
-        <w:t>Signal freshness:</w:t>
-      </w:r>
-      <w:r>
-        <w:t xml:space="preserve"> US Sep 2026; UK Feb–May 2026; Germany end-2024 (the oldest); France May 2025.</w:t>
-      </w:r>
-    </w:p>
-    <w:p>
-      <w:pPr>
-        <w:ind w:left="360" w:hanging="216"/>
-      </w:pPr>
-      <w:r>
-        <w:t xml:space="preserve">• </w:t>
-      </w:r>
-      <w:r>
-        <w:rPr>
-          <w:b/>
-        </w:rPr>
-        <w:t>What would change our mind:</w:t>
-      </w:r>
-      <w:r>
-        <w:t xml:space="preserve"> A major acquiring a mid-size UK or French operator, which would signal consolidation is closing the window; or Tesla's US share dropping below about 40% as open networks scale.</w:t>
-      </w:r>
-    </w:p>
-    <w:p>
-      <w:pPr>
-        <w:pStyle w:val="Heading3"/>
-      </w:pPr>
-      <w:r>
-        <w:t>Insight 5: The entry windows are time-bound and favour the UK first and France second</w:t>
-      </w:r>
-    </w:p>
-    <w:p>
-      <w:pPr>
-        <w:ind w:left="360" w:hanging="216"/>
-      </w:pPr>
-      <w:r>
-        <w:t xml:space="preserve">• </w:t>
-      </w:r>
-      <w:r>
-        <w:rPr>
-          <w:b/>
-        </w:rPr>
-        <w:t>Insight Summary:</w:t>
-      </w:r>
-      <w:r>
-        <w:t xml:space="preserve"> Two dated catalysts favour the UK and France within the 2026–2028 horizon, while federal support in the US is shrinking.</w:t>
-      </w:r>
-    </w:p>
-    <w:p>
-      <w:pPr>
-        <w:ind w:left="360" w:hanging="216"/>
-      </w:pPr>
-      <w:r>
-        <w:t xml:space="preserve">• </w:t>
-      </w:r>
-      <w:r>
-        <w:rPr>
-          <w:b/>
-        </w:rPr>
-        <w:t>Supporting Evidence or Signals:</w:t>
-      </w:r>
-    </w:p>
-    <w:p>
-      <w:pPr>
-        <w:ind w:left="720" w:hanging="216"/>
-      </w:pPr>
-      <w:r>
-        <w:t xml:space="preserve">• </w:t>
-      </w:r>
-      <w:r>
-        <w:rPr>
-          <w:b/>
-        </w:rPr>
-        <w:t>UK motorway sites:</w:t>
-      </w:r>
-      <w:r>
-        <w:t xml:space="preserve"> Under a 2022 CMA undertaking, Gridserve will not enforce exclusive rights at about two-thirds of motorway service areas after November 2026 [gov.uk/CMA, verified].</w:t>
-      </w:r>
-    </w:p>
-    <w:p>
-      <w:pPr>
-        <w:ind w:left="720" w:hanging="216"/>
-      </w:pPr>
-      <w:r>
-        <w:t xml:space="preserve">• </w:t>
-      </w:r>
-      <w:r>
-        <w:rPr>
-          <w:b/>
-        </w:rPr>
-        <w:t>UK underserved regions</w:t>
-      </w:r>
-      <w:r>
-        <w:t xml:space="preserve"> (rapid chargers per 100,000 people, against a UK average of 41.7) [DfT, verified]: Northern Ireland 19.3, London 27.9, Yorkshire and the Humber 36.6, North East 37.1. Scotland is best served at 59.1.</w:t>
-      </w:r>
-    </w:p>
-    <w:p>
-      <w:pPr>
-        <w:ind w:left="720" w:hanging="216"/>
-      </w:pPr>
-      <w:r>
-        <w:t xml:space="preserve">• </w:t>
-      </w:r>
-      <w:r>
-        <w:rPr>
-          <w:b/>
-        </w:rPr>
-        <w:t>UK funding:</w:t>
-      </w:r>
-      <w:r>
-        <w:t xml:space="preserve"> £400 M from the 2025 Spending Review is committed to strategic road network charging.</w:t>
-      </w:r>
-    </w:p>
-    <w:p>
-      <w:pPr>
-        <w:ind w:left="720" w:hanging="216"/>
-      </w:pPr>
-      <w:r>
-        <w:t xml:space="preserve">• </w:t>
-      </w:r>
-      <w:r>
-        <w:rPr>
-          <w:b/>
-        </w:rPr>
-        <w:t>France:</w:t>
-      </w:r>
-    </w:p>
-    <w:p>
-      <w:pPr>
-        <w:ind w:left="1080" w:hanging="216"/>
-      </w:pPr>
-      <w:r>
-        <w:t xml:space="preserve">• </w:t>
-      </w:r>
-      <w:r>
-        <w:t>The ADVENIR subsidy programme has a budget of about €520 M and now runs to 2030 [Avere-France; the research report's "end-2027" was out of date].</w:t>
-      </w:r>
-    </w:p>
-    <w:p>
-      <w:pPr>
-        <w:ind w:left="1080" w:hanging="216"/>
-      </w:pPr>
-      <w:r>
-        <w:t xml:space="preserve">• </w:t>
-      </w:r>
-      <w:r>
-        <w:t>France 2030 provides €300 M covering up to 40% of eligible costs.</w:t>
-      </w:r>
-    </w:p>
-    <w:p>
-      <w:pPr>
-        <w:ind w:left="1080" w:hanging="216"/>
-      </w:pPr>
-      <w:r>
-        <w:t xml:space="preserve">• </w:t>
-      </w:r>
-      <w:r>
-        <w:t>A motorway master plan targets 22,000 car charging points at 150 kW across about 900 service areas by 2035 [Research: EU report].</w:t>
-      </w:r>
-    </w:p>
-    <w:p>
-      <w:pPr>
-        <w:ind w:left="720" w:hanging="216"/>
-      </w:pPr>
-      <w:r>
-        <w:t xml:space="preserve">• </w:t>
-      </w:r>
-      <w:r>
-        <w:rPr>
-          <w:b/>
-        </w:rPr>
-        <w:t>US:</w:t>
-      </w:r>
-    </w:p>
-    <w:p>
-      <w:pPr>
-        <w:ind w:left="1080" w:hanging="216"/>
-      </w:pPr>
-      <w:r>
-        <w:t xml:space="preserve">• </w:t>
-      </w:r>
-      <w:r>
-        <w:t>$503.8 M of NEVI federal charging funds was repurposed in March 2026 [FHWA notice; search-engine text only].</w:t>
-      </w:r>
-    </w:p>
-    <w:p>
-      <w:pPr>
-        <w:ind w:left="1080" w:hanging="216"/>
-      </w:pPr>
-      <w:r>
-        <w:t xml:space="preserve">• </w:t>
-      </w:r>
-      <w:r>
-        <w:t>84% of NEVI funds were still unobligated in May 2025.</w:t>
-      </w:r>
-    </w:p>
-    <w:p>
-      <w:pPr>
-        <w:ind w:left="1080" w:hanging="216"/>
-      </w:pPr>
-      <w:r>
-        <w:t xml:space="preserve">• </w:t>
-      </w:r>
-      <w:r>
-        <w:t>State programmes remain: California's Fast Charge California ($55 M) and New York ($28.5 M) [Research: US report].</w:t>
-      </w:r>
-    </w:p>
-    <w:p>
-      <w:pPr>
-        <w:ind w:left="360" w:hanging="216"/>
-      </w:pPr>
-      <w:r>
-        <w:t xml:space="preserve">• </w:t>
-      </w:r>
-      <w:r>
-        <w:rPr>
-          <w:b/>
-        </w:rPr>
-        <w:t>Why This Insight Matters:</w:t>
-      </w:r>
-      <w:r>
-        <w:t xml:space="preserve"> Motorway sites in the UK come with high traffic and, in 37 cases, upgraded grid connections. The tender window is short, and competitors with fresh capital (Insight 4) will bid. France offers subsidised capital costs through 2030, which suits a second phase.</w:t>
-      </w:r>
-    </w:p>
-    <w:p>
-      <w:pPr>
-        <w:ind w:left="360" w:hanging="216"/>
-      </w:pPr>
-      <w:r>
-        <w:t xml:space="preserve">• </w:t>
-      </w:r>
-      <w:r>
-        <w:rPr>
-          <w:b/>
-        </w:rPr>
-        <w:t>Signal freshness:</w:t>
-      </w:r>
-      <w:r>
-        <w:t xml:space="preserve"> The CMA undertaking dates from 2022, with a November 2026 deadline two months away; it needs a check for any later change. ADVENIR status is as of Aug 2026. The NEVI notice is March 2026.</w:t>
-      </w:r>
-    </w:p>
-    <w:p>
-      <w:pPr>
-        <w:ind w:left="360" w:hanging="216"/>
-      </w:pPr>
-      <w:r>
-        <w:t xml:space="preserve">• </w:t>
-      </w:r>
-      <w:r>
-        <w:rPr>
-          <w:b/>
-        </w:rPr>
-        <w:t>What would change our mind:</w:t>
-      </w:r>
-      <w:r>
-        <w:t xml:space="preserve"> Any CMA or Gridserve update that delays or narrows the motorway opening, or cuts to ADVENIR or France 2030 funding.</w:t>
-      </w:r>
-    </w:p>
-    <w:p>
-      <w:pPr>
-        <w:pStyle w:val="Heading2"/>
-      </w:pPr>
-      <w:r>
-        <w:t>5. Visual Evidence</w:t>
-      </w:r>
-    </w:p>
-    <w:p>
-      <w:r>
-        <w:t xml:space="preserve">All charts below were produced by Amazon Quick Research inside the three reports (exported PDFs in </w:t>
+        <w:t>screenshots/</w:t>
+      </w:r>
+      <w:r>
+        <w:t>: Space set-up (01), research set-up and plan (02–03), agent configuration and first test (04–07), research reports (08–10), Market Analysis (11a–11e), Reliability Evaluation (12a–12e), Brief v1 (13a–13d), Brief v2 (14a–14c), the Space contents (15a), a scope test (16), and the charts from the research reports (</w:t>
       </w:r>
       <w:r>
         <w:rPr>
           <w:rFonts w:ascii="Menlo" w:hAnsi="Menlo"/>
           <w:sz w:val="18"/>
         </w:rPr>
-        <w:t>deliverables/quick_research_reports/</w:t>
-      </w:r>
-      <w:r>
-        <w:t xml:space="preserve">). The last item is a table view from the agent's Market Analysis. Image files: </w:t>
+        <w:t>visuals/</w:t>
+      </w:r>
+      <w:r>
+        <w:t>).</w:t>
+      </w:r>
+    </w:p>
+    <w:p>
+      <w:pPr>
+        <w:pStyle w:val="Heading2"/>
+      </w:pPr>
+      <w:r>
+        <w:t>4. Key Market Insights</w:t>
+      </w:r>
+    </w:p>
+    <w:p>
+      <w:pPr>
+        <w:pStyle w:val="Heading3"/>
+      </w:pPr>
+      <w:r>
+        <w:t>Insight 1: The 2023 "charging gap" has largely closed; build-out is now outrunning the fleet in every market</w:t>
+      </w:r>
+    </w:p>
+    <w:p>
+      <w:pPr>
+        <w:ind w:left="360" w:hanging="216"/>
+      </w:pPr>
+      <w:r>
+        <w:t xml:space="preserve">• </w:t>
+      </w:r>
+      <w:r>
+        <w:rPr>
+          <w:b/>
+        </w:rPr>
+        <w:t>Insight Summary:</w:t>
+      </w:r>
+      <w:r>
+        <w:t xml:space="preserve"> The internal dataset shows EVs per public fast charger rising in the UK from 69 in 2018 to 158 in 2023, which reads as a widening undersupply. The 2024–2026 evidence reverses that: charger counts grew faster than the fleet in all four markets. A 2026 entry thesis built on national undersupply is out of date. The case now rests on where individual sites are still thin, and on how well they are used.</w:t>
+      </w:r>
+    </w:p>
+    <w:p>
+      <w:pPr>
+        <w:ind w:left="360" w:hanging="216"/>
+      </w:pPr>
+      <w:r>
+        <w:t xml:space="preserve">• </w:t>
+      </w:r>
+      <w:r>
+        <w:rPr>
+          <w:b/>
+        </w:rPr>
+        <w:t>Supporting Evidence or Signals:</w:t>
+      </w:r>
+    </w:p>
+    <w:p>
+      <w:pPr>
+        <w:ind w:left="720" w:hanging="216"/>
+      </w:pPr>
+      <w:r>
+        <w:t xml:space="preserve">• </w:t>
+      </w:r>
+      <w:r>
+        <w:rPr>
+          <w:b/>
+        </w:rPr>
+        <w:t>Dataset, 2023</w:t>
+      </w:r>
+      <w:r>
+        <w:t xml:space="preserve"> (IEA Global EV Data 2024; EVs per public fast charger, chargers above 22 kW, BEV+PHEV): UK 158 (1.58 M EVs ÷ 10,000 chargers); US 112 (4.82 M ÷ 43,000); Germany 119 (2.50 M ÷ 21,000); France 79 (1.57 M ÷ 20,000); EU27 99, where fast chargers grew +67% in 2023.</w:t>
+      </w:r>
+    </w:p>
+    <w:p>
+      <w:pPr>
+        <w:ind w:left="720" w:hanging="216"/>
+      </w:pPr>
+      <w:r>
+        <w:t xml:space="preserve">• </w:t>
+      </w:r>
+      <w:r>
+        <w:rPr>
+          <w:b/>
+        </w:rPr>
+        <w:t>UK:</w:t>
+      </w:r>
+      <w:r>
+        <w:t xml:space="preserve"> 50 kW+ chargers went from 10,118 (Jan 2024) to 28,887 (1 Jul 2026) [Research: UK report; DfT statistics, verified]. That is about 66 BEVs per 50 kW+ charger by mid-2026 [Research: UK report, DfT Apr 2026]. The BEV fleet grew from about 1.33 M (end-2024) to about 2.1 M (mid-2026). That is +58%; the report's claim that it "doubled" is wrong.</w:t>
+      </w:r>
+    </w:p>
+    <w:p>
+      <w:pPr>
+        <w:ind w:left="720" w:hanging="216"/>
+      </w:pPr>
+      <w:r>
+        <w:t xml:space="preserve">• </w:t>
+      </w:r>
+      <w:r>
+        <w:rPr>
+          <w:b/>
+        </w:rPr>
+        <w:t>Germany:</w:t>
+      </w:r>
+      <w:r>
+        <w:t xml:space="preserve"> DC fast points went from 21,000 (2023) to 40,777 (Jul 2025) to 48,729 (Jan 2026) to 54,341 (Jul 2026) [Research: EU report; Bundesnetzagentur via heise/electrive, verified]. That gives about 71 EVs per fast charger in mid-2025.</w:t>
+      </w:r>
+    </w:p>
+    <w:p>
+      <w:pPr>
+        <w:ind w:left="720" w:hanging="216"/>
+      </w:pPr>
+      <w:r>
+        <w:t xml:space="preserve">• </w:t>
+      </w:r>
+      <w:r>
+        <w:rPr>
+          <w:b/>
+        </w:rPr>
+        <w:t>France:</w:t>
+      </w:r>
+      <w:r>
+        <w:t xml:space="preserve"> 150 kW+ points went from 19,848 (Feb 2024) to 31,335 (Feb 2025) [Research: EU report; Avere-France]. That gives about 46 EVs per high-power point.</w:t>
+      </w:r>
+    </w:p>
+    <w:p>
+      <w:pPr>
+        <w:ind w:left="720" w:hanging="216"/>
+      </w:pPr>
+      <w:r>
+        <w:t xml:space="preserve">• </w:t>
+      </w:r>
+      <w:r>
+        <w:rPr>
+          <w:b/>
+        </w:rPr>
+        <w:t>US:</w:t>
+      </w:r>
+      <w:r>
+        <w:t xml:space="preserve"> DC fast ports went from 43,000 (2023) to 50,428 (Dec 2024), about 68,000 (end-2025) and 76,236 (Sep 2026) [Research: US report; evchargingstations.com, verified]. That gives about 96–106 EVs per port.</w:t>
+      </w:r>
+    </w:p>
+    <w:p>
+      <w:pPr>
+        <w:ind w:left="360" w:hanging="216"/>
+      </w:pPr>
+      <w:r>
+        <w:t xml:space="preserve">• </w:t>
+      </w:r>
+      <w:r>
+        <w:rPr>
+          <w:b/>
+        </w:rPr>
+        <w:t>Why This Insight Matters:</w:t>
+      </w:r>
+      <w:r>
+        <w:t xml:space="preserve"> Each charger now serves fewer EVs than in 2023, so revenue per charger falls unless a site sits where demand is still concentrated. It changes the question leadership should ask, from "which country is short of chargers?" to "which sites are short of chargers, and can we win them?". It also means the 2023 dataset alone would have pointed the operator the wrong way.</w:t>
+      </w:r>
+    </w:p>
+    <w:p>
+      <w:pPr>
+        <w:ind w:left="360" w:hanging="216"/>
+      </w:pPr>
+      <w:r>
+        <w:t xml:space="preserve">• </w:t>
+      </w:r>
+      <w:r>
+        <w:rPr>
+          <w:b/>
+        </w:rPr>
+        <w:t>Signal freshness:</w:t>
+      </w:r>
+      <w:r>
+        <w:t xml:space="preserve"> UK 1 Jul 2026 (DfT, published 27 Aug 2026); Germany Jul 2026; US Sep 2026; France Feb 2025. The France figure is the oldest; the other three are current.</w:t>
+      </w:r>
+    </w:p>
+    <w:p>
+      <w:pPr>
+        <w:ind w:left="360" w:hanging="216"/>
+      </w:pPr>
+      <w:r>
+        <w:t xml:space="preserve">• </w:t>
+      </w:r>
+      <w:r>
+        <w:rPr>
+          <w:b/>
+        </w:rPr>
+        <w:t>What would change our mind:</w:t>
+      </w:r>
+      <w:r>
+        <w:t xml:space="preserve"> Q3/Q4 2026 statistics showing BEV fleet growth outpacing charger growth again, or UK BEVs per 50 kW+ charger rising back above ~80.</w:t>
+      </w:r>
+    </w:p>
+    <w:p>
+      <w:pPr>
+        <w:pStyle w:val="Heading3"/>
+      </w:pPr>
+      <w:r>
+        <w:t>Insight 2: EV demand is policy-driven and diverging; the UK has a statutory floor, France has momentum, the US has lost its federal support</w:t>
+      </w:r>
+    </w:p>
+    <w:p>
+      <w:pPr>
+        <w:ind w:left="360" w:hanging="216"/>
+      </w:pPr>
+      <w:r>
+        <w:t xml:space="preserve">• </w:t>
+      </w:r>
+      <w:r>
+        <w:rPr>
+          <w:b/>
+        </w:rPr>
+        <w:t>Insight Summary:</w:t>
+      </w:r>
+      <w:r>
+        <w:t xml:space="preserve"> New-car demand in all four markets tracks policy almost one-for-one. The UK ZEV mandate sets a legal floor that rises steeply to 2028. France is accelerating with subsidies extended. Germany recovered after cutting and then reintroducing grants. The US fell sharply once the federal credit expired.</w:t>
+      </w:r>
+    </w:p>
+    <w:p>
+      <w:pPr>
+        <w:ind w:left="360" w:hanging="216"/>
+      </w:pPr>
+      <w:r>
+        <w:t xml:space="preserve">• </w:t>
+      </w:r>
+      <w:r>
+        <w:rPr>
+          <w:b/>
+        </w:rPr>
+        <w:t>Supporting Evidence or Signals:</w:t>
+      </w:r>
+    </w:p>
+    <w:p>
+      <w:pPr>
+        <w:ind w:left="720" w:hanging="216"/>
+      </w:pPr>
+      <w:r>
+        <w:t xml:space="preserve">• </w:t>
+      </w:r>
+      <w:r>
+        <w:rPr>
+          <w:b/>
+        </w:rPr>
+        <w:t>UK:</w:t>
+      </w:r>
+    </w:p>
+    <w:p>
+      <w:pPr>
+        <w:ind w:left="1080" w:hanging="216"/>
+      </w:pPr>
+      <w:r>
+        <w:t xml:space="preserve">• </w:t>
+      </w:r>
+      <w:r>
+        <w:t>BEV share was 19.6% in 2024 (381,970 cars) and 23.4% in 2025 (473,348) [SMMT, verified].</w:t>
+      </w:r>
+    </w:p>
+    <w:p>
+      <w:pPr>
+        <w:ind w:left="1080" w:hanging="216"/>
+      </w:pPr>
+      <w:r>
+        <w:t xml:space="preserve">• </w:t>
+      </w:r>
+      <w:r>
+        <w:t>The mandate targets 28% for 2025, 33% for 2026 and 52% for 2028 [Research: UK report; VETS Order].</w:t>
+      </w:r>
+    </w:p>
+    <w:p>
+      <w:pPr>
+        <w:ind w:left="1080" w:hanging="216"/>
+      </w:pPr>
+      <w:r>
+        <w:t xml:space="preserve">• </w:t>
+      </w:r>
+      <w:r>
+        <w:t>A formal review of the mandate launched in August 2026 [Research: UK report; gov.uk].</w:t>
+      </w:r>
+    </w:p>
+    <w:p>
+      <w:pPr>
+        <w:ind w:left="1080" w:hanging="216"/>
+      </w:pPr>
+      <w:r>
+        <w:t xml:space="preserve">• </w:t>
+      </w:r>
+      <w:r>
+        <w:t>Two 2026 year-to-date shares conflict: about 25% (H1 2026, Car Magazine) and about 29.8% (Jan–Aug 2026, EY/Roadgenius). Both are shown and neither is averaged.</w:t>
+      </w:r>
+    </w:p>
+    <w:p>
+      <w:pPr>
+        <w:ind w:left="720" w:hanging="216"/>
+      </w:pPr>
+      <w:r>
+        <w:t xml:space="preserve">• </w:t>
+      </w:r>
+      <w:r>
+        <w:rPr>
+          <w:b/>
+        </w:rPr>
+        <w:t>France:</w:t>
+      </w:r>
+      <w:r>
+        <w:t xml:space="preserve"> BEV share rose from 16.9% (2024) to 20.0% (2025). H1 2026 registrations were +62.9% year on year [ACEA, verified], and August 2026 set a monthly record of 38.8% [Research: EU report; Avere-France].</w:t>
+      </w:r>
+    </w:p>
+    <w:p>
+      <w:pPr>
+        <w:ind w:left="720" w:hanging="216"/>
+      </w:pPr>
+      <w:r>
+        <w:t xml:space="preserve">• </w:t>
+      </w:r>
+      <w:r>
+        <w:rPr>
+          <w:b/>
+        </w:rPr>
+        <w:t>Germany:</w:t>
+      </w:r>
+      <w:r>
+        <w:t xml:space="preserve"> BEV share fell from 18.4% (2023) to 13.5% (2024) after the purchase subsidy (Umweltbonus) ended, then rose to 19.1% (2025). H1 2026 was +48%, helped by a new grant of up to €6,000 from January 2026 [Research: EU report; ADAC/KBA/heise].</w:t>
+      </w:r>
+    </w:p>
+    <w:p>
+      <w:pPr>
+        <w:ind w:left="720" w:hanging="216"/>
+      </w:pPr>
+      <w:r>
+        <w:t xml:space="preserve">• </w:t>
+      </w:r>
+      <w:r>
+        <w:rPr>
+          <w:b/>
+        </w:rPr>
+        <w:t>US:</w:t>
+      </w:r>
+    </w:p>
+    <w:p>
+      <w:pPr>
+        <w:ind w:left="1080" w:hanging="216"/>
+      </w:pPr>
+      <w:r>
+        <w:t xml:space="preserve">• </w:t>
+      </w:r>
+      <w:r>
+        <w:t>The $7,500 credit expired on 30 Sep 2025. BEV share hit 12% that September, then fell below 6% in Q4 2025 [EIA, verified].</w:t>
+      </w:r>
+    </w:p>
+    <w:p>
+      <w:pPr>
+        <w:ind w:left="1080" w:hanging="216"/>
+      </w:pPr>
+      <w:r>
+        <w:t xml:space="preserve">• </w:t>
+      </w:r>
+      <w:r>
+        <w:t>BEV share was 7.7% for 2025 [NADA].</w:t>
+      </w:r>
+    </w:p>
+    <w:p>
+      <w:pPr>
+        <w:ind w:left="1080" w:hanging="216"/>
+      </w:pPr>
+      <w:r>
+        <w:t xml:space="preserve">• </w:t>
+      </w:r>
+      <w:r>
+        <w:t>Mid-2026 registrations were down about 31% year on year [Research: US report; single press source].</w:t>
+      </w:r>
+    </w:p>
+    <w:p>
+      <w:pPr>
+        <w:ind w:left="1080" w:hanging="216"/>
+      </w:pPr>
+      <w:r>
+        <w:t xml:space="preserve">• </w:t>
+      </w:r>
+      <w:r>
+        <w:t>IEA STEPS had projected 20% for 2025 [Dataset, projection].</w:t>
+      </w:r>
+    </w:p>
+    <w:p>
+      <w:pPr>
+        <w:ind w:left="360" w:hanging="216"/>
+      </w:pPr>
+      <w:r>
+        <w:t xml:space="preserve">• </w:t>
+      </w:r>
+      <w:r>
+        <w:rPr>
+          <w:b/>
+        </w:rPr>
+        <w:t>Why This Insight Matters:</w:t>
+      </w:r>
+      <w:r>
+        <w:t xml:space="preserve"> For a 2026–2028 horizon, the operator is effectively betting on policy. The UK floor and French subsidies reduce downside risk on demand. The US needs a new incentive before demand growth resumes.</w:t>
+      </w:r>
+    </w:p>
+    <w:p>
+      <w:pPr>
+        <w:ind w:left="360" w:hanging="216"/>
+      </w:pPr>
+      <w:r>
+        <w:t xml:space="preserve">• </w:t>
+      </w:r>
+      <w:r>
+        <w:rPr>
+          <w:b/>
+        </w:rPr>
+        <w:t>Signal freshness:</w:t>
+      </w:r>
+      <w:r>
+        <w:t xml:space="preserve"> All figures are from Jan–Sep 2026 except the US 2025 annual figure. The UK review outcome is still open; the consultation runs August–October 2026.</w:t>
+      </w:r>
+    </w:p>
+    <w:p>
+      <w:pPr>
+        <w:ind w:left="360" w:hanging="216"/>
+      </w:pPr>
+      <w:r>
+        <w:t xml:space="preserve">• </w:t>
+      </w:r>
+      <w:r>
+        <w:rPr>
+          <w:b/>
+        </w:rPr>
+        <w:t>What would change our mind:</w:t>
+      </w:r>
+      <w:r>
+        <w:t xml:space="preserve"> A UK review that materially cuts the 2027–2028 targets, or a new US federal purchase incentive.</w:t>
+      </w:r>
+    </w:p>
+    <w:p>
+      <w:pPr>
+        <w:pStyle w:val="Heading3"/>
+      </w:pPr>
+      <w:r>
+        <w:t>Insight 3: Utilisation and grid cost, not EV demand, are the binding constraint on returns</w:t>
+      </w:r>
+    </w:p>
+    <w:p>
+      <w:pPr>
+        <w:ind w:left="360" w:hanging="216"/>
+      </w:pPr>
+      <w:r>
+        <w:t xml:space="preserve">• </w:t>
+      </w:r>
+      <w:r>
+        <w:rPr>
+          <w:b/>
+        </w:rPr>
+        <w:t>Insight Summary:</w:t>
+      </w:r>
+      <w:r>
+        <w:t xml:space="preserve"> In every market with data, chargers are used for a small share of the day, and fixed grid costs are large. The ability to secure cheap, timely grid capacity decides returns more than the size of the EV fleet does.</w:t>
+      </w:r>
+    </w:p>
+    <w:p>
+      <w:pPr>
+        <w:ind w:left="360" w:hanging="216"/>
+      </w:pPr>
+      <w:r>
+        <w:t xml:space="preserve">• </w:t>
+      </w:r>
+      <w:r>
+        <w:rPr>
+          <w:b/>
+        </w:rPr>
+        <w:t>Supporting Evidence or Signals:</w:t>
+      </w:r>
+    </w:p>
+    <w:p>
+      <w:pPr>
+        <w:ind w:left="720" w:hanging="216"/>
+      </w:pPr>
+      <w:r>
+        <w:t xml:space="preserve">• </w:t>
+      </w:r>
+      <w:r>
+        <w:rPr>
+          <w:b/>
+        </w:rPr>
+        <w:t>UK:</w:t>
+      </w:r>
+    </w:p>
+    <w:p>
+      <w:pPr>
+        <w:ind w:left="1080" w:hanging="216"/>
+      </w:pPr>
+      <w:r>
+        <w:t xml:space="preserve">• </w:t>
+      </w:r>
+      <w:r>
+        <w:t>Utilisation is about 8% (about 2 hours a day). Our fact-check found this is the Zapmap average for all public chargers, not rapid chargers as the research report implied.</w:t>
+      </w:r>
+    </w:p>
+    <w:p>
+      <w:pPr>
+        <w:ind w:left="1080" w:hanging="216"/>
+      </w:pPr>
+      <w:r>
+        <w:t xml:space="preserve">• </w:t>
+      </w:r>
+      <w:r>
+        <w:t>Rapid and ultra-rapid devices handle 72% of sessions from 23% of devices [Research: UK report; Zapmap].</w:t>
+      </w:r>
+    </w:p>
+    <w:p>
+      <w:pPr>
+        <w:ind w:left="1080" w:hanging="216"/>
+      </w:pPr>
+      <w:r>
+        <w:t xml:space="preserve">• </w:t>
+      </w:r>
+      <w:r>
+        <w:t>Grid standing charges for an ultra-rapid hub rose from £99 a year (2022) to £8,600 (2024), according to an operator source (Osprey).</w:t>
+      </w:r>
+    </w:p>
+    <w:p>
+      <w:pPr>
+        <w:ind w:left="1080" w:hanging="216"/>
+      </w:pPr>
+      <w:r>
+        <w:t xml:space="preserve">• </w:t>
+      </w:r>
+      <w:r>
+        <w:t>The average gap between requested and offered grid-connection dates is 5.5 years, for all connecting customers [Research: UK report].</w:t>
+      </w:r>
+    </w:p>
+    <w:p>
+      <w:pPr>
+        <w:ind w:left="1080" w:hanging="216"/>
+      </w:pPr>
+      <w:r>
+        <w:t xml:space="preserve">• </w:t>
+      </w:r>
+      <w:r>
+        <w:t>The average rapid price is about 77p/kWh, against 7–8p on a home smart tariff [Research: UK report].</w:t>
+      </w:r>
+    </w:p>
+    <w:p>
+      <w:pPr>
+        <w:ind w:left="720" w:hanging="216"/>
+      </w:pPr>
+      <w:r>
+        <w:t xml:space="preserve">• </w:t>
+      </w:r>
+      <w:r>
+        <w:rPr>
+          <w:b/>
+        </w:rPr>
+        <w:t>US:</w:t>
+      </w:r>
+    </w:p>
+    <w:p>
+      <w:pPr>
+        <w:ind w:left="1080" w:hanging="216"/>
+      </w:pPr>
+      <w:r>
+        <w:t xml:space="preserve">• </w:t>
+      </w:r>
+      <w:r>
+        <w:t>National DC fast utilisation was 16.6% (Q1 2025) and 16.1% (mid-2025) [Paren].</w:t>
+      </w:r>
+    </w:p>
+    <w:p>
+      <w:pPr>
+        <w:ind w:left="1080" w:hanging="216"/>
+      </w:pPr>
+      <w:r>
+        <w:t xml:space="preserve">• </w:t>
+      </w:r>
+      <w:r>
+        <w:t>The profitability threshold is estimated at about 15% [Stable Auto via Fortune, 2024].</w:t>
+      </w:r>
+    </w:p>
+    <w:p>
+      <w:pPr>
+        <w:ind w:left="1080" w:hanging="216"/>
+      </w:pPr>
+      <w:r>
+        <w:t xml:space="preserve">• </w:t>
+      </w:r>
+      <w:r>
+        <w:t>At low utilisation, demand charges can exceed 90% of a station's electricity cost [RMI].</w:t>
+      </w:r>
+    </w:p>
+    <w:p>
+      <w:pPr>
+        <w:ind w:left="720" w:hanging="216"/>
+      </w:pPr>
+      <w:r>
+        <w:t xml:space="preserve">• </w:t>
+      </w:r>
+      <w:r>
+        <w:rPr>
+          <w:b/>
+        </w:rPr>
+        <w:t>EU:</w:t>
+      </w:r>
+    </w:p>
+    <w:p>
+      <w:pPr>
+        <w:ind w:left="1080" w:hanging="216"/>
+      </w:pPr>
+      <w:r>
+        <w:t xml:space="preserve">• </w:t>
+      </w:r>
+      <w:r>
+        <w:t>Estimated payback is 6–12 years [Springer, 2025].</w:t>
+      </w:r>
+    </w:p>
+    <w:p>
+      <w:pPr>
+        <w:ind w:left="1080" w:hanging="216"/>
+      </w:pPr>
+      <w:r>
+        <w:t xml:space="preserve">• </w:t>
+      </w:r>
+      <w:r>
+        <w:t>No German or French utilisation data was found. This is a gap, not a finding.</w:t>
+      </w:r>
+    </w:p>
+    <w:p>
+      <w:pPr>
+        <w:ind w:left="360" w:hanging="216"/>
+      </w:pPr>
+      <w:r>
+        <w:t xml:space="preserve">• </w:t>
+      </w:r>
+      <w:r>
+        <w:rPr>
+          <w:b/>
+        </w:rPr>
+        <w:t>Why This Insight Matters:</w:t>
+      </w:r>
+      <w:r>
+        <w:t xml:space="preserve"> Site choice should favour locations that already have grid capacity or funded network upgrades. Examples are motorway service areas (Ofgem's £300 M Green Recovery Scheme upgraded 37 of them), retail forecourts, and battery-buffered sites. Utilisation data by charger speed is the most valuable missing input.</w:t>
+      </w:r>
+    </w:p>
+    <w:p>
+      <w:pPr>
+        <w:ind w:left="360" w:hanging="216"/>
+      </w:pPr>
+      <w:r>
+        <w:t xml:space="preserve">• </w:t>
+      </w:r>
+      <w:r>
+        <w:rPr>
+          <w:b/>
+        </w:rPr>
+        <w:t>Signal freshness:</w:t>
+      </w:r>
+      <w:r>
+        <w:t xml:space="preserve"> UK utilisation is updated quarterly (the page blocked direct access; wording checked via search results). US utilisation data is 2025. The grid-cost figures are 2024–2026.</w:t>
+      </w:r>
+    </w:p>
+    <w:p>
+      <w:pPr>
+        <w:ind w:left="360" w:hanging="216"/>
+      </w:pPr>
+      <w:r>
+        <w:t xml:space="preserve">• </w:t>
+      </w:r>
+      <w:r>
+        <w:rPr>
+          <w:b/>
+        </w:rPr>
+        <w:t>What would change our mind:</w:t>
+      </w:r>
+      <w:r>
+        <w:t xml:space="preserve"> Published UK rapid-specific utilisation consistently above 15%, or Ofgem's demand-connection reform (launched Feb 2026) materially cutting queue times for charging sites.</w:t>
+      </w:r>
+    </w:p>
+    <w:p>
+      <w:pPr>
+        <w:pStyle w:val="Heading3"/>
+      </w:pPr>
+      <w:r>
+        <w:t>Insight 4: Competition is concentrated in the US and Germany and fragmented, but consolidating, in the UK and France</w:t>
+      </w:r>
+    </w:p>
+    <w:p>
+      <w:pPr>
+        <w:ind w:left="360" w:hanging="216"/>
+      </w:pPr>
+      <w:r>
+        <w:t xml:space="preserve">• </w:t>
+      </w:r>
+      <w:r>
+        <w:rPr>
+          <w:b/>
+        </w:rPr>
+        <w:t>Insight Summary:</w:t>
+      </w:r>
+      <w:r>
+        <w:t xml:space="preserve"> A mid-size entrant faces scale incumbents in the US (Tesla) and Germany (EnBW, plus the subsidised Deutschlandnetz). The UK and France have more room, but consolidation is under way and capital intensity is high.</w:t>
+      </w:r>
+    </w:p>
+    <w:p>
+      <w:pPr>
+        <w:ind w:left="360" w:hanging="216"/>
+      </w:pPr>
+      <w:r>
+        <w:t xml:space="preserve">• </w:t>
+      </w:r>
+      <w:r>
+        <w:rPr>
+          <w:b/>
+        </w:rPr>
+        <w:t>Supporting Evidence or Signals:</w:t>
+      </w:r>
+    </w:p>
+    <w:p>
+      <w:pPr>
+        <w:ind w:left="720" w:hanging="216"/>
+      </w:pPr>
+      <w:r>
+        <w:t xml:space="preserve">• </w:t>
+      </w:r>
+      <w:r>
+        <w:rPr>
+          <w:b/>
+        </w:rPr>
+        <w:t>US:</w:t>
+      </w:r>
+      <w:r>
+        <w:t xml:space="preserve"> Tesla has 37,995 of 76,236 DC ports (49.8%, Sep 2026), down from about 54.6% in Jul 2025. The "Other" network category grew 44% year on year [evchargingstations.com, verified]. IONNA, backed by automakers, targets 30,000 sites [Research: US report].</w:t>
+      </w:r>
+    </w:p>
+    <w:p>
+      <w:pPr>
+        <w:ind w:left="720" w:hanging="216"/>
+      </w:pPr>
+      <w:r>
+        <w:t xml:space="preserve">• </w:t>
+      </w:r>
+      <w:r>
+        <w:rPr>
+          <w:b/>
+        </w:rPr>
+        <w:t>Germany (end-2024 fast chargers):</w:t>
+      </w:r>
+      <w:r>
+        <w:t xml:space="preserve"> EnBW 6,005, Tesla 3,110, Aral pulse 2,317, Allego 1,541, Ionity 1,084. The Deutschlandnetz programme has about 9,000 points of 200 kW or more at more than 1,000 locations [Research: EU report].</w:t>
+      </w:r>
+    </w:p>
+    <w:p>
+      <w:pPr>
+        <w:ind w:left="720" w:hanging="216"/>
+      </w:pPr>
+      <w:r>
+        <w:t xml:space="preserve">• </w:t>
+      </w:r>
+      <w:r>
+        <w:rPr>
+          <w:b/>
+        </w:rPr>
+        <w:t>UK:</w:t>
+      </w:r>
+    </w:p>
+    <w:p>
+      <w:pPr>
+        <w:ind w:left="1080" w:hanging="216"/>
+      </w:pPr>
+      <w:r>
+        <w:t xml:space="preserve">• </w:t>
+      </w:r>
+      <w:r>
+        <w:t>About 100–150 CPOs; the top 5 hold about a third of the market; industry leaders expect consolidation to 5–6 players [Research: UK report; Guardian Feb 2026].</w:t>
+      </w:r>
+    </w:p>
+    <w:p>
+      <w:pPr>
+        <w:ind w:left="1080" w:hanging="216"/>
+      </w:pPr>
+      <w:r>
+        <w:t xml:space="preserve">• </w:t>
+      </w:r>
+      <w:r>
+        <w:t>Rapid-charger leaders in Feb 2026: MFG EV Power 2,789, Osprey 2,578, BP Pulse 2,506 [Zapmap].</w:t>
+      </w:r>
+    </w:p>
+    <w:p>
+      <w:pPr>
+        <w:ind w:left="1080" w:hanging="216"/>
+      </w:pPr>
+      <w:r>
+        <w:t xml:space="preserve">• </w:t>
+      </w:r>
+      <w:r>
+        <w:t>More than £460 M was raised in 2025–26 by InstaVolt (£250 M), Osprey (£110 M) and Gridserve (£100 M).</w:t>
+      </w:r>
+    </w:p>
+    <w:p>
+      <w:pPr>
+        <w:ind w:left="720" w:hanging="216"/>
+      </w:pPr>
+      <w:r>
+        <w:t xml:space="preserve">• </w:t>
+      </w:r>
+      <w:r>
+        <w:rPr>
+          <w:b/>
+        </w:rPr>
+        <w:t>France (May 2025, high-power points):</w:t>
+      </w:r>
+      <w:r>
+        <w:t xml:space="preserve"> Tesla 3,019, TotalEnergies 1,543, Electra 1,504 (after a €304 M Series B), Ionity 688, Fastned 265 [Research: EU report; EV Boosters].</w:t>
+      </w:r>
+    </w:p>
+    <w:p>
+      <w:pPr>
+        <w:ind w:left="360" w:hanging="216"/>
+      </w:pPr>
+      <w:r>
+        <w:t xml:space="preserve">• </w:t>
+      </w:r>
+      <w:r>
+        <w:rPr>
+          <w:b/>
+        </w:rPr>
+        <w:t>Why This Insight Matters:</w:t>
+      </w:r>
+      <w:r>
+        <w:t xml:space="preserve"> In the US, winning share means competing against Tesla's cost base and IONNA's automaker funding. In the UK and France, fragmentation leaves room for a mid-size operator, but the capital raised by rivals sets a high bar for site acquisition.</w:t>
+      </w:r>
+    </w:p>
+    <w:p>
+      <w:pPr>
+        <w:ind w:left="360" w:hanging="216"/>
+      </w:pPr>
+      <w:r>
+        <w:t xml:space="preserve">• </w:t>
+      </w:r>
+      <w:r>
+        <w:rPr>
+          <w:b/>
+        </w:rPr>
+        <w:t>Signal freshness:</w:t>
+      </w:r>
+      <w:r>
+        <w:t xml:space="preserve"> US Sep 2026; UK Feb–May 2026; Germany end-2024 (the oldest); France May 2025.</w:t>
+      </w:r>
+    </w:p>
+    <w:p>
+      <w:pPr>
+        <w:ind w:left="360" w:hanging="216"/>
+      </w:pPr>
+      <w:r>
+        <w:t xml:space="preserve">• </w:t>
+      </w:r>
+      <w:r>
+        <w:rPr>
+          <w:b/>
+        </w:rPr>
+        <w:t>What would change our mind:</w:t>
+      </w:r>
+      <w:r>
+        <w:t xml:space="preserve"> A major acquiring a mid-size UK or French operator, which would signal consolidation is closing the window; or Tesla's US share dropping below about 40% as open networks scale.</w:t>
+      </w:r>
+    </w:p>
+    <w:p>
+      <w:pPr>
+        <w:pStyle w:val="Heading3"/>
+      </w:pPr>
+      <w:r>
+        <w:t>Insight 5: The entry windows are time-bound and favour the UK first and France second</w:t>
+      </w:r>
+    </w:p>
+    <w:p>
+      <w:pPr>
+        <w:ind w:left="360" w:hanging="216"/>
+      </w:pPr>
+      <w:r>
+        <w:t xml:space="preserve">• </w:t>
+      </w:r>
+      <w:r>
+        <w:rPr>
+          <w:b/>
+        </w:rPr>
+        <w:t>Insight Summary:</w:t>
+      </w:r>
+      <w:r>
+        <w:t xml:space="preserve"> Two dated catalysts favour the UK and France within the 2026–2028 horizon, while federal support in the US is shrinking.</w:t>
+      </w:r>
+    </w:p>
+    <w:p>
+      <w:pPr>
+        <w:ind w:left="360" w:hanging="216"/>
+      </w:pPr>
+      <w:r>
+        <w:t xml:space="preserve">• </w:t>
+      </w:r>
+      <w:r>
+        <w:rPr>
+          <w:b/>
+        </w:rPr>
+        <w:t>Supporting Evidence or Signals:</w:t>
+      </w:r>
+    </w:p>
+    <w:p>
+      <w:pPr>
+        <w:ind w:left="720" w:hanging="216"/>
+      </w:pPr>
+      <w:r>
+        <w:t xml:space="preserve">• </w:t>
+      </w:r>
+      <w:r>
+        <w:rPr>
+          <w:b/>
+        </w:rPr>
+        <w:t>UK motorway sites:</w:t>
+      </w:r>
+      <w:r>
+        <w:t xml:space="preserve"> Under a 2022 CMA undertaking, Gridserve will not enforce exclusive rights at about two-thirds of motorway service areas after November 2026 [gov.uk/CMA, verified].</w:t>
+      </w:r>
+    </w:p>
+    <w:p>
+      <w:pPr>
+        <w:ind w:left="720" w:hanging="216"/>
+      </w:pPr>
+      <w:r>
+        <w:t xml:space="preserve">• </w:t>
+      </w:r>
+      <w:r>
+        <w:rPr>
+          <w:b/>
+        </w:rPr>
+        <w:t>UK underserved regions</w:t>
+      </w:r>
+      <w:r>
+        <w:t xml:space="preserve"> (rapid chargers per 100,000 people, against a UK average of 41.7) [DfT, verified]: Northern Ireland 19.3, London 27.9, Yorkshire and the Humber 36.6, North East 37.1. Scotland is best served at 59.1.</w:t>
+      </w:r>
+    </w:p>
+    <w:p>
+      <w:pPr>
+        <w:ind w:left="720" w:hanging="216"/>
+      </w:pPr>
+      <w:r>
+        <w:t xml:space="preserve">• </w:t>
+      </w:r>
+      <w:r>
+        <w:rPr>
+          <w:b/>
+        </w:rPr>
+        <w:t>UK funding:</w:t>
+      </w:r>
+      <w:r>
+        <w:t xml:space="preserve"> £400 M from the 2025 Spending Review is committed to strategic road network charging.</w:t>
+      </w:r>
+    </w:p>
+    <w:p>
+      <w:pPr>
+        <w:ind w:left="720" w:hanging="216"/>
+      </w:pPr>
+      <w:r>
+        <w:t xml:space="preserve">• </w:t>
+      </w:r>
+      <w:r>
+        <w:rPr>
+          <w:b/>
+        </w:rPr>
+        <w:t>France:</w:t>
+      </w:r>
+    </w:p>
+    <w:p>
+      <w:pPr>
+        <w:ind w:left="1080" w:hanging="216"/>
+      </w:pPr>
+      <w:r>
+        <w:t xml:space="preserve">• </w:t>
+      </w:r>
+      <w:r>
+        <w:t>The ADVENIR subsidy programme has a budget of about €520 M and now runs to 2030 [Avere-France; the research report's "end-2027" was out of date].</w:t>
+      </w:r>
+    </w:p>
+    <w:p>
+      <w:pPr>
+        <w:ind w:left="1080" w:hanging="216"/>
+      </w:pPr>
+      <w:r>
+        <w:t xml:space="preserve">• </w:t>
+      </w:r>
+      <w:r>
+        <w:t>France 2030 provides €300 M covering up to 40% of eligible costs.</w:t>
+      </w:r>
+    </w:p>
+    <w:p>
+      <w:pPr>
+        <w:ind w:left="1080" w:hanging="216"/>
+      </w:pPr>
+      <w:r>
+        <w:t xml:space="preserve">• </w:t>
+      </w:r>
+      <w:r>
+        <w:t>A motorway master plan targets 22,000 car charging points at 150 kW across about 900 service areas by 2035 [Research: EU report].</w:t>
+      </w:r>
+    </w:p>
+    <w:p>
+      <w:pPr>
+        <w:ind w:left="720" w:hanging="216"/>
+      </w:pPr>
+      <w:r>
+        <w:t xml:space="preserve">• </w:t>
+      </w:r>
+      <w:r>
+        <w:rPr>
+          <w:b/>
+        </w:rPr>
+        <w:t>US:</w:t>
+      </w:r>
+    </w:p>
+    <w:p>
+      <w:pPr>
+        <w:ind w:left="1080" w:hanging="216"/>
+      </w:pPr>
+      <w:r>
+        <w:t xml:space="preserve">• </w:t>
+      </w:r>
+      <w:r>
+        <w:t>$503.8 M of NEVI federal charging funds was repurposed in March 2026 [FHWA notice; search-engine text only].</w:t>
+      </w:r>
+    </w:p>
+    <w:p>
+      <w:pPr>
+        <w:ind w:left="1080" w:hanging="216"/>
+      </w:pPr>
+      <w:r>
+        <w:t xml:space="preserve">• </w:t>
+      </w:r>
+      <w:r>
+        <w:t>84% of NEVI funds were still unobligated in May 2025.</w:t>
+      </w:r>
+    </w:p>
+    <w:p>
+      <w:pPr>
+        <w:ind w:left="1080" w:hanging="216"/>
+      </w:pPr>
+      <w:r>
+        <w:t xml:space="preserve">• </w:t>
+      </w:r>
+      <w:r>
+        <w:t>State programmes remain: California's Fast Charge California ($55 M) and New York ($28.5 M) [Research: US report].</w:t>
+      </w:r>
+    </w:p>
+    <w:p>
+      <w:pPr>
+        <w:ind w:left="360" w:hanging="216"/>
+      </w:pPr>
+      <w:r>
+        <w:t xml:space="preserve">• </w:t>
+      </w:r>
+      <w:r>
+        <w:rPr>
+          <w:b/>
+        </w:rPr>
+        <w:t>Why This Insight Matters:</w:t>
+      </w:r>
+      <w:r>
+        <w:t xml:space="preserve"> Motorway sites in the UK come with high traffic and, in 37 cases, upgraded grid connections. The tender window is short, and competitors with fresh capital (Insight 4) will bid. France offers subsidised capital costs through 2030, which suits a second phase.</w:t>
+      </w:r>
+    </w:p>
+    <w:p>
+      <w:pPr>
+        <w:ind w:left="360" w:hanging="216"/>
+      </w:pPr>
+      <w:r>
+        <w:t xml:space="preserve">• </w:t>
+      </w:r>
+      <w:r>
+        <w:rPr>
+          <w:b/>
+        </w:rPr>
+        <w:t>Signal freshness:</w:t>
+      </w:r>
+      <w:r>
+        <w:t xml:space="preserve"> The CMA undertaking dates from 2022, with a November 2026 deadline two months away; it needs a check for any later change. ADVENIR status is as of Aug 2026. The NEVI notice is March 2026.</w:t>
+      </w:r>
+    </w:p>
+    <w:p>
+      <w:pPr>
+        <w:ind w:left="360" w:hanging="216"/>
+      </w:pPr>
+      <w:r>
+        <w:t xml:space="preserve">• </w:t>
+      </w:r>
+      <w:r>
+        <w:rPr>
+          <w:b/>
+        </w:rPr>
+        <w:t>What would change our mind:</w:t>
+      </w:r>
+      <w:r>
+        <w:t xml:space="preserve"> Any CMA or Gridserve update that delays or narrows the motorway opening, or cuts to ADVENIR or France 2030 funding.</w:t>
+      </w:r>
+    </w:p>
+    <w:p>
+      <w:pPr>
+        <w:pStyle w:val="Heading2"/>
+      </w:pPr>
+      <w:r>
+        <w:t>5. Visual Evidence</w:t>
+      </w:r>
+    </w:p>
+    <w:p>
+      <w:r>
+        <w:t xml:space="preserve">V1–V7 were produced by Amazon Quick Research inside the three reports (exported PDFs in </w:t>
       </w:r>
       <w:r>
         <w:rPr>
           <w:rFonts w:ascii="Menlo" w:hAnsi="Menlo"/>
           <w:sz w:val="18"/>
         </w:rPr>
-        <w:t>screenshots/visuals/v1_…</w:t>
-      </w:r>
-      <w:r>
-        <w:t xml:space="preserve"> to </w:t>
+        <w:t>deliverables/quick_research_reports/</w:t>
+      </w:r>
+      <w:r>
+        <w:t>). V8 is a table view from the agent's Market Analysis. V9 and V10 are charts the agent generated with code execution for its combined analysis document (</w:t>
       </w:r>
       <w:r>
         <w:rPr>
           <w:rFonts w:ascii="Menlo" w:hAnsi="Menlo"/>
           <w:sz w:val="18"/>
         </w:rPr>
-        <w:t>v7_…</w:t>
-      </w:r>
-      <w:r>
-        <w:t xml:space="preserve"> and </w:t>
+        <w:t>deliverables/agent_outputs/05_…docx</w:t>
+      </w:r>
+      <w:r>
+        <w:t xml:space="preserve">). Image files: </w:t>
       </w:r>
       <w:r>
         <w:rPr>
           <w:rFonts w:ascii="Menlo" w:hAnsi="Menlo"/>
           <w:sz w:val="18"/>
         </w:rPr>
+        <w:t>screenshots/visuals/</w:t>
+      </w:r>
+      <w:r>
+        <w:t xml:space="preserve"> and </w:t>
+      </w:r>
+      <w:r>
+        <w:rPr>
+          <w:rFonts w:ascii="Menlo" w:hAnsi="Menlo"/>
+          <w:sz w:val="18"/>
+        </w:rPr>
         <w:t>screenshots/11b_market_analysis_comparison_table.png</w:t>
       </w:r>
       <w:r>
-        <w:t>; all eight are reproduced at the end of this brief.</w:t>
+        <w:t>. All ten are reproduced at the end of this brief.</w:t>
       </w:r>
     </w:p>
     <w:tbl>
@@ -2479,6 +2489,128 @@
                 <w:sz w:val="17"/>
               </w:rPr>
               <w:t xml:space="preserve"> The side-by-side comparison, with definition caveats, that the ranking rests on.</w:t>
+            </w:r>
+          </w:p>
+        </w:tc>
+      </w:tr>
+      <w:tr>
+        <w:tc>
+          <w:tcPr>
+            <w:tcW w:type="dxa" w:w="2340"/>
+          </w:tcPr>
+          <w:p>
+            <w:r>
+              <w:rPr>
+                <w:sz w:val="17"/>
+              </w:rPr>
+              <w:t>V9</w:t>
+            </w:r>
+          </w:p>
+        </w:tc>
+        <w:tc>
+          <w:tcPr>
+            <w:tcW w:type="dxa" w:w="2340"/>
+          </w:tcPr>
+          <w:p>
+            <w:r>
+              <w:rPr>
+                <w:sz w:val="17"/>
+              </w:rPr>
+              <w:t>Grouped bar chart (agent, from dataset + research)</w:t>
+            </w:r>
+          </w:p>
+        </w:tc>
+        <w:tc>
+          <w:tcPr>
+            <w:tcW w:type="dxa" w:w="2340"/>
+          </w:tcPr>
+          <w:p>
+            <w:r>
+              <w:rPr>
+                <w:sz w:val="17"/>
+              </w:rPr>
+              <w:t>EVs per fast charger, 2023 dataset baseline vs latest research: UK 158 → 66, US 112 → 101, Germany 119 → 70, France 79 → 46</w:t>
+            </w:r>
+          </w:p>
+        </w:tc>
+        <w:tc>
+          <w:tcPr>
+            <w:tcW w:type="dxa" w:w="2340"/>
+          </w:tcPr>
+          <w:p>
+            <w:r>
+              <w:rPr>
+                <w:b/>
+                <w:sz w:val="17"/>
+              </w:rPr>
+              <w:t>Insight 1.</w:t>
+            </w:r>
+            <w:r>
+              <w:rPr>
+                <w:sz w:val="17"/>
+              </w:rPr>
+              <w:t xml:space="preserve"> All four markets on one chart. The chart itself notes that definitions differ, so it shows direction only.</w:t>
+            </w:r>
+          </w:p>
+        </w:tc>
+      </w:tr>
+      <w:tr>
+        <w:tc>
+          <w:tcPr>
+            <w:tcW w:type="dxa" w:w="2340"/>
+          </w:tcPr>
+          <w:p>
+            <w:r>
+              <w:rPr>
+                <w:sz w:val="17"/>
+              </w:rPr>
+              <w:t>V10</w:t>
+            </w:r>
+          </w:p>
+        </w:tc>
+        <w:tc>
+          <w:tcPr>
+            <w:tcW w:type="dxa" w:w="2340"/>
+          </w:tcPr>
+          <w:p>
+            <w:r>
+              <w:rPr>
+                <w:sz w:val="17"/>
+              </w:rPr>
+              <w:t>Line chart (agent)</w:t>
+            </w:r>
+          </w:p>
+        </w:tc>
+        <w:tc>
+          <w:tcPr>
+            <w:tcW w:type="dxa" w:w="2340"/>
+          </w:tcPr>
+          <w:p>
+            <w:r>
+              <w:rPr>
+                <w:sz w:val="17"/>
+              </w:rPr>
+              <w:t>US DC fast ports: about 43,000 (2023), 50,428 (2024), about 68,000 (2025), 76,236 (Sep 2026), with the report's "30–35% a year" claim marked as true for 2024→2025 only</w:t>
+            </w:r>
+          </w:p>
+        </w:tc>
+        <w:tc>
+          <w:tcPr>
+            <w:tcW w:type="dxa" w:w="2340"/>
+          </w:tcPr>
+          <w:p>
+            <w:r>
+              <w:rPr>
+                <w:b/>
+                <w:sz w:val="17"/>
+              </w:rPr>
+              <w:t>Insights 1 and 4.</w:t>
+            </w:r>
+            <w:r>
+              <w:rPr>
+                <w:sz w:val="17"/>
+              </w:rPr>
+              <w:t xml:space="preserve"> US build-out is slowing in 2026. The last point is September 2026, not year-end, although the chart title says "End-of-Year".</w:t>
             </w:r>
           </w:p>
         </w:tc>
@@ -3008,7 +3140,7 @@
         <w:rPr>
           <w:b/>
         </w:rPr>
-        <w:t>Four errors were caught</w:t>
+        <w:t>Six errors were caught</w:t>
       </w:r>
       <w:r>
         <w:t xml:space="preserve"> in AI-generated material during review:</w:t>
@@ -3059,8 +3191,40 @@
       </w:r>
     </w:p>
     <w:p>
-      <w:r>
-        <w:t>All four were corrected before Brief v2.</w:t>
+      <w:pPr>
+        <w:ind w:left="720" w:hanging="216"/>
+      </w:pPr>
+      <w:r>
+        <w:t xml:space="preserve">• </w:t>
+      </w:r>
+      <w:r>
+        <w:t>An agent-generated pie chart showing Tesla at 54.2% of US DC ports. It divides by the listed networks only (70,095 ports) instead of the 76,236 total it prints, so the correct share is 49.8%.</w:t>
+      </w:r>
+    </w:p>
+    <w:p>
+      <w:pPr>
+        <w:ind w:left="720" w:hanging="216"/>
+      </w:pPr>
+      <w:r>
+        <w:t xml:space="preserve">• </w:t>
+      </w:r>
+      <w:r>
+        <w:t>An agent-generated bar chart of BEV share. It compares France's single-month August 2026 record (38.8%) with full-year and year-to-date shares for the other markets.</w:t>
+      </w:r>
+    </w:p>
+    <w:p>
+      <w:r>
+        <w:t xml:space="preserve">The first four were corrected before Brief v2. The two charts are excluded from this brief's Visual Evidence and are kept in </w:t>
+      </w:r>
+      <w:r>
+        <w:rPr>
+          <w:rFonts w:ascii="Menlo" w:hAnsi="Menlo"/>
+          <w:sz w:val="18"/>
+        </w:rPr>
+        <w:t>deliverables/agent_outputs/05_…docx</w:t>
+      </w:r>
+      <w:r>
+        <w:t xml:space="preserve"> only as a record.</w:t>
       </w:r>
     </w:p>
     <w:p>
@@ -3964,7 +4128,7 @@
         <w:t xml:space="preserve">5. </w:t>
       </w:r>
       <w:r>
-        <w:t>Overall confidence is Medium: directions are backed by official statistics, but charger definitions differ across sources, utilisation data is thin, and four errors in AI-generated material were caught and corrected during review.</w:t>
+        <w:t>Overall confidence is Medium: directions are backed by official statistics, but charger definitions differ across sources, utilisation data is thin, and six errors in AI-generated material (four in the text, two in agent charts) were caught during review.</w:t>
       </w:r>
     </w:p>
     <w:p>
@@ -4241,6 +4405,19 @@
                 <w:rFonts w:ascii="Menlo" w:hAnsi="Menlo"/>
                 <w:sz w:val="17"/>
               </w:rPr>
+              <w:t>deliverables/agent_outputs/01_…docx</w:t>
+            </w:r>
+            <w:r>
+              <w:rPr>
+                <w:sz w:val="17"/>
+              </w:rPr>
+              <w:t xml:space="preserve">, </w:t>
+            </w:r>
+            <w:r>
+              <w:rPr>
+                <w:rFonts w:ascii="Menlo" w:hAnsi="Menlo"/>
+                <w:sz w:val="17"/>
+              </w:rPr>
               <w:t>screenshots/11*</w:t>
             </w:r>
           </w:p>
@@ -4270,6 +4447,19 @@
                 <w:rFonts w:ascii="Menlo" w:hAnsi="Menlo"/>
                 <w:sz w:val="17"/>
               </w:rPr>
+              <w:t>deliverables/agent_outputs/02_…docx</w:t>
+            </w:r>
+            <w:r>
+              <w:rPr>
+                <w:sz w:val="17"/>
+              </w:rPr>
+              <w:t xml:space="preserve">, </w:t>
+            </w:r>
+            <w:r>
+              <w:rPr>
+                <w:rFonts w:ascii="Menlo" w:hAnsi="Menlo"/>
+                <w:sz w:val="17"/>
+              </w:rPr>
               <w:t>screenshots/12*</w:t>
             </w:r>
           </w:p>
@@ -4299,6 +4489,32 @@
                 <w:rFonts w:ascii="Menlo" w:hAnsi="Menlo"/>
                 <w:sz w:val="17"/>
               </w:rPr>
+              <w:t>deliverables/agent_outputs/03_…docx</w:t>
+            </w:r>
+            <w:r>
+              <w:rPr>
+                <w:sz w:val="17"/>
+              </w:rPr>
+              <w:t xml:space="preserve">, </w:t>
+            </w:r>
+            <w:r>
+              <w:rPr>
+                <w:rFonts w:ascii="Menlo" w:hAnsi="Menlo"/>
+                <w:sz w:val="17"/>
+              </w:rPr>
+              <w:t>04_…docx</w:t>
+            </w:r>
+            <w:r>
+              <w:rPr>
+                <w:sz w:val="17"/>
+              </w:rPr>
+              <w:t xml:space="preserve">, </w:t>
+            </w:r>
+            <w:r>
+              <w:rPr>
+                <w:rFonts w:ascii="Menlo" w:hAnsi="Menlo"/>
+                <w:sz w:val="17"/>
+              </w:rPr>
               <w:t>screenshots/13*</w:t>
             </w:r>
             <w:r>
@@ -4313,6 +4529,35 @@
                 <w:sz w:val="17"/>
               </w:rPr>
               <w:t>screenshots/14*</w:t>
+            </w:r>
+          </w:p>
+        </w:tc>
+      </w:tr>
+      <w:tr>
+        <w:tc>
+          <w:tcPr>
+            <w:tcW w:type="dxa" w:w="4680"/>
+          </w:tcPr>
+          <w:p>
+            <w:r>
+              <w:rPr>
+                <w:sz w:val="17"/>
+              </w:rPr>
+              <w:t>Combined Market Analysis + Reliability document with four agent charts (chat file, not in the Space)</w:t>
+            </w:r>
+          </w:p>
+        </w:tc>
+        <w:tc>
+          <w:tcPr>
+            <w:tcW w:type="dxa" w:w="4680"/>
+          </w:tcPr>
+          <w:p>
+            <w:r>
+              <w:rPr>
+                <w:rFonts w:ascii="Menlo" w:hAnsi="Menlo"/>
+                <w:sz w:val="17"/>
+              </w:rPr>
+              <w:t>deliverables/agent_outputs/05_…docx</w:t>
             </w:r>
           </w:p>
         </w:tc>
@@ -4829,6 +5074,108 @@
           <w:sz w:val="18"/>
         </w:rPr>
         <w:t>V8. Market comparison table (Market Intelligence Agent)</w:t>
+      </w:r>
+    </w:p>
+    <w:p>
+      <w:pPr>
+        <w:jc w:val="center"/>
+      </w:pPr>
+      <w:r>
+        <w:drawing>
+          <wp:inline>
+            <wp:extent cx="5669280" cy="3023616"/>
+            <wp:docPr id="9" name="Picture 9"/>
+            <wp:cNvGraphicFramePr>
+              <a:graphicFrameLocks noChangeAspect="1"/>
+            </wp:cNvGraphicFramePr>
+            <a:graphic>
+              <a:graphicData uri="http://schemas.openxmlformats.org/drawingml/2006/picture">
+                <pic:pic>
+                  <pic:nvPicPr>
+                    <pic:cNvPr id="0" name="v9_agent_evs_per_fast_charger_2023_vs_latest.png"/>
+                    <pic:cNvPicPr/>
+                  </pic:nvPicPr>
+                  <pic:blipFill>
+                    <a:blip r:embed="rId14"/>
+                    <a:stretch>
+                      <a:fillRect/>
+                    </a:stretch>
+                  </pic:blipFill>
+                  <pic:spPr>
+                    <a:xfrm>
+                      <a:off x="0" y="0"/>
+                      <a:ext cx="5669280" cy="3023616"/>
+                    </a:xfrm>
+                    <a:prstGeom prst="rect"/>
+                  </pic:spPr>
+                </pic:pic>
+              </a:graphicData>
+            </a:graphic>
+          </wp:inline>
+        </w:drawing>
+      </w:r>
+    </w:p>
+    <w:p>
+      <w:pPr>
+        <w:jc w:val="center"/>
+      </w:pPr>
+      <w:r>
+        <w:rPr>
+          <w:i/>
+          <w:sz w:val="18"/>
+        </w:rPr>
+        <w:t>V9. EVs per fast charger, 2023 vs latest (Market Intelligence Agent chart)</w:t>
+      </w:r>
+    </w:p>
+    <w:p>
+      <w:pPr>
+        <w:jc w:val="center"/>
+      </w:pPr>
+      <w:r>
+        <w:drawing>
+          <wp:inline>
+            <wp:extent cx="5669280" cy="2897632"/>
+            <wp:docPr id="10" name="Picture 10"/>
+            <wp:cNvGraphicFramePr>
+              <a:graphicFrameLocks noChangeAspect="1"/>
+            </wp:cNvGraphicFramePr>
+            <a:graphic>
+              <a:graphicData uri="http://schemas.openxmlformats.org/drawingml/2006/picture">
+                <pic:pic>
+                  <pic:nvPicPr>
+                    <pic:cNvPr id="0" name="v12_agent_us_dc_port_growth_2023_2026.png"/>
+                    <pic:cNvPicPr/>
+                  </pic:nvPicPr>
+                  <pic:blipFill>
+                    <a:blip r:embed="rId15"/>
+                    <a:stretch>
+                      <a:fillRect/>
+                    </a:stretch>
+                  </pic:blipFill>
+                  <pic:spPr>
+                    <a:xfrm>
+                      <a:off x="0" y="0"/>
+                      <a:ext cx="5669280" cy="2897632"/>
+                    </a:xfrm>
+                    <a:prstGeom prst="rect"/>
+                  </pic:spPr>
+                </pic:pic>
+              </a:graphicData>
+            </a:graphic>
+          </wp:inline>
+        </w:drawing>
+      </w:r>
+    </w:p>
+    <w:p>
+      <w:pPr>
+        <w:jc w:val="center"/>
+      </w:pPr>
+      <w:r>
+        <w:rPr>
+          <w:i/>
+          <w:sz w:val="18"/>
+        </w:rPr>
+        <w:t>V10. US DC fast port growth 2023 to Sep 2026 (Market Intelligence Agent chart)</w:t>
       </w:r>
     </w:p>
     <w:sectPr>

</xml_diff>

<commit_message>
Apply third-review corrections and fix PDF and DOCX rendering
</commit_message>
<xml_diff>
--- a/deliverables/Market_Intelligence_Research_Brief.docx
+++ b/deliverables/Market_Intelligence_Research_Brief.docx
@@ -66,13 +66,13 @@
         </w:tblBorders>
       </w:tblPr>
       <w:tblGrid>
-        <w:gridCol w:w="4680"/>
-        <w:gridCol w:w="4680"/>
+        <w:gridCol w:w="2008"/>
+        <w:gridCol w:w="7351"/>
       </w:tblGrid>
       <w:tr>
         <w:tc>
           <w:tcPr>
-            <w:tcW w:type="dxa" w:w="488"/>
+            <w:tcW w:type="dxa" w:w="2008"/>
           </w:tcPr>
           <w:p>
             <w:r>
@@ -86,7 +86,7 @@
         </w:tc>
         <w:tc>
           <w:tcPr>
-            <w:tcW w:type="dxa" w:w="8872"/>
+            <w:tcW w:type="dxa" w:w="7352"/>
           </w:tcPr>
           <w:p>
             <w:r>
@@ -102,7 +102,7 @@
       <w:tr>
         <w:tc>
           <w:tcPr>
-            <w:tcW w:type="dxa" w:w="488"/>
+            <w:tcW w:type="dxa" w:w="2008"/>
           </w:tcPr>
           <w:p>
             <w:r>
@@ -116,7 +116,7 @@
         </w:tc>
         <w:tc>
           <w:tcPr>
-            <w:tcW w:type="dxa" w:w="8872"/>
+            <w:tcW w:type="dxa" w:w="7352"/>
           </w:tcPr>
           <w:p>
             <w:r>
@@ -136,7 +136,7 @@
               <w:rPr>
                 <w:sz w:val="17"/>
               </w:rPr>
-              <w:t xml:space="preserve"> for a site-led entry. Gridserve's exclusive rights at about two-thirds of motorway service areas stop being enforced after November 2026, although the service-area operators are also building their own networks. Several regions are underserved, and UK supply has overtaken the fleet less than in the EU core. Scope </w:t>
+              <w:t xml:space="preserve"> for a site-led entry. Gridserve's exclusive rights at about two-thirds of motorway service areas stop being enforced after November 2026, although Moto and Roadchef are building their own networks and Extra is expanding with Ionity. Several regions are underserved, and UK supply has overtaken the fleet less than in the EU core. Scope </w:t>
             </w:r>
             <w:r>
               <w:rPr>
@@ -170,7 +170,7 @@
       <w:tr>
         <w:tc>
           <w:tcPr>
-            <w:tcW w:type="dxa" w:w="488"/>
+            <w:tcW w:type="dxa" w:w="2008"/>
           </w:tcPr>
           <w:p>
             <w:r>
@@ -184,7 +184,7 @@
         </w:tc>
         <w:tc>
           <w:tcPr>
-            <w:tcW w:type="dxa" w:w="8872"/>
+            <w:tcW w:type="dxa" w:w="7352"/>
           </w:tcPr>
           <w:p>
             <w:r>
@@ -206,7 +206,7 @@
       <w:tr>
         <w:tc>
           <w:tcPr>
-            <w:tcW w:type="dxa" w:w="488"/>
+            <w:tcW w:type="dxa" w:w="2008"/>
           </w:tcPr>
           <w:p>
             <w:r>
@@ -220,7 +220,7 @@
         </w:tc>
         <w:tc>
           <w:tcPr>
-            <w:tcW w:type="dxa" w:w="8872"/>
+            <w:tcW w:type="dxa" w:w="7352"/>
           </w:tcPr>
           <w:p>
             <w:r>
@@ -235,7 +235,7 @@
       <w:tr>
         <w:tc>
           <w:tcPr>
-            <w:tcW w:type="dxa" w:w="488"/>
+            <w:tcW w:type="dxa" w:w="2008"/>
           </w:tcPr>
           <w:p>
             <w:r>
@@ -249,14 +249,14 @@
         </w:tc>
         <w:tc>
           <w:tcPr>
-            <w:tcW w:type="dxa" w:w="8872"/>
-          </w:tcPr>
-          <w:p>
-            <w:r>
-              <w:rPr>
-                <w:sz w:val="17"/>
-              </w:rPr>
-              <w:t>UK grid-connection delays (a 5.5-year average gap in Ofgem's July 2024 data, before the queue reform). Service-area operators taking the freed motorway sites for their own networks. The UK ZEV mandate review (consultation Aug–Oct 2026). Low utilisation (about 8% across all UK public chargers, all speeds). The US demand shock after the tax credit ended.</w:t>
+            <w:tcW w:type="dxa" w:w="7352"/>
+          </w:tcPr>
+          <w:p>
+            <w:r>
+              <w:rPr>
+                <w:sz w:val="17"/>
+              </w:rPr>
+              <w:t>UK grid-connection delays (a 5.5-year gap between requested and offered connection dates in Ofgem's July 2024 blog, before the queue reform). Service-area operators taking the freed motorway sites for their own networks or partners. The UK ZEV mandate review (consultation Aug–Oct 2026). Low utilisation (about 8% across all UK public chargers, all speeds). The US demand shock after the tax credit ended.</w:t>
             </w:r>
           </w:p>
         </w:tc>
@@ -264,7 +264,7 @@
       <w:tr>
         <w:tc>
           <w:tcPr>
-            <w:tcW w:type="dxa" w:w="488"/>
+            <w:tcW w:type="dxa" w:w="2008"/>
           </w:tcPr>
           <w:p>
             <w:r>
@@ -278,7 +278,7 @@
         </w:tc>
         <w:tc>
           <w:tcPr>
-            <w:tcW w:type="dxa" w:w="8872"/>
+            <w:tcW w:type="dxa" w:w="7352"/>
           </w:tcPr>
           <w:p>
             <w:r>
@@ -540,7 +540,7 @@
         <w:t>Timeframe:</w:t>
       </w:r>
       <w:r>
-        <w:t xml:space="preserve"> A 2023 dataset baseline and a 2026–2028 decision horizon. External evidence is mostly from 2024 to September 2026. Two older items are the 2022 CMA motorway commitments and the 2022–2024 standing-charge example. IEA projections to 2030 are used as scenario context only.</w:t>
+        <w:t xml:space="preserve"> A 2023 dataset baseline and a 2026–2028 decision horizon. External evidence is mostly from 2024 to September 2026. Older items are Ofgem's 2021 Green Recovery Scheme, the 2022 CMA motorway commitments, the 2022–2024 standing-charge example, AFDC's end-2023 port count and RMI's demand-charge guidance. IEA projections to 2030 are used as scenario context only.</w:t>
       </w:r>
     </w:p>
     <w:p>
@@ -915,7 +915,7 @@
         <w:t xml:space="preserve">• </w:t>
       </w:r>
       <w:r>
-        <w:t>Two line-by-line reviews of this brief against the reports, the dataset and the agent's documents.</w:t>
+        <w:t>Three line-by-line reviews of this brief against the reports, the dataset and the agent's documents.</w:t>
       </w:r>
     </w:p>
     <w:p>
@@ -1201,13 +1201,13 @@
         </w:tblBorders>
       </w:tblPr>
       <w:tblGrid>
-        <w:gridCol w:w="4680"/>
-        <w:gridCol w:w="4680"/>
+        <w:gridCol w:w="3028"/>
+        <w:gridCol w:w="6331"/>
       </w:tblGrid>
       <w:tr>
         <w:tc>
           <w:tcPr>
-            <w:tcW w:type="dxa" w:w="2400"/>
+            <w:tcW w:type="dxa" w:w="3029"/>
           </w:tcPr>
           <w:p>
             <w:r>
@@ -1221,7 +1221,7 @@
         </w:tc>
         <w:tc>
           <w:tcPr>
-            <w:tcW w:type="dxa" w:w="6960"/>
+            <w:tcW w:type="dxa" w:w="6331"/>
           </w:tcPr>
           <w:p>
             <w:r>
@@ -1237,7 +1237,7 @@
       <w:tr>
         <w:tc>
           <w:tcPr>
-            <w:tcW w:type="dxa" w:w="2400"/>
+            <w:tcW w:type="dxa" w:w="3029"/>
           </w:tcPr>
           <w:p>
             <w:r>
@@ -1250,7 +1250,7 @@
         </w:tc>
         <w:tc>
           <w:tcPr>
-            <w:tcW w:type="dxa" w:w="6960"/>
+            <w:tcW w:type="dxa" w:w="6331"/>
           </w:tcPr>
           <w:p>
             <w:r>
@@ -1265,7 +1265,7 @@
       <w:tr>
         <w:tc>
           <w:tcPr>
-            <w:tcW w:type="dxa" w:w="2400"/>
+            <w:tcW w:type="dxa" w:w="3029"/>
           </w:tcPr>
           <w:p>
             <w:r>
@@ -1278,7 +1278,7 @@
         </w:tc>
         <w:tc>
           <w:tcPr>
-            <w:tcW w:type="dxa" w:w="6960"/>
+            <w:tcW w:type="dxa" w:w="6331"/>
           </w:tcPr>
           <w:p>
             <w:r>
@@ -1293,7 +1293,7 @@
       <w:tr>
         <w:tc>
           <w:tcPr>
-            <w:tcW w:type="dxa" w:w="2400"/>
+            <w:tcW w:type="dxa" w:w="3029"/>
           </w:tcPr>
           <w:p>
             <w:r>
@@ -1306,7 +1306,7 @@
         </w:tc>
         <w:tc>
           <w:tcPr>
-            <w:tcW w:type="dxa" w:w="6960"/>
+            <w:tcW w:type="dxa" w:w="6331"/>
           </w:tcPr>
           <w:p>
             <w:r>
@@ -1321,7 +1321,7 @@
       <w:tr>
         <w:tc>
           <w:tcPr>
-            <w:tcW w:type="dxa" w:w="2400"/>
+            <w:tcW w:type="dxa" w:w="3029"/>
           </w:tcPr>
           <w:p>
             <w:r>
@@ -1334,7 +1334,7 @@
         </w:tc>
         <w:tc>
           <w:tcPr>
-            <w:tcW w:type="dxa" w:w="6960"/>
+            <w:tcW w:type="dxa" w:w="6331"/>
           </w:tcPr>
           <w:p>
             <w:r>
@@ -1349,7 +1349,7 @@
       <w:tr>
         <w:tc>
           <w:tcPr>
-            <w:tcW w:type="dxa" w:w="2400"/>
+            <w:tcW w:type="dxa" w:w="3029"/>
           </w:tcPr>
           <w:p>
             <w:r>
@@ -1362,7 +1362,7 @@
         </w:tc>
         <w:tc>
           <w:tcPr>
-            <w:tcW w:type="dxa" w:w="6960"/>
+            <w:tcW w:type="dxa" w:w="6331"/>
           </w:tcPr>
           <w:p>
             <w:r>
@@ -1377,7 +1377,7 @@
       <w:tr>
         <w:tc>
           <w:tcPr>
-            <w:tcW w:type="dxa" w:w="2400"/>
+            <w:tcW w:type="dxa" w:w="3029"/>
           </w:tcPr>
           <w:p>
             <w:r>
@@ -1390,7 +1390,7 @@
         </w:tc>
         <w:tc>
           <w:tcPr>
-            <w:tcW w:type="dxa" w:w="6960"/>
+            <w:tcW w:type="dxa" w:w="6331"/>
           </w:tcPr>
           <w:p>
             <w:r>
@@ -1405,7 +1405,7 @@
       <w:tr>
         <w:tc>
           <w:tcPr>
-            <w:tcW w:type="dxa" w:w="2400"/>
+            <w:tcW w:type="dxa" w:w="3029"/>
           </w:tcPr>
           <w:p>
             <w:r>
@@ -1418,7 +1418,7 @@
         </w:tc>
         <w:tc>
           <w:tcPr>
-            <w:tcW w:type="dxa" w:w="6960"/>
+            <w:tcW w:type="dxa" w:w="6331"/>
           </w:tcPr>
           <w:p>
             <w:r>
@@ -1433,7 +1433,7 @@
       <w:tr>
         <w:tc>
           <w:tcPr>
-            <w:tcW w:type="dxa" w:w="2400"/>
+            <w:tcW w:type="dxa" w:w="3029"/>
           </w:tcPr>
           <w:p>
             <w:r>
@@ -1446,7 +1446,7 @@
         </w:tc>
         <w:tc>
           <w:tcPr>
-            <w:tcW w:type="dxa" w:w="6960"/>
+            <w:tcW w:type="dxa" w:w="6331"/>
           </w:tcPr>
           <w:p>
             <w:r>
@@ -1461,7 +1461,7 @@
       <w:tr>
         <w:tc>
           <w:tcPr>
-            <w:tcW w:type="dxa" w:w="2400"/>
+            <w:tcW w:type="dxa" w:w="3029"/>
           </w:tcPr>
           <w:p>
             <w:r>
@@ -1474,7 +1474,7 @@
         </w:tc>
         <w:tc>
           <w:tcPr>
-            <w:tcW w:type="dxa" w:w="6960"/>
+            <w:tcW w:type="dxa" w:w="6331"/>
           </w:tcPr>
           <w:p>
             <w:r>
@@ -1489,7 +1489,7 @@
       <w:tr>
         <w:tc>
           <w:tcPr>
-            <w:tcW w:type="dxa" w:w="2400"/>
+            <w:tcW w:type="dxa" w:w="3029"/>
           </w:tcPr>
           <w:p>
             <w:r>
@@ -1502,7 +1502,7 @@
         </w:tc>
         <w:tc>
           <w:tcPr>
-            <w:tcW w:type="dxa" w:w="6960"/>
+            <w:tcW w:type="dxa" w:w="6331"/>
           </w:tcPr>
           <w:p>
             <w:r>
@@ -1517,7 +1517,7 @@
       <w:tr>
         <w:tc>
           <w:tcPr>
-            <w:tcW w:type="dxa" w:w="2400"/>
+            <w:tcW w:type="dxa" w:w="3029"/>
           </w:tcPr>
           <w:p>
             <w:r>
@@ -1530,7 +1530,7 @@
         </w:tc>
         <w:tc>
           <w:tcPr>
-            <w:tcW w:type="dxa" w:w="6960"/>
+            <w:tcW w:type="dxa" w:w="6331"/>
           </w:tcPr>
           <w:p>
             <w:r>
@@ -2003,7 +2003,7 @@
         <w:t xml:space="preserve">• </w:t>
       </w:r>
       <w:r>
-        <w:t>DC fast ports then reached 50,428 (Dec 2024), about 68,000 (end-2025) and 76,236 (3 Sep 2026) [Research: US report; evchargingstations.com, verified].</w:t>
+        <w:t>DC fast ports then reached 50,428 (Dec 2024), about 68,000 (end-2025) and 76,236 (1 Sep 2026) [Research: US report; evchargingstations.com, verified].</w:t>
       </w:r>
     </w:p>
     <w:p>
@@ -2131,7 +2131,7 @@
         <w:t xml:space="preserve">• </w:t>
       </w:r>
       <w:r>
-        <w:t>Charger counts: UK 1 Jul 2026 (DfT, published 27 Aug 2026); Germany Jul 2026; US 3 Sep 2026; France Feb 2025.</w:t>
+        <w:t>Charger counts: UK 1 Jul 2026 (DfT, published 27 Aug 2026); Germany Jul 2026; US 1 Sep 2026 (published 3 Sep 2026); France Feb 2025.</w:t>
       </w:r>
     </w:p>
     <w:p>
@@ -2723,7 +2723,7 @@
         <w:t xml:space="preserve">• </w:t>
       </w:r>
       <w:r>
-        <w:t>Ofgem's blog of 17 July 2024 gives a 5.5-year average gap between requested and offered connection dates for all connecting customers, when the queue was dominated by renewables and storage. This predates the reform that has since moved 221 GW out of the queue (April 2026). No post-reform or charger-specific figure was found [Research: UK report].</w:t>
+        <w:t>Ofgem's blog of 17 July 2024 reports a 5.5-year difference between requested connection dates and connection offers for connecting customers, when the 714 GW queue was dominated by renewables and storage. This predates the reform that has since moved 221 GW out of the queue (April 2026). No post-reform or charger-specific figure was found [Research: UK report].</w:t>
       </w:r>
     </w:p>
     <w:p>
@@ -2898,7 +2898,7 @@
         <w:t>What would change our mind:</w:t>
       </w:r>
       <w:r>
-        <w:t xml:space="preserve"> Published UK rapid-specific utilisation consistently above 15%, or post-reform Ofgem data showing connection times for charging sites well below the pre-reform 5.5-year average.</w:t>
+        <w:t xml:space="preserve"> Published UK rapid-specific utilisation consistently above 15%, or post-reform Ofgem data showing connection times for charging sites well below the pre-reform 5.5-year gap.</w:t>
       </w:r>
     </w:p>
     <w:p>
@@ -3169,7 +3169,7 @@
         <w:t xml:space="preserve">• </w:t>
       </w:r>
       <w:r>
-        <w:t>Near-highway: Tesla 2,453, Powerdot 1,369, Electra 1,181. Electra's highway plus near-highway total is 1,504, after a €304 M Series B.</w:t>
+        <w:t>Near-highway: Tesla 2,453, Powerdot 1,369, Electra 1,181, TotalEnergies 693, Izivia 683. Electra's highway plus near-highway total is 1,504, after a €304 M Series B.</w:t>
       </w:r>
     </w:p>
     <w:p>
@@ -3376,7 +3376,7 @@
         <w:t xml:space="preserve">• </w:t>
       </w:r>
       <w:r>
-        <w:t>The owners are moving first. Moto launched its own Moto Charge network in December 2025 [Zapmap]. Roadchef has opened its first branded hub on the M6 [The Fast Charge]. Extra is expanding its sites with Ionity [electrive, Aug 2025].</w:t>
+        <w:t>The owners are moving first. Moto launched its own Moto Charge network in December 2025 [Zapmap]. Roadchef has installed its first own-branded hub on the M6, though it did not appear to be live in early August 2026 [The Fast Charge, 6 Aug 2026]. Extra is expanding its sites with Ionity [electrive, Aug 2025].</w:t>
       </w:r>
     </w:p>
     <w:p>
@@ -3597,7 +3597,7 @@
         <w:t xml:space="preserve">• </w:t>
       </w:r>
       <w:r>
-        <w:t>California has run state-funded rounds (Fast Charge California, $55 M, 2025) [Research: US report; CEC]; whether new rounds follow is not known.</w:t>
+        <w:t>California has run state-funded rounds (Fast Charge California, $55 M, 2025) [Research: US report; CEC]. On 18 Aug 2026 the CEC approved a $95.2 M FY2026–27 ZEV infrastructure plan that includes $48 M for light-duty charging, focused on DC fast and home or near-home charging [Research: US report; CEC]; how much of it reaches public fast-charging rounds is not known.</w:t>
       </w:r>
     </w:p>
     <w:p>
@@ -3691,7 +3691,7 @@
         <w:t xml:space="preserve">• </w:t>
       </w:r>
       <w:r>
-        <w:t>Site-owner moves are dated December 2025 to 2026.</w:t>
+        <w:t>Site-owner moves are dated August 2025 (Extra with Ionity) to August 2026 (Roadchef).</w:t>
       </w:r>
     </w:p>
     <w:p>
@@ -3930,15 +3930,15 @@
         </w:tblBorders>
       </w:tblPr>
       <w:tblGrid>
-        <w:gridCol w:w="2340"/>
-        <w:gridCol w:w="2340"/>
-        <w:gridCol w:w="2340"/>
-        <w:gridCol w:w="2340"/>
+        <w:gridCol w:w="604"/>
+        <w:gridCol w:w="1542"/>
+        <w:gridCol w:w="3592"/>
+        <w:gridCol w:w="3621"/>
       </w:tblGrid>
       <w:tr>
         <w:tc>
           <w:tcPr>
-            <w:tcW w:type="dxa" w:w="130"/>
+            <w:tcW w:type="dxa" w:w="605"/>
           </w:tcPr>
           <w:p>
             <w:r>
@@ -3952,7 +3952,7 @@
         </w:tc>
         <w:tc>
           <w:tcPr>
-            <w:tcW w:type="dxa" w:w="563"/>
+            <w:tcW w:type="dxa" w:w="1542"/>
           </w:tcPr>
           <w:p>
             <w:r>
@@ -3966,7 +3966,7 @@
         </w:tc>
         <w:tc>
           <w:tcPr>
-            <w:tcW w:type="dxa" w:w="4333"/>
+            <w:tcW w:type="dxa" w:w="3592"/>
           </w:tcPr>
           <w:p>
             <w:r>
@@ -3980,7 +3980,7 @@
         </w:tc>
         <w:tc>
           <w:tcPr>
-            <w:tcW w:type="dxa" w:w="4333"/>
+            <w:tcW w:type="dxa" w:w="3621"/>
           </w:tcPr>
           <w:p>
             <w:r>
@@ -3996,7 +3996,7 @@
       <w:tr>
         <w:tc>
           <w:tcPr>
-            <w:tcW w:type="dxa" w:w="130"/>
+            <w:tcW w:type="dxa" w:w="605"/>
           </w:tcPr>
           <w:p>
             <w:r>
@@ -4009,7 +4009,7 @@
         </w:tc>
         <w:tc>
           <w:tcPr>
-            <w:tcW w:type="dxa" w:w="563"/>
+            <w:tcW w:type="dxa" w:w="1542"/>
           </w:tcPr>
           <w:p>
             <w:r>
@@ -4022,7 +4022,7 @@
         </w:tc>
         <w:tc>
           <w:tcPr>
-            <w:tcW w:type="dxa" w:w="4333"/>
+            <w:tcW w:type="dxa" w:w="3592"/>
           </w:tcPr>
           <w:p>
             <w:r>
@@ -4035,7 +4035,7 @@
         </w:tc>
         <w:tc>
           <w:tcPr>
-            <w:tcW w:type="dxa" w:w="4333"/>
+            <w:tcW w:type="dxa" w:w="3621"/>
           </w:tcPr>
           <w:p>
             <w:r>
@@ -4057,7 +4057,7 @@
       <w:tr>
         <w:tc>
           <w:tcPr>
-            <w:tcW w:type="dxa" w:w="130"/>
+            <w:tcW w:type="dxa" w:w="605"/>
           </w:tcPr>
           <w:p>
             <w:r>
@@ -4070,7 +4070,7 @@
         </w:tc>
         <w:tc>
           <w:tcPr>
-            <w:tcW w:type="dxa" w:w="563"/>
+            <w:tcW w:type="dxa" w:w="1542"/>
           </w:tcPr>
           <w:p>
             <w:r>
@@ -4083,7 +4083,7 @@
         </w:tc>
         <w:tc>
           <w:tcPr>
-            <w:tcW w:type="dxa" w:w="4333"/>
+            <w:tcW w:type="dxa" w:w="3592"/>
           </w:tcPr>
           <w:p>
             <w:r>
@@ -4096,7 +4096,7 @@
         </w:tc>
         <w:tc>
           <w:tcPr>
-            <w:tcW w:type="dxa" w:w="4333"/>
+            <w:tcW w:type="dxa" w:w="3621"/>
           </w:tcPr>
           <w:p>
             <w:r>
@@ -4118,7 +4118,7 @@
       <w:tr>
         <w:tc>
           <w:tcPr>
-            <w:tcW w:type="dxa" w:w="130"/>
+            <w:tcW w:type="dxa" w:w="605"/>
           </w:tcPr>
           <w:p>
             <w:r>
@@ -4131,7 +4131,7 @@
         </w:tc>
         <w:tc>
           <w:tcPr>
-            <w:tcW w:type="dxa" w:w="563"/>
+            <w:tcW w:type="dxa" w:w="1542"/>
           </w:tcPr>
           <w:p>
             <w:r>
@@ -4144,7 +4144,7 @@
         </w:tc>
         <w:tc>
           <w:tcPr>
-            <w:tcW w:type="dxa" w:w="4333"/>
+            <w:tcW w:type="dxa" w:w="3592"/>
           </w:tcPr>
           <w:p>
             <w:r>
@@ -4157,7 +4157,7 @@
         </w:tc>
         <w:tc>
           <w:tcPr>
-            <w:tcW w:type="dxa" w:w="4333"/>
+            <w:tcW w:type="dxa" w:w="3621"/>
           </w:tcPr>
           <w:p>
             <w:r>
@@ -4179,7 +4179,7 @@
       <w:tr>
         <w:tc>
           <w:tcPr>
-            <w:tcW w:type="dxa" w:w="130"/>
+            <w:tcW w:type="dxa" w:w="605"/>
           </w:tcPr>
           <w:p>
             <w:r>
@@ -4192,7 +4192,7 @@
         </w:tc>
         <w:tc>
           <w:tcPr>
-            <w:tcW w:type="dxa" w:w="563"/>
+            <w:tcW w:type="dxa" w:w="1542"/>
           </w:tcPr>
           <w:p>
             <w:r>
@@ -4205,7 +4205,7 @@
         </w:tc>
         <w:tc>
           <w:tcPr>
-            <w:tcW w:type="dxa" w:w="4333"/>
+            <w:tcW w:type="dxa" w:w="3592"/>
           </w:tcPr>
           <w:p>
             <w:r>
@@ -4218,7 +4218,7 @@
         </w:tc>
         <w:tc>
           <w:tcPr>
-            <w:tcW w:type="dxa" w:w="4333"/>
+            <w:tcW w:type="dxa" w:w="3621"/>
           </w:tcPr>
           <w:p>
             <w:r>
@@ -4240,7 +4240,7 @@
       <w:tr>
         <w:tc>
           <w:tcPr>
-            <w:tcW w:type="dxa" w:w="130"/>
+            <w:tcW w:type="dxa" w:w="605"/>
           </w:tcPr>
           <w:p>
             <w:r>
@@ -4253,7 +4253,7 @@
         </w:tc>
         <w:tc>
           <w:tcPr>
-            <w:tcW w:type="dxa" w:w="563"/>
+            <w:tcW w:type="dxa" w:w="1542"/>
           </w:tcPr>
           <w:p>
             <w:r>
@@ -4266,20 +4266,20 @@
         </w:tc>
         <w:tc>
           <w:tcPr>
-            <w:tcW w:type="dxa" w:w="4333"/>
-          </w:tcPr>
-          <w:p>
-            <w:r>
-              <w:rPr>
-                <w:sz w:val="17"/>
-              </w:rPr>
-              <w:t>US DC ports by network, Sep 2026: Tesla 37,995 (49.8%) and Other 12,382 (16.2%). Four top-10 networks are not drawn: Blink (6th, 2,059), EV Connect (7th, 1,731), Ford Charge (9th, 1,264) and Rivian (10th, 1,087), 6,141 ports in all. IONNA, drawn sixth, is 8th.</w:t>
-            </w:r>
-          </w:p>
-        </w:tc>
-        <w:tc>
-          <w:tcPr>
-            <w:tcW w:type="dxa" w:w="4333"/>
+            <w:tcW w:type="dxa" w:w="3592"/>
+          </w:tcPr>
+          <w:p>
+            <w:r>
+              <w:rPr>
+                <w:sz w:val="17"/>
+              </w:rPr>
+              <w:t>US DC ports by network, Sep 2026: Tesla 37,995 (49.8%) and Other 12,382 (16.2%). Four top-10 networks are not drawn: Blink (6th, 2,059), EV Connect (7th, 1,731), Ford Charge (9th, 1,264) and Rivian (10th, 1,087), 6,141 ports in all. IONNA, drawn sixth, is 8th (R14).</w:t>
+            </w:r>
+          </w:p>
+        </w:tc>
+        <w:tc>
+          <w:tcPr>
+            <w:tcW w:type="dxa" w:w="3621"/>
           </w:tcPr>
           <w:p>
             <w:r>
@@ -4301,7 +4301,7 @@
       <w:tr>
         <w:tc>
           <w:tcPr>
-            <w:tcW w:type="dxa" w:w="130"/>
+            <w:tcW w:type="dxa" w:w="605"/>
           </w:tcPr>
           <w:p>
             <w:r>
@@ -4314,7 +4314,7 @@
         </w:tc>
         <w:tc>
           <w:tcPr>
-            <w:tcW w:type="dxa" w:w="563"/>
+            <w:tcW w:type="dxa" w:w="1542"/>
           </w:tcPr>
           <w:p>
             <w:r>
@@ -4327,7 +4327,7 @@
         </w:tc>
         <w:tc>
           <w:tcPr>
-            <w:tcW w:type="dxa" w:w="4333"/>
+            <w:tcW w:type="dxa" w:w="3592"/>
           </w:tcPr>
           <w:p>
             <w:r>
@@ -4340,7 +4340,7 @@
         </w:tc>
         <w:tc>
           <w:tcPr>
-            <w:tcW w:type="dxa" w:w="4333"/>
+            <w:tcW w:type="dxa" w:w="3621"/>
           </w:tcPr>
           <w:p>
             <w:r>
@@ -4362,7 +4362,7 @@
       <w:tr>
         <w:tc>
           <w:tcPr>
-            <w:tcW w:type="dxa" w:w="130"/>
+            <w:tcW w:type="dxa" w:w="605"/>
           </w:tcPr>
           <w:p>
             <w:r>
@@ -4375,7 +4375,7 @@
         </w:tc>
         <w:tc>
           <w:tcPr>
-            <w:tcW w:type="dxa" w:w="563"/>
+            <w:tcW w:type="dxa" w:w="1542"/>
           </w:tcPr>
           <w:p>
             <w:r>
@@ -4388,7 +4388,7 @@
         </w:tc>
         <w:tc>
           <w:tcPr>
-            <w:tcW w:type="dxa" w:w="4333"/>
+            <w:tcW w:type="dxa" w:w="3592"/>
           </w:tcPr>
           <w:p>
             <w:r>
@@ -4401,7 +4401,7 @@
         </w:tc>
         <w:tc>
           <w:tcPr>
-            <w:tcW w:type="dxa" w:w="4333"/>
+            <w:tcW w:type="dxa" w:w="3621"/>
           </w:tcPr>
           <w:p>
             <w:r>
@@ -4423,7 +4423,7 @@
       <w:tr>
         <w:tc>
           <w:tcPr>
-            <w:tcW w:type="dxa" w:w="130"/>
+            <w:tcW w:type="dxa" w:w="605"/>
           </w:tcPr>
           <w:p>
             <w:r>
@@ -4436,7 +4436,7 @@
         </w:tc>
         <w:tc>
           <w:tcPr>
-            <w:tcW w:type="dxa" w:w="563"/>
+            <w:tcW w:type="dxa" w:w="1542"/>
           </w:tcPr>
           <w:p>
             <w:r>
@@ -4449,20 +4449,20 @@
         </w:tc>
         <w:tc>
           <w:tcPr>
-            <w:tcW w:type="dxa" w:w="4333"/>
-          </w:tcPr>
-          <w:p>
-            <w:r>
-              <w:rPr>
-                <w:sz w:val="17"/>
-              </w:rPr>
-              <w:t>The 2023 dataset baseline next to the latest research for all four markets, with charger definitions labelled. It is the agent's first version, and three cells carry logged errors: the UK utilisation (about 8%, all chargers) sits next to the US DC-only about 16% with no caveat; the UK BEV share shows "about 29.8% YTD" (R13, A14); the Germany and France utilisation cells show the EU report's "6–12 year payback" (R10, A13).</w:t>
-            </w:r>
-          </w:p>
-        </w:tc>
-        <w:tc>
-          <w:tcPr>
-            <w:tcW w:type="dxa" w:w="4333"/>
+            <w:tcW w:type="dxa" w:w="3592"/>
+          </w:tcPr>
+          <w:p>
+            <w:r>
+              <w:rPr>
+                <w:sz w:val="17"/>
+              </w:rPr>
+              <w:t>The 2023 dataset baseline next to the latest research for all four markets, with charger definitions labelled. It is the agent's first version, and four cells carry errors: the UK utilisation cell (about 8%, all chargers) sits next to the US DC-only about 16% with no caveat (the R2 scope problem carried into the table); the UK BEV share shows "about 29.8% YTD" (R13, A14); the Germany and France utilisation cells show the EU report's "6–12 year payback" (R10, A13).</w:t>
+            </w:r>
+          </w:p>
+        </w:tc>
+        <w:tc>
+          <w:tcPr>
+            <w:tcW w:type="dxa" w:w="3621"/>
           </w:tcPr>
           <w:p>
             <w:r>
@@ -4489,7 +4489,7 @@
               <w:rPr>
                 <w:sz w:val="17"/>
               </w:rPr>
-              <w:t xml:space="preserve"> fixes the UK caveat but still shows the payback figure.</w:t>
+              <w:t xml:space="preserve"> fixes the UK caveat but still shows the "29.8% YTD" share and the payback figure.</w:t>
             </w:r>
           </w:p>
         </w:tc>
@@ -4497,7 +4497,7 @@
       <w:tr>
         <w:tc>
           <w:tcPr>
-            <w:tcW w:type="dxa" w:w="130"/>
+            <w:tcW w:type="dxa" w:w="605"/>
           </w:tcPr>
           <w:p>
             <w:r>
@@ -4510,7 +4510,7 @@
         </w:tc>
         <w:tc>
           <w:tcPr>
-            <w:tcW w:type="dxa" w:w="563"/>
+            <w:tcW w:type="dxa" w:w="1542"/>
           </w:tcPr>
           <w:p>
             <w:r>
@@ -4523,7 +4523,7 @@
         </w:tc>
         <w:tc>
           <w:tcPr>
-            <w:tcW w:type="dxa" w:w="4333"/>
+            <w:tcW w:type="dxa" w:w="3592"/>
           </w:tcPr>
           <w:p>
             <w:r>
@@ -4536,7 +4536,7 @@
         </w:tc>
         <w:tc>
           <w:tcPr>
-            <w:tcW w:type="dxa" w:w="4333"/>
+            <w:tcW w:type="dxa" w:w="3621"/>
           </w:tcPr>
           <w:p>
             <w:r>
@@ -4558,7 +4558,7 @@
       <w:tr>
         <w:tc>
           <w:tcPr>
-            <w:tcW w:type="dxa" w:w="130"/>
+            <w:tcW w:type="dxa" w:w="605"/>
           </w:tcPr>
           <w:p>
             <w:r>
@@ -4571,7 +4571,7 @@
         </w:tc>
         <w:tc>
           <w:tcPr>
-            <w:tcW w:type="dxa" w:w="563"/>
+            <w:tcW w:type="dxa" w:w="1542"/>
           </w:tcPr>
           <w:p>
             <w:r>
@@ -4584,7 +4584,7 @@
         </w:tc>
         <w:tc>
           <w:tcPr>
-            <w:tcW w:type="dxa" w:w="4333"/>
+            <w:tcW w:type="dxa" w:w="3592"/>
           </w:tcPr>
           <w:p>
             <w:r>
@@ -4597,7 +4597,7 @@
         </w:tc>
         <w:tc>
           <w:tcPr>
-            <w:tcW w:type="dxa" w:w="4333"/>
+            <w:tcW w:type="dxa" w:w="3621"/>
           </w:tcPr>
           <w:p>
             <w:r>
@@ -4611,7 +4611,7 @@
               <w:rPr>
                 <w:sz w:val="17"/>
               </w:rPr>
-              <w:t xml:space="preserve"> US build-out is slowing in 2026 to about 18–19% annualised. The last point is September 2026, although the chart title says "End-of-Year".</w:t>
+              <w:t xml:space="preserve"> US build-out is slowing in 2026 to about 18–19% annualised. The last point is September 2026, although the chart title says "End-of-Year", and its label is clipped at the chart edge as generated (76,236 on 1 Sep 2026). Its 2023→2024 segment mixes the IEA count with AFDC ports (A5); like for like the rise was about +32% (38,271 → 50,428).</w:t>
             </w:r>
           </w:p>
         </w:tc>
@@ -4641,16 +4641,16 @@
         </w:tblBorders>
       </w:tblPr>
       <w:tblGrid>
-        <w:gridCol w:w="1872"/>
-        <w:gridCol w:w="1872"/>
-        <w:gridCol w:w="1872"/>
-        <w:gridCol w:w="1872"/>
-        <w:gridCol w:w="1872"/>
+        <w:gridCol w:w="1805"/>
+        <w:gridCol w:w="2133"/>
+        <w:gridCol w:w="2353"/>
+        <w:gridCol w:w="1559"/>
+        <w:gridCol w:w="1507"/>
       </w:tblGrid>
       <w:tr>
         <w:tc>
           <w:tcPr>
-            <w:tcW w:type="dxa" w:w="833"/>
+            <w:tcW w:type="dxa" w:w="1806"/>
           </w:tcPr>
           <w:p>
             <w:r>
@@ -4664,7 +4664,7 @@
         </w:tc>
         <w:tc>
           <w:tcPr>
-            <w:tcW w:type="dxa" w:w="1482"/>
+            <w:tcW w:type="dxa" w:w="2133"/>
           </w:tcPr>
           <w:p>
             <w:r>
@@ -4678,7 +4678,7 @@
         </w:tc>
         <w:tc>
           <w:tcPr>
-            <w:tcW w:type="dxa" w:w="4901"/>
+            <w:tcW w:type="dxa" w:w="2354"/>
           </w:tcPr>
           <w:p>
             <w:r>
@@ -4692,7 +4692,7 @@
         </w:tc>
         <w:tc>
           <w:tcPr>
-            <w:tcW w:type="dxa" w:w="1274"/>
+            <w:tcW w:type="dxa" w:w="1560"/>
           </w:tcPr>
           <w:p>
             <w:r>
@@ -4706,7 +4706,7 @@
         </w:tc>
         <w:tc>
           <w:tcPr>
-            <w:tcW w:type="dxa" w:w="870"/>
+            <w:tcW w:type="dxa" w:w="1508"/>
           </w:tcPr>
           <w:p>
             <w:r>
@@ -4722,7 +4722,7 @@
       <w:tr>
         <w:tc>
           <w:tcPr>
-            <w:tcW w:type="dxa" w:w="833"/>
+            <w:tcW w:type="dxa" w:w="1806"/>
           </w:tcPr>
           <w:p>
             <w:r>
@@ -4735,7 +4735,7 @@
         </w:tc>
         <w:tc>
           <w:tcPr>
-            <w:tcW w:type="dxa" w:w="1482"/>
+            <w:tcW w:type="dxa" w:w="2133"/>
           </w:tcPr>
           <w:p>
             <w:r>
@@ -4748,7 +4748,7 @@
         </w:tc>
         <w:tc>
           <w:tcPr>
-            <w:tcW w:type="dxa" w:w="4901"/>
+            <w:tcW w:type="dxa" w:w="2354"/>
           </w:tcPr>
           <w:p>
             <w:r>
@@ -4761,7 +4761,7 @@
         </w:tc>
         <w:tc>
           <w:tcPr>
-            <w:tcW w:type="dxa" w:w="1274"/>
+            <w:tcW w:type="dxa" w:w="1560"/>
           </w:tcPr>
           <w:p>
             <w:r>
@@ -4774,7 +4774,7 @@
         </w:tc>
         <w:tc>
           <w:tcPr>
-            <w:tcW w:type="dxa" w:w="870"/>
+            <w:tcW w:type="dxa" w:w="1508"/>
           </w:tcPr>
           <w:p>
             <w:r>
@@ -4796,7 +4796,7 @@
       <w:tr>
         <w:tc>
           <w:tcPr>
-            <w:tcW w:type="dxa" w:w="833"/>
+            <w:tcW w:type="dxa" w:w="1806"/>
           </w:tcPr>
           <w:p>
             <w:r>
@@ -4809,7 +4809,7 @@
         </w:tc>
         <w:tc>
           <w:tcPr>
-            <w:tcW w:type="dxa" w:w="1482"/>
+            <w:tcW w:type="dxa" w:w="2133"/>
           </w:tcPr>
           <w:p>
             <w:r>
@@ -4822,7 +4822,7 @@
         </w:tc>
         <w:tc>
           <w:tcPr>
-            <w:tcW w:type="dxa" w:w="4901"/>
+            <w:tcW w:type="dxa" w:w="2354"/>
           </w:tcPr>
           <w:p>
             <w:r>
@@ -4835,7 +4835,7 @@
         </w:tc>
         <w:tc>
           <w:tcPr>
-            <w:tcW w:type="dxa" w:w="1274"/>
+            <w:tcW w:type="dxa" w:w="1560"/>
           </w:tcPr>
           <w:p>
             <w:r>
@@ -4848,7 +4848,7 @@
         </w:tc>
         <w:tc>
           <w:tcPr>
-            <w:tcW w:type="dxa" w:w="870"/>
+            <w:tcW w:type="dxa" w:w="1508"/>
           </w:tcPr>
           <w:p>
             <w:r>
@@ -4870,7 +4870,7 @@
       <w:tr>
         <w:tc>
           <w:tcPr>
-            <w:tcW w:type="dxa" w:w="833"/>
+            <w:tcW w:type="dxa" w:w="1806"/>
           </w:tcPr>
           <w:p>
             <w:r>
@@ -4883,7 +4883,7 @@
         </w:tc>
         <w:tc>
           <w:tcPr>
-            <w:tcW w:type="dxa" w:w="1482"/>
+            <w:tcW w:type="dxa" w:w="2133"/>
           </w:tcPr>
           <w:p>
             <w:r>
@@ -4896,7 +4896,7 @@
         </w:tc>
         <w:tc>
           <w:tcPr>
-            <w:tcW w:type="dxa" w:w="4901"/>
+            <w:tcW w:type="dxa" w:w="2354"/>
           </w:tcPr>
           <w:p>
             <w:r>
@@ -4909,7 +4909,7 @@
         </w:tc>
         <w:tc>
           <w:tcPr>
-            <w:tcW w:type="dxa" w:w="1274"/>
+            <w:tcW w:type="dxa" w:w="1560"/>
           </w:tcPr>
           <w:p>
             <w:r>
@@ -4922,7 +4922,7 @@
         </w:tc>
         <w:tc>
           <w:tcPr>
-            <w:tcW w:type="dxa" w:w="870"/>
+            <w:tcW w:type="dxa" w:w="1508"/>
           </w:tcPr>
           <w:p>
             <w:r>
@@ -4944,7 +4944,7 @@
       <w:tr>
         <w:tc>
           <w:tcPr>
-            <w:tcW w:type="dxa" w:w="833"/>
+            <w:tcW w:type="dxa" w:w="1806"/>
           </w:tcPr>
           <w:p>
             <w:r>
@@ -4957,7 +4957,7 @@
         </w:tc>
         <w:tc>
           <w:tcPr>
-            <w:tcW w:type="dxa" w:w="1482"/>
+            <w:tcW w:type="dxa" w:w="2133"/>
           </w:tcPr>
           <w:p>
             <w:r>
@@ -4970,7 +4970,7 @@
         </w:tc>
         <w:tc>
           <w:tcPr>
-            <w:tcW w:type="dxa" w:w="4901"/>
+            <w:tcW w:type="dxa" w:w="2354"/>
           </w:tcPr>
           <w:p>
             <w:r>
@@ -4983,7 +4983,7 @@
         </w:tc>
         <w:tc>
           <w:tcPr>
-            <w:tcW w:type="dxa" w:w="1274"/>
+            <w:tcW w:type="dxa" w:w="1560"/>
           </w:tcPr>
           <w:p>
             <w:r>
@@ -4996,7 +4996,7 @@
         </w:tc>
         <w:tc>
           <w:tcPr>
-            <w:tcW w:type="dxa" w:w="870"/>
+            <w:tcW w:type="dxa" w:w="1508"/>
           </w:tcPr>
           <w:p>
             <w:r>
@@ -5012,7 +5012,7 @@
       <w:tr>
         <w:tc>
           <w:tcPr>
-            <w:tcW w:type="dxa" w:w="833"/>
+            <w:tcW w:type="dxa" w:w="1806"/>
           </w:tcPr>
           <w:p>
             <w:r>
@@ -5025,20 +5025,20 @@
         </w:tc>
         <w:tc>
           <w:tcPr>
-            <w:tcW w:type="dxa" w:w="1482"/>
-          </w:tcPr>
-          <w:p>
-            <w:r>
-              <w:rPr>
-                <w:sz w:val="17"/>
-              </w:rPr>
-              <w:t>High: CMA/gov.uk, DfT, FHWA, Avere-France, IEA policy database, CEC/NYSERDA, French government</w:t>
-            </w:r>
-          </w:p>
-        </w:tc>
-        <w:tc>
-          <w:tcPr>
-            <w:tcW w:type="dxa" w:w="4901"/>
+            <w:tcW w:type="dxa" w:w="2133"/>
+          </w:tcPr>
+          <w:p>
+            <w:r>
+              <w:rPr>
+                <w:sz w:val="17"/>
+              </w:rPr>
+              <w:t>High for the dated catalysts (CMA/gov.uk, DfT, FHWA, Avere-France, IEA policy database, CEC/NYSERDA, French government); Medium for the site-owner moves (Zapmap, The Fast Charge, electrive) and the ADVENIR 2030 amount (AEF info, les-energies-renouvelables.eu)</w:t>
+            </w:r>
+          </w:p>
+        </w:tc>
+        <w:tc>
+          <w:tcPr>
+            <w:tcW w:type="dxa" w:w="2354"/>
           </w:tcPr>
           <w:p>
             <w:r>
@@ -5051,7 +5051,7 @@
         </w:tc>
         <w:tc>
           <w:tcPr>
-            <w:tcW w:type="dxa" w:w="1274"/>
+            <w:tcW w:type="dxa" w:w="1560"/>
           </w:tcPr>
           <w:p>
             <w:r>
@@ -5064,7 +5064,7 @@
         </w:tc>
         <w:tc>
           <w:tcPr>
-            <w:tcW w:type="dxa" w:w="870"/>
+            <w:tcW w:type="dxa" w:w="1508"/>
           </w:tcPr>
           <w:p>
             <w:r>
@@ -5160,7 +5160,7 @@
         <w:t xml:space="preserve">• </w:t>
       </w:r>
       <w:r>
-        <w:t>Some remain visible in the embedded images V7, V8 and V9, whose rows in Section 5 say so.</w:t>
+        <w:t>Some remain visible in the embedded images V5, V7, V8, V9 and V10, whose rows in Section 5 say so.</w:t>
       </w:r>
     </w:p>
     <w:p>
@@ -5306,7 +5306,7 @@
         <w:t xml:space="preserve">• </w:t>
       </w:r>
       <w:r>
-        <w:t>US port growth of "30–35% a year" (2024→25) vs about 18–19% annualised from end-2025 to 3 September 2026, in the same report.</w:t>
+        <w:t>US port growth of "30–35% a year" (2024→25) vs about 18–19% annualised from 1 January to 1 September 2026, in the same report.</w:t>
       </w:r>
     </w:p>
     <w:p>
@@ -5466,7 +5466,7 @@
         <w:t xml:space="preserve">• </w:t>
       </w:r>
       <w:r>
-        <w:t>The UK's pre-reform 5.5-year connection gap (July 2024, all customer types, mostly generation and storage) is taken as indicative for charging sites; the reform's effect on demand connections is unknown.</w:t>
+        <w:t>The UK's pre-reform 5.5-year connection gap (July 2024, connecting customers in a queue dominated by generation and storage) is taken as indicative for charging sites; the reform's effect on demand connections is unknown.</w:t>
       </w:r>
     </w:p>
     <w:p>
@@ -5524,7 +5524,7 @@
         <w:t xml:space="preserve">• </w:t>
       </w:r>
       <w:r>
-        <w:t>Approach Moto, Roadchef and Extra for motorway site access as exclusivity ends after November 2026, expecting competition from their own networks.</w:t>
+        <w:t>Approach Moto, Roadchef and Extra for motorway site access as exclusivity ends after November 2026, expecting competition from their own networks and existing partners.</w:t>
       </w:r>
     </w:p>
     <w:p>
@@ -5630,15 +5630,15 @@
         </w:tblBorders>
       </w:tblPr>
       <w:tblGrid>
-        <w:gridCol w:w="2340"/>
-        <w:gridCol w:w="2340"/>
-        <w:gridCol w:w="2340"/>
-        <w:gridCol w:w="2340"/>
+        <w:gridCol w:w="3088"/>
+        <w:gridCol w:w="1499"/>
+        <w:gridCol w:w="1452"/>
+        <w:gridCol w:w="3320"/>
       </w:tblGrid>
       <w:tr>
         <w:tc>
           <w:tcPr>
-            <w:tcW w:type="dxa" w:w="3915"/>
+            <w:tcW w:type="dxa" w:w="3088"/>
           </w:tcPr>
           <w:p>
             <w:r>
@@ -5652,7 +5652,7 @@
         </w:tc>
         <w:tc>
           <w:tcPr>
-            <w:tcW w:type="dxa" w:w="585"/>
+            <w:tcW w:type="dxa" w:w="1499"/>
           </w:tcPr>
           <w:p>
             <w:r>
@@ -5666,7 +5666,7 @@
         </w:tc>
         <w:tc>
           <w:tcPr>
-            <w:tcW w:type="dxa" w:w="540"/>
+            <w:tcW w:type="dxa" w:w="1452"/>
           </w:tcPr>
           <w:p>
             <w:r>
@@ -5680,7 +5680,7 @@
         </w:tc>
         <w:tc>
           <w:tcPr>
-            <w:tcW w:type="dxa" w:w="4320"/>
+            <w:tcW w:type="dxa" w:w="3320"/>
           </w:tcPr>
           <w:p>
             <w:r>
@@ -5696,7 +5696,7 @@
       <w:tr>
         <w:tc>
           <w:tcPr>
-            <w:tcW w:type="dxa" w:w="3915"/>
+            <w:tcW w:type="dxa" w:w="3088"/>
           </w:tcPr>
           <w:p>
             <w:r>
@@ -5709,7 +5709,7 @@
         </w:tc>
         <w:tc>
           <w:tcPr>
-            <w:tcW w:type="dxa" w:w="585"/>
+            <w:tcW w:type="dxa" w:w="1499"/>
           </w:tcPr>
           <w:p>
             <w:r>
@@ -5722,7 +5722,7 @@
         </w:tc>
         <w:tc>
           <w:tcPr>
-            <w:tcW w:type="dxa" w:w="540"/>
+            <w:tcW w:type="dxa" w:w="1452"/>
           </w:tcPr>
           <w:p>
             <w:r>
@@ -5735,7 +5735,7 @@
         </w:tc>
         <w:tc>
           <w:tcPr>
-            <w:tcW w:type="dxa" w:w="4320"/>
+            <w:tcW w:type="dxa" w:w="3320"/>
           </w:tcPr>
           <w:p>
             <w:r>
@@ -5750,7 +5750,7 @@
       <w:tr>
         <w:tc>
           <w:tcPr>
-            <w:tcW w:type="dxa" w:w="3915"/>
+            <w:tcW w:type="dxa" w:w="3088"/>
           </w:tcPr>
           <w:p>
             <w:r>
@@ -5763,7 +5763,7 @@
         </w:tc>
         <w:tc>
           <w:tcPr>
-            <w:tcW w:type="dxa" w:w="585"/>
+            <w:tcW w:type="dxa" w:w="1499"/>
           </w:tcPr>
           <w:p>
             <w:r>
@@ -5776,7 +5776,7 @@
         </w:tc>
         <w:tc>
           <w:tcPr>
-            <w:tcW w:type="dxa" w:w="540"/>
+            <w:tcW w:type="dxa" w:w="1452"/>
           </w:tcPr>
           <w:p>
             <w:r>
@@ -5789,7 +5789,7 @@
         </w:tc>
         <w:tc>
           <w:tcPr>
-            <w:tcW w:type="dxa" w:w="4320"/>
+            <w:tcW w:type="dxa" w:w="3320"/>
           </w:tcPr>
           <w:p>
             <w:r>
@@ -5804,7 +5804,7 @@
       <w:tr>
         <w:tc>
           <w:tcPr>
-            <w:tcW w:type="dxa" w:w="3915"/>
+            <w:tcW w:type="dxa" w:w="3088"/>
           </w:tcPr>
           <w:p>
             <w:r>
@@ -5817,7 +5817,7 @@
         </w:tc>
         <w:tc>
           <w:tcPr>
-            <w:tcW w:type="dxa" w:w="585"/>
+            <w:tcW w:type="dxa" w:w="1499"/>
           </w:tcPr>
           <w:p>
             <w:r>
@@ -5830,7 +5830,7 @@
         </w:tc>
         <w:tc>
           <w:tcPr>
-            <w:tcW w:type="dxa" w:w="540"/>
+            <w:tcW w:type="dxa" w:w="1452"/>
           </w:tcPr>
           <w:p>
             <w:r>
@@ -5843,14 +5843,14 @@
         </w:tc>
         <w:tc>
           <w:tcPr>
-            <w:tcW w:type="dxa" w:w="4320"/>
-          </w:tcPr>
-          <w:p>
-            <w:r>
-              <w:rPr>
-                <w:sz w:val="17"/>
-              </w:rPr>
-              <w:t>Low–Medium (the 2022 commitments need a recheck, and the owners are building their own networks)</w:t>
+            <w:tcW w:type="dxa" w:w="3320"/>
+          </w:tcPr>
+          <w:p>
+            <w:r>
+              <w:rPr>
+                <w:sz w:val="17"/>
+              </w:rPr>
+              <w:t>Low–Medium (the 2022 commitments need a recheck, and the owners are building their own networks or expanding with partners)</w:t>
             </w:r>
           </w:p>
         </w:tc>
@@ -5858,7 +5858,7 @@
       <w:tr>
         <w:tc>
           <w:tcPr>
-            <w:tcW w:type="dxa" w:w="3915"/>
+            <w:tcW w:type="dxa" w:w="3088"/>
           </w:tcPr>
           <w:p>
             <w:r>
@@ -5871,7 +5871,7 @@
         </w:tc>
         <w:tc>
           <w:tcPr>
-            <w:tcW w:type="dxa" w:w="585"/>
+            <w:tcW w:type="dxa" w:w="1499"/>
           </w:tcPr>
           <w:p>
             <w:r>
@@ -5884,7 +5884,7 @@
         </w:tc>
         <w:tc>
           <w:tcPr>
-            <w:tcW w:type="dxa" w:w="540"/>
+            <w:tcW w:type="dxa" w:w="1452"/>
           </w:tcPr>
           <w:p>
             <w:r>
@@ -5897,7 +5897,7 @@
         </w:tc>
         <w:tc>
           <w:tcPr>
-            <w:tcW w:type="dxa" w:w="4320"/>
+            <w:tcW w:type="dxa" w:w="3320"/>
           </w:tcPr>
           <w:p>
             <w:r>
@@ -5912,7 +5912,7 @@
       <w:tr>
         <w:tc>
           <w:tcPr>
-            <w:tcW w:type="dxa" w:w="3915"/>
+            <w:tcW w:type="dxa" w:w="3088"/>
           </w:tcPr>
           <w:p>
             <w:r>
@@ -5925,7 +5925,7 @@
         </w:tc>
         <w:tc>
           <w:tcPr>
-            <w:tcW w:type="dxa" w:w="585"/>
+            <w:tcW w:type="dxa" w:w="1499"/>
           </w:tcPr>
           <w:p>
             <w:r>
@@ -5938,7 +5938,7 @@
         </w:tc>
         <w:tc>
           <w:tcPr>
-            <w:tcW w:type="dxa" w:w="540"/>
+            <w:tcW w:type="dxa" w:w="1452"/>
           </w:tcPr>
           <w:p>
             <w:r>
@@ -5951,7 +5951,7 @@
         </w:tc>
         <w:tc>
           <w:tcPr>
-            <w:tcW w:type="dxa" w:w="4320"/>
+            <w:tcW w:type="dxa" w:w="3320"/>
           </w:tcPr>
           <w:p>
             <w:r>
@@ -5966,7 +5966,7 @@
       <w:tr>
         <w:tc>
           <w:tcPr>
-            <w:tcW w:type="dxa" w:w="3915"/>
+            <w:tcW w:type="dxa" w:w="3088"/>
           </w:tcPr>
           <w:p>
             <w:r>
@@ -5979,7 +5979,7 @@
         </w:tc>
         <w:tc>
           <w:tcPr>
-            <w:tcW w:type="dxa" w:w="585"/>
+            <w:tcW w:type="dxa" w:w="1499"/>
           </w:tcPr>
           <w:p>
             <w:r>
@@ -5992,7 +5992,7 @@
         </w:tc>
         <w:tc>
           <w:tcPr>
-            <w:tcW w:type="dxa" w:w="540"/>
+            <w:tcW w:type="dxa" w:w="1452"/>
           </w:tcPr>
           <w:p>
             <w:r>
@@ -6005,7 +6005,7 @@
         </w:tc>
         <w:tc>
           <w:tcPr>
-            <w:tcW w:type="dxa" w:w="4320"/>
+            <w:tcW w:type="dxa" w:w="3320"/>
           </w:tcPr>
           <w:p>
             <w:r>
@@ -6158,7 +6158,7 @@
         <w:t xml:space="preserve">3. </w:t>
       </w:r>
       <w:r>
-        <w:t>Demand is driven largely by policy: UK BEV sales run below the ZEV mandate targets (52% for 2028) while manufacturers comply through flexibilities, France is accelerating (BEV registrations up 62.9% in H1 2026), and US BEV share fell below 6% after the federal credit ended.</w:t>
+        <w:t>Demand is driven largely by policy: UK BEV sales run below the ZEV mandate targets (52% for 2028) and manufacturers met the 2024 target through flexibilities, France is accelerating (BEV registrations up 62.9% in H1 2026), and US BEV share fell below 6% after the federal credit ended.</w:t>
       </w:r>
     </w:p>
     <w:p>
@@ -6180,7 +6180,7 @@
         <w:t xml:space="preserve">5. </w:t>
       </w:r>
       <w:r>
-        <w:t>Overall confidence is Medium: the supply, demand and policy findings rest on official statistics, but utilisation and competition rest on industry trackers, the service-area operators are building their own networks, and 32 errors in AI-generated research and agent outputs were found and kept out of the analysis.</w:t>
+        <w:t>Overall confidence is Medium: the supply, demand and policy findings rest on official statistics, but utilisation and competition rest on industry trackers, the service-area operators are building their own networks or expanding with existing partners, and 32 errors in AI-generated research and agent outputs were found and kept out of the analysis.</w:t>
       </w:r>
     </w:p>
     <w:p>
@@ -6285,13 +6285,13 @@
         </w:tblBorders>
       </w:tblPr>
       <w:tblGrid>
-        <w:gridCol w:w="4680"/>
-        <w:gridCol w:w="4680"/>
+        <w:gridCol w:w="4337"/>
+        <w:gridCol w:w="5022"/>
       </w:tblGrid>
       <w:tr>
         <w:tc>
           <w:tcPr>
-            <w:tcW w:type="dxa" w:w="4137"/>
+            <w:tcW w:type="dxa" w:w="4337"/>
           </w:tcPr>
           <w:p>
             <w:r>
@@ -6305,7 +6305,7 @@
         </w:tc>
         <w:tc>
           <w:tcPr>
-            <w:tcW w:type="dxa" w:w="5223"/>
+            <w:tcW w:type="dxa" w:w="5023"/>
           </w:tcPr>
           <w:p>
             <w:r>
@@ -6321,7 +6321,7 @@
       <w:tr>
         <w:tc>
           <w:tcPr>
-            <w:tcW w:type="dxa" w:w="4137"/>
+            <w:tcW w:type="dxa" w:w="4337"/>
           </w:tcPr>
           <w:p>
             <w:r>
@@ -6334,7 +6334,7 @@
         </w:tc>
         <w:tc>
           <w:tcPr>
-            <w:tcW w:type="dxa" w:w="5223"/>
+            <w:tcW w:type="dxa" w:w="5023"/>
           </w:tcPr>
           <w:p>
             <w:r>
@@ -6350,7 +6350,7 @@
       <w:tr>
         <w:tc>
           <w:tcPr>
-            <w:tcW w:type="dxa" w:w="4137"/>
+            <w:tcW w:type="dxa" w:w="4337"/>
           </w:tcPr>
           <w:p>
             <w:r>
@@ -6363,7 +6363,7 @@
         </w:tc>
         <w:tc>
           <w:tcPr>
-            <w:tcW w:type="dxa" w:w="5223"/>
+            <w:tcW w:type="dxa" w:w="5023"/>
           </w:tcPr>
           <w:p>
             <w:r>
@@ -6379,7 +6379,7 @@
       <w:tr>
         <w:tc>
           <w:tcPr>
-            <w:tcW w:type="dxa" w:w="4137"/>
+            <w:tcW w:type="dxa" w:w="4337"/>
           </w:tcPr>
           <w:p>
             <w:r>
@@ -6392,7 +6392,7 @@
         </w:tc>
         <w:tc>
           <w:tcPr>
-            <w:tcW w:type="dxa" w:w="5223"/>
+            <w:tcW w:type="dxa" w:w="5023"/>
           </w:tcPr>
           <w:p>
             <w:r>
@@ -6408,7 +6408,7 @@
       <w:tr>
         <w:tc>
           <w:tcPr>
-            <w:tcW w:type="dxa" w:w="4137"/>
+            <w:tcW w:type="dxa" w:w="4337"/>
           </w:tcPr>
           <w:p>
             <w:r>
@@ -6421,7 +6421,7 @@
         </w:tc>
         <w:tc>
           <w:tcPr>
-            <w:tcW w:type="dxa" w:w="5223"/>
+            <w:tcW w:type="dxa" w:w="5023"/>
           </w:tcPr>
           <w:p>
             <w:r>
@@ -6437,7 +6437,7 @@
       <w:tr>
         <w:tc>
           <w:tcPr>
-            <w:tcW w:type="dxa" w:w="4137"/>
+            <w:tcW w:type="dxa" w:w="4337"/>
           </w:tcPr>
           <w:p>
             <w:r>
@@ -6450,7 +6450,7 @@
         </w:tc>
         <w:tc>
           <w:tcPr>
-            <w:tcW w:type="dxa" w:w="5223"/>
+            <w:tcW w:type="dxa" w:w="5023"/>
           </w:tcPr>
           <w:p>
             <w:r>
@@ -6472,7 +6472,7 @@
       <w:tr>
         <w:tc>
           <w:tcPr>
-            <w:tcW w:type="dxa" w:w="4137"/>
+            <w:tcW w:type="dxa" w:w="4337"/>
           </w:tcPr>
           <w:p>
             <w:r>
@@ -6485,7 +6485,7 @@
         </w:tc>
         <w:tc>
           <w:tcPr>
-            <w:tcW w:type="dxa" w:w="5223"/>
+            <w:tcW w:type="dxa" w:w="5023"/>
           </w:tcPr>
           <w:p>
             <w:r>
@@ -6507,7 +6507,7 @@
       <w:tr>
         <w:tc>
           <w:tcPr>
-            <w:tcW w:type="dxa" w:w="4137"/>
+            <w:tcW w:type="dxa" w:w="4337"/>
           </w:tcPr>
           <w:p>
             <w:r>
@@ -6520,7 +6520,7 @@
         </w:tc>
         <w:tc>
           <w:tcPr>
-            <w:tcW w:type="dxa" w:w="5223"/>
+            <w:tcW w:type="dxa" w:w="5023"/>
           </w:tcPr>
           <w:p>
             <w:r>
@@ -6555,7 +6555,7 @@
       <w:tr>
         <w:tc>
           <w:tcPr>
-            <w:tcW w:type="dxa" w:w="4137"/>
+            <w:tcW w:type="dxa" w:w="4337"/>
           </w:tcPr>
           <w:p>
             <w:r>
@@ -6568,7 +6568,7 @@
         </w:tc>
         <w:tc>
           <w:tcPr>
-            <w:tcW w:type="dxa" w:w="5223"/>
+            <w:tcW w:type="dxa" w:w="5023"/>
           </w:tcPr>
           <w:p>
             <w:r>
@@ -6584,7 +6584,7 @@
       <w:tr>
         <w:tc>
           <w:tcPr>
-            <w:tcW w:type="dxa" w:w="4137"/>
+            <w:tcW w:type="dxa" w:w="4337"/>
           </w:tcPr>
           <w:p>
             <w:r>
@@ -6597,7 +6597,7 @@
         </w:tc>
         <w:tc>
           <w:tcPr>
-            <w:tcW w:type="dxa" w:w="5223"/>
+            <w:tcW w:type="dxa" w:w="5023"/>
           </w:tcPr>
           <w:p>
             <w:r>
@@ -6751,7 +6751,7 @@
         <w:t xml:space="preserve">• </w:t>
       </w:r>
       <w:r>
-        <w:t>Moto Charge launch (Zapmap, Dec 2025); Roadchef (The Fast Charge); Extra with Ionity (electrive, Aug 2025).</w:t>
+        <w:t>Moto Charge launch (Zapmap, Dec 2025); Roadchef M6 hub (The Fast Charge, 6 Aug 2026); Extra with Ionity (electrive, Aug 2025).</w:t>
       </w:r>
     </w:p>
     <w:p>
@@ -6864,7 +6864,7 @@
         <w:t xml:space="preserve">• </w:t>
       </w:r>
       <w:r>
-        <w:t>CEC Fast Charge California; NYSERDA corridor round (Dec 2024).</w:t>
+        <w:t>CEC Fast Charge California (5 Aug 2025) and FY2026–27 ZEV infrastructure plan (18 Aug 2026); NYSERDA corridor round (Dec 2024).</w:t>
       </w:r>
     </w:p>
     <w:p>
@@ -6981,15 +6981,15 @@
         </w:tblBorders>
       </w:tblPr>
       <w:tblGrid>
-        <w:gridCol w:w="2340"/>
-        <w:gridCol w:w="2340"/>
-        <w:gridCol w:w="2340"/>
-        <w:gridCol w:w="2340"/>
+        <w:gridCol w:w="512"/>
+        <w:gridCol w:w="2579"/>
+        <w:gridCol w:w="2406"/>
+        <w:gridCol w:w="3861"/>
       </w:tblGrid>
       <w:tr>
         <w:tc>
           <w:tcPr>
-            <w:tcW w:type="dxa" w:w="390"/>
+            <w:tcW w:type="dxa" w:w="512"/>
           </w:tcPr>
           <w:p>
             <w:r>
@@ -7003,7 +7003,7 @@
         </w:tc>
         <w:tc>
           <w:tcPr>
-            <w:tcW w:type="dxa" w:w="2795"/>
+            <w:tcW w:type="dxa" w:w="2580"/>
           </w:tcPr>
           <w:p>
             <w:r>
@@ -7017,7 +7017,7 @@
         </w:tc>
         <w:tc>
           <w:tcPr>
-            <w:tcW w:type="dxa" w:w="2015"/>
+            <w:tcW w:type="dxa" w:w="2407"/>
           </w:tcPr>
           <w:p>
             <w:r>
@@ -7031,7 +7031,7 @@
         </w:tc>
         <w:tc>
           <w:tcPr>
-            <w:tcW w:type="dxa" w:w="4160"/>
+            <w:tcW w:type="dxa" w:w="3861"/>
           </w:tcPr>
           <w:p>
             <w:r>
@@ -7047,7 +7047,7 @@
       <w:tr>
         <w:tc>
           <w:tcPr>
-            <w:tcW w:type="dxa" w:w="390"/>
+            <w:tcW w:type="dxa" w:w="512"/>
           </w:tcPr>
           <w:p>
             <w:r>
@@ -7060,7 +7060,7 @@
         </w:tc>
         <w:tc>
           <w:tcPr>
-            <w:tcW w:type="dxa" w:w="2795"/>
+            <w:tcW w:type="dxa" w:w="2580"/>
           </w:tcPr>
           <w:p>
             <w:r>
@@ -7073,7 +7073,7 @@
         </w:tc>
         <w:tc>
           <w:tcPr>
-            <w:tcW w:type="dxa" w:w="2015"/>
+            <w:tcW w:type="dxa" w:w="2407"/>
           </w:tcPr>
           <w:p>
             <w:r>
@@ -7086,7 +7086,7 @@
         </w:tc>
         <w:tc>
           <w:tcPr>
-            <w:tcW w:type="dxa" w:w="4160"/>
+            <w:tcW w:type="dxa" w:w="3861"/>
           </w:tcPr>
           <w:p>
             <w:r>
@@ -7101,7 +7101,7 @@
       <w:tr>
         <w:tc>
           <w:tcPr>
-            <w:tcW w:type="dxa" w:w="390"/>
+            <w:tcW w:type="dxa" w:w="512"/>
           </w:tcPr>
           <w:p>
             <w:r>
@@ -7114,7 +7114,7 @@
         </w:tc>
         <w:tc>
           <w:tcPr>
-            <w:tcW w:type="dxa" w:w="2795"/>
+            <w:tcW w:type="dxa" w:w="2580"/>
           </w:tcPr>
           <w:p>
             <w:r>
@@ -7127,7 +7127,7 @@
         </w:tc>
         <w:tc>
           <w:tcPr>
-            <w:tcW w:type="dxa" w:w="2015"/>
+            <w:tcW w:type="dxa" w:w="2407"/>
           </w:tcPr>
           <w:p>
             <w:r>
@@ -7140,7 +7140,7 @@
         </w:tc>
         <w:tc>
           <w:tcPr>
-            <w:tcW w:type="dxa" w:w="4160"/>
+            <w:tcW w:type="dxa" w:w="3861"/>
           </w:tcPr>
           <w:p>
             <w:r>
@@ -7155,7 +7155,7 @@
       <w:tr>
         <w:tc>
           <w:tcPr>
-            <w:tcW w:type="dxa" w:w="390"/>
+            <w:tcW w:type="dxa" w:w="512"/>
           </w:tcPr>
           <w:p>
             <w:r>
@@ -7168,7 +7168,7 @@
         </w:tc>
         <w:tc>
           <w:tcPr>
-            <w:tcW w:type="dxa" w:w="2795"/>
+            <w:tcW w:type="dxa" w:w="2580"/>
           </w:tcPr>
           <w:p>
             <w:r>
@@ -7181,7 +7181,7 @@
         </w:tc>
         <w:tc>
           <w:tcPr>
-            <w:tcW w:type="dxa" w:w="2015"/>
+            <w:tcW w:type="dxa" w:w="2407"/>
           </w:tcPr>
           <w:p>
             <w:r>
@@ -7194,7 +7194,7 @@
         </w:tc>
         <w:tc>
           <w:tcPr>
-            <w:tcW w:type="dxa" w:w="4160"/>
+            <w:tcW w:type="dxa" w:w="3861"/>
           </w:tcPr>
           <w:p>
             <w:r>
@@ -7209,7 +7209,7 @@
       <w:tr>
         <w:tc>
           <w:tcPr>
-            <w:tcW w:type="dxa" w:w="390"/>
+            <w:tcW w:type="dxa" w:w="512"/>
           </w:tcPr>
           <w:p>
             <w:r>
@@ -7222,7 +7222,7 @@
         </w:tc>
         <w:tc>
           <w:tcPr>
-            <w:tcW w:type="dxa" w:w="2795"/>
+            <w:tcW w:type="dxa" w:w="2580"/>
           </w:tcPr>
           <w:p>
             <w:r>
@@ -7235,7 +7235,7 @@
         </w:tc>
         <w:tc>
           <w:tcPr>
-            <w:tcW w:type="dxa" w:w="2015"/>
+            <w:tcW w:type="dxa" w:w="2407"/>
           </w:tcPr>
           <w:p>
             <w:r>
@@ -7248,7 +7248,7 @@
         </w:tc>
         <w:tc>
           <w:tcPr>
-            <w:tcW w:type="dxa" w:w="4160"/>
+            <w:tcW w:type="dxa" w:w="3861"/>
           </w:tcPr>
           <w:p>
             <w:r>
@@ -7263,7 +7263,7 @@
       <w:tr>
         <w:tc>
           <w:tcPr>
-            <w:tcW w:type="dxa" w:w="390"/>
+            <w:tcW w:type="dxa" w:w="512"/>
           </w:tcPr>
           <w:p>
             <w:r>
@@ -7276,7 +7276,7 @@
         </w:tc>
         <w:tc>
           <w:tcPr>
-            <w:tcW w:type="dxa" w:w="2795"/>
+            <w:tcW w:type="dxa" w:w="2580"/>
           </w:tcPr>
           <w:p>
             <w:r>
@@ -7289,7 +7289,7 @@
         </w:tc>
         <w:tc>
           <w:tcPr>
-            <w:tcW w:type="dxa" w:w="2015"/>
+            <w:tcW w:type="dxa" w:w="2407"/>
           </w:tcPr>
           <w:p>
             <w:r>
@@ -7302,7 +7302,7 @@
         </w:tc>
         <w:tc>
           <w:tcPr>
-            <w:tcW w:type="dxa" w:w="4160"/>
+            <w:tcW w:type="dxa" w:w="3861"/>
           </w:tcPr>
           <w:p>
             <w:r>
@@ -7317,7 +7317,7 @@
       <w:tr>
         <w:tc>
           <w:tcPr>
-            <w:tcW w:type="dxa" w:w="390"/>
+            <w:tcW w:type="dxa" w:w="512"/>
           </w:tcPr>
           <w:p>
             <w:r>
@@ -7330,7 +7330,7 @@
         </w:tc>
         <w:tc>
           <w:tcPr>
-            <w:tcW w:type="dxa" w:w="2795"/>
+            <w:tcW w:type="dxa" w:w="2580"/>
           </w:tcPr>
           <w:p>
             <w:r>
@@ -7343,7 +7343,7 @@
         </w:tc>
         <w:tc>
           <w:tcPr>
-            <w:tcW w:type="dxa" w:w="2015"/>
+            <w:tcW w:type="dxa" w:w="2407"/>
           </w:tcPr>
           <w:p>
             <w:r>
@@ -7356,7 +7356,7 @@
         </w:tc>
         <w:tc>
           <w:tcPr>
-            <w:tcW w:type="dxa" w:w="4160"/>
+            <w:tcW w:type="dxa" w:w="3861"/>
           </w:tcPr>
           <w:p>
             <w:r>
@@ -7371,7 +7371,7 @@
       <w:tr>
         <w:tc>
           <w:tcPr>
-            <w:tcW w:type="dxa" w:w="390"/>
+            <w:tcW w:type="dxa" w:w="512"/>
           </w:tcPr>
           <w:p>
             <w:r>
@@ -7384,7 +7384,7 @@
         </w:tc>
         <w:tc>
           <w:tcPr>
-            <w:tcW w:type="dxa" w:w="2795"/>
+            <w:tcW w:type="dxa" w:w="2580"/>
           </w:tcPr>
           <w:p>
             <w:r>
@@ -7397,7 +7397,7 @@
         </w:tc>
         <w:tc>
           <w:tcPr>
-            <w:tcW w:type="dxa" w:w="2015"/>
+            <w:tcW w:type="dxa" w:w="2407"/>
           </w:tcPr>
           <w:p>
             <w:r>
@@ -7410,7 +7410,7 @@
         </w:tc>
         <w:tc>
           <w:tcPr>
-            <w:tcW w:type="dxa" w:w="4160"/>
+            <w:tcW w:type="dxa" w:w="3861"/>
           </w:tcPr>
           <w:p>
             <w:r>
@@ -7425,7 +7425,7 @@
       <w:tr>
         <w:tc>
           <w:tcPr>
-            <w:tcW w:type="dxa" w:w="390"/>
+            <w:tcW w:type="dxa" w:w="512"/>
           </w:tcPr>
           <w:p>
             <w:r>
@@ -7438,7 +7438,7 @@
         </w:tc>
         <w:tc>
           <w:tcPr>
-            <w:tcW w:type="dxa" w:w="2795"/>
+            <w:tcW w:type="dxa" w:w="2580"/>
           </w:tcPr>
           <w:p>
             <w:r>
@@ -7451,7 +7451,7 @@
         </w:tc>
         <w:tc>
           <w:tcPr>
-            <w:tcW w:type="dxa" w:w="2015"/>
+            <w:tcW w:type="dxa" w:w="2407"/>
           </w:tcPr>
           <w:p>
             <w:r>
@@ -7464,14 +7464,14 @@
         </w:tc>
         <w:tc>
           <w:tcPr>
-            <w:tcW w:type="dxa" w:w="4160"/>
-          </w:tcPr>
-          <w:p>
-            <w:r>
-              <w:rPr>
-                <w:sz w:val="17"/>
-              </w:rPr>
-              <w:t>Avere-France now says the programme runs to 2030</w:t>
+            <w:tcW w:type="dxa" w:w="3861"/>
+          </w:tcPr>
+          <w:p>
+            <w:r>
+              <w:rPr>
+                <w:sz w:val="17"/>
+              </w:rPr>
+              <w:t>The government's electrification plan (23 Apr 2026) gave ADVENIR visibility to 2030, and on 7 Jul 2026 it announced about €400 M more; Avere-France's own ADVENIR page still shows end-2027</w:t>
             </w:r>
           </w:p>
         </w:tc>
@@ -7479,7 +7479,7 @@
       <w:tr>
         <w:tc>
           <w:tcPr>
-            <w:tcW w:type="dxa" w:w="390"/>
+            <w:tcW w:type="dxa" w:w="512"/>
           </w:tcPr>
           <w:p>
             <w:r>
@@ -7492,7 +7492,7 @@
         </w:tc>
         <w:tc>
           <w:tcPr>
-            <w:tcW w:type="dxa" w:w="2795"/>
+            <w:tcW w:type="dxa" w:w="2580"/>
           </w:tcPr>
           <w:p>
             <w:r>
@@ -7505,7 +7505,7 @@
         </w:tc>
         <w:tc>
           <w:tcPr>
-            <w:tcW w:type="dxa" w:w="2015"/>
+            <w:tcW w:type="dxa" w:w="2407"/>
           </w:tcPr>
           <w:p>
             <w:r>
@@ -7518,7 +7518,7 @@
         </w:tc>
         <w:tc>
           <w:tcPr>
-            <w:tcW w:type="dxa" w:w="4160"/>
+            <w:tcW w:type="dxa" w:w="3861"/>
           </w:tcPr>
           <w:p>
             <w:r>
@@ -7533,7 +7533,7 @@
       <w:tr>
         <w:tc>
           <w:tcPr>
-            <w:tcW w:type="dxa" w:w="390"/>
+            <w:tcW w:type="dxa" w:w="512"/>
           </w:tcPr>
           <w:p>
             <w:r>
@@ -7546,7 +7546,7 @@
         </w:tc>
         <w:tc>
           <w:tcPr>
-            <w:tcW w:type="dxa" w:w="2795"/>
+            <w:tcW w:type="dxa" w:w="2580"/>
           </w:tcPr>
           <w:p>
             <w:r>
@@ -7559,7 +7559,7 @@
         </w:tc>
         <w:tc>
           <w:tcPr>
-            <w:tcW w:type="dxa" w:w="2015"/>
+            <w:tcW w:type="dxa" w:w="2407"/>
           </w:tcPr>
           <w:p>
             <w:r>
@@ -7572,7 +7572,7 @@
         </w:tc>
         <w:tc>
           <w:tcPr>
-            <w:tcW w:type="dxa" w:w="4160"/>
+            <w:tcW w:type="dxa" w:w="3861"/>
           </w:tcPr>
           <w:p>
             <w:r>
@@ -7596,7 +7596,7 @@
     </w:p>
     <w:p>
       <w:r>
-        <w:t>None of these errors is used in this brief's analysis. The embedded images V7, V8 and V9 still show some of them as produced, as their rows in Section 5 note.</w:t>
+        <w:t>None of these errors is used in this brief's analysis. The embedded images V5, V7, V8, V9 and V10 still show some of them as produced, as their rows in Section 5 note.</w:t>
       </w:r>
     </w:p>
     <w:tbl>
@@ -7614,15 +7614,15 @@
         </w:tblBorders>
       </w:tblPr>
       <w:tblGrid>
-        <w:gridCol w:w="2340"/>
-        <w:gridCol w:w="2340"/>
-        <w:gridCol w:w="2340"/>
-        <w:gridCol w:w="2340"/>
+        <w:gridCol w:w="617"/>
+        <w:gridCol w:w="2848"/>
+        <w:gridCol w:w="3068"/>
+        <w:gridCol w:w="2825"/>
       </w:tblGrid>
       <w:tr>
         <w:tc>
           <w:tcPr>
-            <w:tcW w:type="dxa" w:w="271"/>
+            <w:tcW w:type="dxa" w:w="618"/>
           </w:tcPr>
           <w:p>
             <w:r>
@@ -7636,7 +7636,7 @@
         </w:tc>
         <w:tc>
           <w:tcPr>
-            <w:tcW w:type="dxa" w:w="2707"/>
+            <w:tcW w:type="dxa" w:w="2848"/>
           </w:tcPr>
           <w:p>
             <w:r>
@@ -7650,7 +7650,7 @@
         </w:tc>
         <w:tc>
           <w:tcPr>
-            <w:tcW w:type="dxa" w:w="3654"/>
+            <w:tcW w:type="dxa" w:w="3068"/>
           </w:tcPr>
           <w:p>
             <w:r>
@@ -7664,7 +7664,7 @@
         </w:tc>
         <w:tc>
           <w:tcPr>
-            <w:tcW w:type="dxa" w:w="2729"/>
+            <w:tcW w:type="dxa" w:w="2826"/>
           </w:tcPr>
           <w:p>
             <w:r>
@@ -7680,7 +7680,7 @@
       <w:tr>
         <w:tc>
           <w:tcPr>
-            <w:tcW w:type="dxa" w:w="271"/>
+            <w:tcW w:type="dxa" w:w="618"/>
           </w:tcPr>
           <w:p>
             <w:r>
@@ -7693,7 +7693,7 @@
         </w:tc>
         <w:tc>
           <w:tcPr>
-            <w:tcW w:type="dxa" w:w="2707"/>
+            <w:tcW w:type="dxa" w:w="2848"/>
           </w:tcPr>
           <w:p>
             <w:r>
@@ -7706,7 +7706,7 @@
         </w:tc>
         <w:tc>
           <w:tcPr>
-            <w:tcW w:type="dxa" w:w="3654"/>
+            <w:tcW w:type="dxa" w:w="3068"/>
           </w:tcPr>
           <w:p>
             <w:r>
@@ -7719,7 +7719,7 @@
         </w:tc>
         <w:tc>
           <w:tcPr>
-            <w:tcW w:type="dxa" w:w="2729"/>
+            <w:tcW w:type="dxa" w:w="2826"/>
           </w:tcPr>
           <w:p>
             <w:r>
@@ -7734,7 +7734,7 @@
       <w:tr>
         <w:tc>
           <w:tcPr>
-            <w:tcW w:type="dxa" w:w="271"/>
+            <w:tcW w:type="dxa" w:w="618"/>
           </w:tcPr>
           <w:p>
             <w:r>
@@ -7747,7 +7747,7 @@
         </w:tc>
         <w:tc>
           <w:tcPr>
-            <w:tcW w:type="dxa" w:w="2707"/>
+            <w:tcW w:type="dxa" w:w="2848"/>
           </w:tcPr>
           <w:p>
             <w:r>
@@ -7760,7 +7760,7 @@
         </w:tc>
         <w:tc>
           <w:tcPr>
-            <w:tcW w:type="dxa" w:w="3654"/>
+            <w:tcW w:type="dxa" w:w="3068"/>
           </w:tcPr>
           <w:p>
             <w:r>
@@ -7773,7 +7773,7 @@
         </w:tc>
         <w:tc>
           <w:tcPr>
-            <w:tcW w:type="dxa" w:w="2729"/>
+            <w:tcW w:type="dxa" w:w="2826"/>
           </w:tcPr>
           <w:p>
             <w:r>
@@ -7788,7 +7788,7 @@
       <w:tr>
         <w:tc>
           <w:tcPr>
-            <w:tcW w:type="dxa" w:w="271"/>
+            <w:tcW w:type="dxa" w:w="618"/>
           </w:tcPr>
           <w:p>
             <w:r>
@@ -7801,7 +7801,7 @@
         </w:tc>
         <w:tc>
           <w:tcPr>
-            <w:tcW w:type="dxa" w:w="2707"/>
+            <w:tcW w:type="dxa" w:w="2848"/>
           </w:tcPr>
           <w:p>
             <w:r>
@@ -7814,7 +7814,7 @@
         </w:tc>
         <w:tc>
           <w:tcPr>
-            <w:tcW w:type="dxa" w:w="3654"/>
+            <w:tcW w:type="dxa" w:w="3068"/>
           </w:tcPr>
           <w:p>
             <w:r>
@@ -7827,7 +7827,7 @@
         </w:tc>
         <w:tc>
           <w:tcPr>
-            <w:tcW w:type="dxa" w:w="2729"/>
+            <w:tcW w:type="dxa" w:w="2826"/>
           </w:tcPr>
           <w:p>
             <w:r>
@@ -7842,7 +7842,7 @@
       <w:tr>
         <w:tc>
           <w:tcPr>
-            <w:tcW w:type="dxa" w:w="271"/>
+            <w:tcW w:type="dxa" w:w="618"/>
           </w:tcPr>
           <w:p>
             <w:r>
@@ -7855,7 +7855,7 @@
         </w:tc>
         <w:tc>
           <w:tcPr>
-            <w:tcW w:type="dxa" w:w="2707"/>
+            <w:tcW w:type="dxa" w:w="2848"/>
           </w:tcPr>
           <w:p>
             <w:r>
@@ -7868,7 +7868,7 @@
         </w:tc>
         <w:tc>
           <w:tcPr>
-            <w:tcW w:type="dxa" w:w="3654"/>
+            <w:tcW w:type="dxa" w:w="3068"/>
           </w:tcPr>
           <w:p>
             <w:r>
@@ -7881,14 +7881,14 @@
         </w:tc>
         <w:tc>
           <w:tcPr>
-            <w:tcW w:type="dxa" w:w="2729"/>
-          </w:tcPr>
-          <w:p>
-            <w:r>
-              <w:rPr>
-                <w:sz w:val="17"/>
-              </w:rPr>
-              <w:t>True for 2024→25; about 18–19% annualised from 31 Dec 2025 to 3 Sep 2026 (246 days)</w:t>
+            <w:tcW w:type="dxa" w:w="2826"/>
+          </w:tcPr>
+          <w:p>
+            <w:r>
+              <w:rPr>
+                <w:sz w:val="17"/>
+              </w:rPr>
+              <w:t>True for 2024→25; about 18–19% annualised from 1 Jan 2026 (67,916) to 1 Sep 2026 (243 days)</w:t>
             </w:r>
           </w:p>
         </w:tc>
@@ -7896,7 +7896,7 @@
       <w:tr>
         <w:tc>
           <w:tcPr>
-            <w:tcW w:type="dxa" w:w="271"/>
+            <w:tcW w:type="dxa" w:w="618"/>
           </w:tcPr>
           <w:p>
             <w:r>
@@ -7909,7 +7909,7 @@
         </w:tc>
         <w:tc>
           <w:tcPr>
-            <w:tcW w:type="dxa" w:w="2707"/>
+            <w:tcW w:type="dxa" w:w="2848"/>
           </w:tcPr>
           <w:p>
             <w:r>
@@ -7922,7 +7922,7 @@
         </w:tc>
         <w:tc>
           <w:tcPr>
-            <w:tcW w:type="dxa" w:w="3654"/>
+            <w:tcW w:type="dxa" w:w="3068"/>
           </w:tcPr>
           <w:p>
             <w:r>
@@ -7935,7 +7935,7 @@
         </w:tc>
         <w:tc>
           <w:tcPr>
-            <w:tcW w:type="dxa" w:w="2729"/>
+            <w:tcW w:type="dxa" w:w="2826"/>
           </w:tcPr>
           <w:p>
             <w:r>
@@ -7950,7 +7950,7 @@
       <w:tr>
         <w:tc>
           <w:tcPr>
-            <w:tcW w:type="dxa" w:w="271"/>
+            <w:tcW w:type="dxa" w:w="618"/>
           </w:tcPr>
           <w:p>
             <w:r>
@@ -7963,7 +7963,7 @@
         </w:tc>
         <w:tc>
           <w:tcPr>
-            <w:tcW w:type="dxa" w:w="2707"/>
+            <w:tcW w:type="dxa" w:w="2848"/>
           </w:tcPr>
           <w:p>
             <w:r>
@@ -7976,7 +7976,7 @@
         </w:tc>
         <w:tc>
           <w:tcPr>
-            <w:tcW w:type="dxa" w:w="3654"/>
+            <w:tcW w:type="dxa" w:w="3068"/>
           </w:tcPr>
           <w:p>
             <w:r>
@@ -7989,7 +7989,7 @@
         </w:tc>
         <w:tc>
           <w:tcPr>
-            <w:tcW w:type="dxa" w:w="2729"/>
+            <w:tcW w:type="dxa" w:w="2826"/>
           </w:tcPr>
           <w:p>
             <w:r>
@@ -8004,7 +8004,7 @@
       <w:tr>
         <w:tc>
           <w:tcPr>
-            <w:tcW w:type="dxa" w:w="271"/>
+            <w:tcW w:type="dxa" w:w="618"/>
           </w:tcPr>
           <w:p>
             <w:r>
@@ -8017,7 +8017,7 @@
         </w:tc>
         <w:tc>
           <w:tcPr>
-            <w:tcW w:type="dxa" w:w="2707"/>
+            <w:tcW w:type="dxa" w:w="2848"/>
           </w:tcPr>
           <w:p>
             <w:r>
@@ -8030,7 +8030,7 @@
         </w:tc>
         <w:tc>
           <w:tcPr>
-            <w:tcW w:type="dxa" w:w="3654"/>
+            <w:tcW w:type="dxa" w:w="3068"/>
           </w:tcPr>
           <w:p>
             <w:r>
@@ -8043,7 +8043,7 @@
         </w:tc>
         <w:tc>
           <w:tcPr>
-            <w:tcW w:type="dxa" w:w="2729"/>
+            <w:tcW w:type="dxa" w:w="2826"/>
           </w:tcPr>
           <w:p>
             <w:r>
@@ -8058,7 +8058,7 @@
       <w:tr>
         <w:tc>
           <w:tcPr>
-            <w:tcW w:type="dxa" w:w="271"/>
+            <w:tcW w:type="dxa" w:w="618"/>
           </w:tcPr>
           <w:p>
             <w:r>
@@ -8071,7 +8071,7 @@
         </w:tc>
         <w:tc>
           <w:tcPr>
-            <w:tcW w:type="dxa" w:w="2707"/>
+            <w:tcW w:type="dxa" w:w="2848"/>
           </w:tcPr>
           <w:p>
             <w:r>
@@ -8084,7 +8084,7 @@
         </w:tc>
         <w:tc>
           <w:tcPr>
-            <w:tcW w:type="dxa" w:w="3654"/>
+            <w:tcW w:type="dxa" w:w="3068"/>
           </w:tcPr>
           <w:p>
             <w:r>
@@ -8097,7 +8097,7 @@
         </w:tc>
         <w:tc>
           <w:tcPr>
-            <w:tcW w:type="dxa" w:w="2729"/>
+            <w:tcW w:type="dxa" w:w="2826"/>
           </w:tcPr>
           <w:p>
             <w:r>
@@ -8112,7 +8112,7 @@
       <w:tr>
         <w:tc>
           <w:tcPr>
-            <w:tcW w:type="dxa" w:w="271"/>
+            <w:tcW w:type="dxa" w:w="618"/>
           </w:tcPr>
           <w:p>
             <w:r>
@@ -8125,7 +8125,7 @@
         </w:tc>
         <w:tc>
           <w:tcPr>
-            <w:tcW w:type="dxa" w:w="2707"/>
+            <w:tcW w:type="dxa" w:w="2848"/>
           </w:tcPr>
           <w:p>
             <w:r>
@@ -8138,7 +8138,7 @@
         </w:tc>
         <w:tc>
           <w:tcPr>
-            <w:tcW w:type="dxa" w:w="3654"/>
+            <w:tcW w:type="dxa" w:w="3068"/>
           </w:tcPr>
           <w:p>
             <w:r>
@@ -8151,7 +8151,7 @@
         </w:tc>
         <w:tc>
           <w:tcPr>
-            <w:tcW w:type="dxa" w:w="2729"/>
+            <w:tcW w:type="dxa" w:w="2826"/>
           </w:tcPr>
           <w:p>
             <w:r>
@@ -8166,7 +8166,7 @@
       <w:tr>
         <w:tc>
           <w:tcPr>
-            <w:tcW w:type="dxa" w:w="271"/>
+            <w:tcW w:type="dxa" w:w="618"/>
           </w:tcPr>
           <w:p>
             <w:r>
@@ -8179,7 +8179,7 @@
         </w:tc>
         <w:tc>
           <w:tcPr>
-            <w:tcW w:type="dxa" w:w="2707"/>
+            <w:tcW w:type="dxa" w:w="2848"/>
           </w:tcPr>
           <w:p>
             <w:r>
@@ -8192,7 +8192,7 @@
         </w:tc>
         <w:tc>
           <w:tcPr>
-            <w:tcW w:type="dxa" w:w="3654"/>
+            <w:tcW w:type="dxa" w:w="3068"/>
           </w:tcPr>
           <w:p>
             <w:r>
@@ -8205,7 +8205,7 @@
         </w:tc>
         <w:tc>
           <w:tcPr>
-            <w:tcW w:type="dxa" w:w="2729"/>
+            <w:tcW w:type="dxa" w:w="2826"/>
           </w:tcPr>
           <w:p>
             <w:r>
@@ -8220,7 +8220,7 @@
       <w:tr>
         <w:tc>
           <w:tcPr>
-            <w:tcW w:type="dxa" w:w="271"/>
+            <w:tcW w:type="dxa" w:w="618"/>
           </w:tcPr>
           <w:p>
             <w:r>
@@ -8233,7 +8233,7 @@
         </w:tc>
         <w:tc>
           <w:tcPr>
-            <w:tcW w:type="dxa" w:w="2707"/>
+            <w:tcW w:type="dxa" w:w="2848"/>
           </w:tcPr>
           <w:p>
             <w:r>
@@ -8246,7 +8246,7 @@
         </w:tc>
         <w:tc>
           <w:tcPr>
-            <w:tcW w:type="dxa" w:w="3654"/>
+            <w:tcW w:type="dxa" w:w="3068"/>
           </w:tcPr>
           <w:p>
             <w:r>
@@ -8259,7 +8259,7 @@
         </w:tc>
         <w:tc>
           <w:tcPr>
-            <w:tcW w:type="dxa" w:w="2729"/>
+            <w:tcW w:type="dxa" w:w="2826"/>
           </w:tcPr>
           <w:p>
             <w:r>
@@ -8274,7 +8274,7 @@
       <w:tr>
         <w:tc>
           <w:tcPr>
-            <w:tcW w:type="dxa" w:w="271"/>
+            <w:tcW w:type="dxa" w:w="618"/>
           </w:tcPr>
           <w:p>
             <w:r>
@@ -8287,7 +8287,7 @@
         </w:tc>
         <w:tc>
           <w:tcPr>
-            <w:tcW w:type="dxa" w:w="2707"/>
+            <w:tcW w:type="dxa" w:w="2848"/>
           </w:tcPr>
           <w:p>
             <w:r>
@@ -8300,7 +8300,7 @@
         </w:tc>
         <w:tc>
           <w:tcPr>
-            <w:tcW w:type="dxa" w:w="3654"/>
+            <w:tcW w:type="dxa" w:w="3068"/>
           </w:tcPr>
           <w:p>
             <w:r>
@@ -8313,7 +8313,7 @@
         </w:tc>
         <w:tc>
           <w:tcPr>
-            <w:tcW w:type="dxa" w:w="2729"/>
+            <w:tcW w:type="dxa" w:w="2826"/>
           </w:tcPr>
           <w:p>
             <w:r>
@@ -8328,7 +8328,7 @@
       <w:tr>
         <w:tc>
           <w:tcPr>
-            <w:tcW w:type="dxa" w:w="271"/>
+            <w:tcW w:type="dxa" w:w="618"/>
           </w:tcPr>
           <w:p>
             <w:r>
@@ -8341,7 +8341,7 @@
         </w:tc>
         <w:tc>
           <w:tcPr>
-            <w:tcW w:type="dxa" w:w="2707"/>
+            <w:tcW w:type="dxa" w:w="2848"/>
           </w:tcPr>
           <w:p>
             <w:r>
@@ -8354,7 +8354,7 @@
         </w:tc>
         <w:tc>
           <w:tcPr>
-            <w:tcW w:type="dxa" w:w="3654"/>
+            <w:tcW w:type="dxa" w:w="3068"/>
           </w:tcPr>
           <w:p>
             <w:r>
@@ -8367,7 +8367,7 @@
         </w:tc>
         <w:tc>
           <w:tcPr>
-            <w:tcW w:type="dxa" w:w="2729"/>
+            <w:tcW w:type="dxa" w:w="2826"/>
           </w:tcPr>
           <w:p>
             <w:r>
@@ -8382,7 +8382,7 @@
       <w:tr>
         <w:tc>
           <w:tcPr>
-            <w:tcW w:type="dxa" w:w="271"/>
+            <w:tcW w:type="dxa" w:w="618"/>
           </w:tcPr>
           <w:p>
             <w:r>
@@ -8395,7 +8395,7 @@
         </w:tc>
         <w:tc>
           <w:tcPr>
-            <w:tcW w:type="dxa" w:w="2707"/>
+            <w:tcW w:type="dxa" w:w="2848"/>
           </w:tcPr>
           <w:p>
             <w:r>
@@ -8408,7 +8408,7 @@
         </w:tc>
         <w:tc>
           <w:tcPr>
-            <w:tcW w:type="dxa" w:w="3654"/>
+            <w:tcW w:type="dxa" w:w="3068"/>
           </w:tcPr>
           <w:p>
             <w:r>
@@ -8421,7 +8421,7 @@
         </w:tc>
         <w:tc>
           <w:tcPr>
-            <w:tcW w:type="dxa" w:w="2729"/>
+            <w:tcW w:type="dxa" w:w="2826"/>
           </w:tcPr>
           <w:p>
             <w:r>
@@ -8436,7 +8436,7 @@
       <w:tr>
         <w:tc>
           <w:tcPr>
-            <w:tcW w:type="dxa" w:w="271"/>
+            <w:tcW w:type="dxa" w:w="618"/>
           </w:tcPr>
           <w:p>
             <w:r>
@@ -8449,7 +8449,7 @@
         </w:tc>
         <w:tc>
           <w:tcPr>
-            <w:tcW w:type="dxa" w:w="2707"/>
+            <w:tcW w:type="dxa" w:w="2848"/>
           </w:tcPr>
           <w:p>
             <w:r>
@@ -8462,7 +8462,7 @@
         </w:tc>
         <w:tc>
           <w:tcPr>
-            <w:tcW w:type="dxa" w:w="3654"/>
+            <w:tcW w:type="dxa" w:w="3068"/>
           </w:tcPr>
           <w:p>
             <w:r>
@@ -8475,7 +8475,7 @@
         </w:tc>
         <w:tc>
           <w:tcPr>
-            <w:tcW w:type="dxa" w:w="2729"/>
+            <w:tcW w:type="dxa" w:w="2826"/>
           </w:tcPr>
           <w:p>
             <w:r>
@@ -8490,7 +8490,7 @@
       <w:tr>
         <w:tc>
           <w:tcPr>
-            <w:tcW w:type="dxa" w:w="271"/>
+            <w:tcW w:type="dxa" w:w="618"/>
           </w:tcPr>
           <w:p>
             <w:r>
@@ -8503,7 +8503,7 @@
         </w:tc>
         <w:tc>
           <w:tcPr>
-            <w:tcW w:type="dxa" w:w="2707"/>
+            <w:tcW w:type="dxa" w:w="2848"/>
           </w:tcPr>
           <w:p>
             <w:r>
@@ -8516,7 +8516,7 @@
         </w:tc>
         <w:tc>
           <w:tcPr>
-            <w:tcW w:type="dxa" w:w="3654"/>
+            <w:tcW w:type="dxa" w:w="3068"/>
           </w:tcPr>
           <w:p>
             <w:r>
@@ -8529,7 +8529,7 @@
         </w:tc>
         <w:tc>
           <w:tcPr>
-            <w:tcW w:type="dxa" w:w="2729"/>
+            <w:tcW w:type="dxa" w:w="2826"/>
           </w:tcPr>
           <w:p>
             <w:r>
@@ -8544,7 +8544,7 @@
       <w:tr>
         <w:tc>
           <w:tcPr>
-            <w:tcW w:type="dxa" w:w="271"/>
+            <w:tcW w:type="dxa" w:w="618"/>
           </w:tcPr>
           <w:p>
             <w:r>
@@ -8557,7 +8557,7 @@
         </w:tc>
         <w:tc>
           <w:tcPr>
-            <w:tcW w:type="dxa" w:w="2707"/>
+            <w:tcW w:type="dxa" w:w="2848"/>
           </w:tcPr>
           <w:p>
             <w:r>
@@ -8570,7 +8570,7 @@
         </w:tc>
         <w:tc>
           <w:tcPr>
-            <w:tcW w:type="dxa" w:w="3654"/>
+            <w:tcW w:type="dxa" w:w="3068"/>
           </w:tcPr>
           <w:p>
             <w:r>
@@ -8583,7 +8583,7 @@
         </w:tc>
         <w:tc>
           <w:tcPr>
-            <w:tcW w:type="dxa" w:w="2729"/>
+            <w:tcW w:type="dxa" w:w="2826"/>
           </w:tcPr>
           <w:p>
             <w:r>
@@ -8598,7 +8598,7 @@
       <w:tr>
         <w:tc>
           <w:tcPr>
-            <w:tcW w:type="dxa" w:w="271"/>
+            <w:tcW w:type="dxa" w:w="618"/>
           </w:tcPr>
           <w:p>
             <w:r>
@@ -8611,7 +8611,7 @@
         </w:tc>
         <w:tc>
           <w:tcPr>
-            <w:tcW w:type="dxa" w:w="2707"/>
+            <w:tcW w:type="dxa" w:w="2848"/>
           </w:tcPr>
           <w:p>
             <w:r>
@@ -8624,7 +8624,7 @@
         </w:tc>
         <w:tc>
           <w:tcPr>
-            <w:tcW w:type="dxa" w:w="3654"/>
+            <w:tcW w:type="dxa" w:w="3068"/>
           </w:tcPr>
           <w:p>
             <w:r>
@@ -8637,7 +8637,7 @@
         </w:tc>
         <w:tc>
           <w:tcPr>
-            <w:tcW w:type="dxa" w:w="2729"/>
+            <w:tcW w:type="dxa" w:w="2826"/>
           </w:tcPr>
           <w:p>
             <w:r>
@@ -8652,7 +8652,7 @@
       <w:tr>
         <w:tc>
           <w:tcPr>
-            <w:tcW w:type="dxa" w:w="271"/>
+            <w:tcW w:type="dxa" w:w="618"/>
           </w:tcPr>
           <w:p>
             <w:r>
@@ -8665,7 +8665,7 @@
         </w:tc>
         <w:tc>
           <w:tcPr>
-            <w:tcW w:type="dxa" w:w="2707"/>
+            <w:tcW w:type="dxa" w:w="2848"/>
           </w:tcPr>
           <w:p>
             <w:r>
@@ -8678,7 +8678,7 @@
         </w:tc>
         <w:tc>
           <w:tcPr>
-            <w:tcW w:type="dxa" w:w="3654"/>
+            <w:tcW w:type="dxa" w:w="3068"/>
           </w:tcPr>
           <w:p>
             <w:r>
@@ -8691,7 +8691,7 @@
         </w:tc>
         <w:tc>
           <w:tcPr>
-            <w:tcW w:type="dxa" w:w="2729"/>
+            <w:tcW w:type="dxa" w:w="2826"/>
           </w:tcPr>
           <w:p>
             <w:r>
@@ -8706,7 +8706,7 @@
       <w:tr>
         <w:tc>
           <w:tcPr>
-            <w:tcW w:type="dxa" w:w="271"/>
+            <w:tcW w:type="dxa" w:w="618"/>
           </w:tcPr>
           <w:p>
             <w:r>
@@ -8719,7 +8719,7 @@
         </w:tc>
         <w:tc>
           <w:tcPr>
-            <w:tcW w:type="dxa" w:w="2707"/>
+            <w:tcW w:type="dxa" w:w="2848"/>
           </w:tcPr>
           <w:p>
             <w:r>
@@ -8732,7 +8732,7 @@
         </w:tc>
         <w:tc>
           <w:tcPr>
-            <w:tcW w:type="dxa" w:w="3654"/>
+            <w:tcW w:type="dxa" w:w="3068"/>
           </w:tcPr>
           <w:p>
             <w:r>
@@ -8745,7 +8745,7 @@
         </w:tc>
         <w:tc>
           <w:tcPr>
-            <w:tcW w:type="dxa" w:w="2729"/>
+            <w:tcW w:type="dxa" w:w="2826"/>
           </w:tcPr>
           <w:p>
             <w:r>
@@ -8760,7 +8760,7 @@
       <w:tr>
         <w:tc>
           <w:tcPr>
-            <w:tcW w:type="dxa" w:w="271"/>
+            <w:tcW w:type="dxa" w:w="618"/>
           </w:tcPr>
           <w:p>
             <w:r>
@@ -8773,7 +8773,7 @@
         </w:tc>
         <w:tc>
           <w:tcPr>
-            <w:tcW w:type="dxa" w:w="2707"/>
+            <w:tcW w:type="dxa" w:w="2848"/>
           </w:tcPr>
           <w:p>
             <w:r>
@@ -8786,7 +8786,7 @@
         </w:tc>
         <w:tc>
           <w:tcPr>
-            <w:tcW w:type="dxa" w:w="3654"/>
+            <w:tcW w:type="dxa" w:w="3068"/>
           </w:tcPr>
           <w:p>
             <w:r>
@@ -8799,7 +8799,7 @@
         </w:tc>
         <w:tc>
           <w:tcPr>
-            <w:tcW w:type="dxa" w:w="2729"/>
+            <w:tcW w:type="dxa" w:w="2826"/>
           </w:tcPr>
           <w:p>
             <w:r>
@@ -8814,7 +8814,7 @@
       <w:tr>
         <w:tc>
           <w:tcPr>
-            <w:tcW w:type="dxa" w:w="271"/>
+            <w:tcW w:type="dxa" w:w="618"/>
           </w:tcPr>
           <w:p>
             <w:r>
@@ -8827,7 +8827,7 @@
         </w:tc>
         <w:tc>
           <w:tcPr>
-            <w:tcW w:type="dxa" w:w="2707"/>
+            <w:tcW w:type="dxa" w:w="2848"/>
           </w:tcPr>
           <w:p>
             <w:r>
@@ -8840,7 +8840,7 @@
         </w:tc>
         <w:tc>
           <w:tcPr>
-            <w:tcW w:type="dxa" w:w="3654"/>
+            <w:tcW w:type="dxa" w:w="3068"/>
           </w:tcPr>
           <w:p>
             <w:r>
@@ -8853,7 +8853,7 @@
         </w:tc>
         <w:tc>
           <w:tcPr>
-            <w:tcW w:type="dxa" w:w="2729"/>
+            <w:tcW w:type="dxa" w:w="2826"/>
           </w:tcPr>
           <w:p>
             <w:r>
@@ -8868,7 +8868,7 @@
       <w:tr>
         <w:tc>
           <w:tcPr>
-            <w:tcW w:type="dxa" w:w="271"/>
+            <w:tcW w:type="dxa" w:w="618"/>
           </w:tcPr>
           <w:p>
             <w:r>
@@ -8881,20 +8881,20 @@
         </w:tc>
         <w:tc>
           <w:tcPr>
-            <w:tcW w:type="dxa" w:w="2707"/>
-          </w:tcPr>
-          <w:p>
-            <w:r>
-              <w:rPr>
-                <w:sz w:val="17"/>
-              </w:rPr>
-              <w:t>Agent Reliability Evaluation (the second part is repeated in Briefs v1 and v2 and the combined document; screenshot 12d)</w:t>
-            </w:r>
-          </w:p>
-        </w:tc>
-        <w:tc>
-          <w:tcPr>
-            <w:tcW w:type="dxa" w:w="3654"/>
+            <w:tcW w:type="dxa" w:w="2848"/>
+          </w:tcPr>
+          <w:p>
+            <w:r>
+              <w:rPr>
+                <w:sz w:val="17"/>
+              </w:rPr>
+              <w:t>Agent Reliability Evaluation (the second part is repeated in Briefs v1 and v2 and the combined document; screenshot 12d; the first part is plotted in chart V10)</w:t>
+            </w:r>
+          </w:p>
+        </w:tc>
+        <w:tc>
+          <w:tcPr>
+            <w:tcW w:type="dxa" w:w="3068"/>
           </w:tcPr>
           <w:p>
             <w:r>
@@ -8907,14 +8907,14 @@
         </w:tc>
         <w:tc>
           <w:tcPr>
-            <w:tcW w:type="dxa" w:w="2729"/>
-          </w:tcPr>
-          <w:p>
-            <w:r>
-              <w:rPr>
-                <w:sz w:val="17"/>
-              </w:rPr>
-              <w:t>Like-for-like AFDC counts give about +32% for 2023→24 (38,271 → 50,428); the 246-day period gives about 18–19% annualised</w:t>
+            <w:tcW w:type="dxa" w:w="2826"/>
+          </w:tcPr>
+          <w:p>
+            <w:r>
+              <w:rPr>
+                <w:sz w:val="17"/>
+              </w:rPr>
+              <w:t>Like-for-like AFDC counts give about +32% for 2023→24 (38,271 → 50,428); the 243-day period gives about 18–19% annualised</w:t>
             </w:r>
           </w:p>
         </w:tc>
@@ -8922,7 +8922,7 @@
       <w:tr>
         <w:tc>
           <w:tcPr>
-            <w:tcW w:type="dxa" w:w="271"/>
+            <w:tcW w:type="dxa" w:w="618"/>
           </w:tcPr>
           <w:p>
             <w:r>
@@ -8935,7 +8935,7 @@
         </w:tc>
         <w:tc>
           <w:tcPr>
-            <w:tcW w:type="dxa" w:w="2707"/>
+            <w:tcW w:type="dxa" w:w="2848"/>
           </w:tcPr>
           <w:p>
             <w:r>
@@ -8948,7 +8948,7 @@
         </w:tc>
         <w:tc>
           <w:tcPr>
-            <w:tcW w:type="dxa" w:w="3654"/>
+            <w:tcW w:type="dxa" w:w="3068"/>
           </w:tcPr>
           <w:p>
             <w:r>
@@ -8961,7 +8961,7 @@
         </w:tc>
         <w:tc>
           <w:tcPr>
-            <w:tcW w:type="dxa" w:w="2729"/>
+            <w:tcW w:type="dxa" w:w="2826"/>
           </w:tcPr>
           <w:p>
             <w:r>
@@ -8976,7 +8976,7 @@
       <w:tr>
         <w:tc>
           <w:tcPr>
-            <w:tcW w:type="dxa" w:w="271"/>
+            <w:tcW w:type="dxa" w:w="618"/>
           </w:tcPr>
           <w:p>
             <w:r>
@@ -8989,7 +8989,7 @@
         </w:tc>
         <w:tc>
           <w:tcPr>
-            <w:tcW w:type="dxa" w:w="2707"/>
+            <w:tcW w:type="dxa" w:w="2848"/>
           </w:tcPr>
           <w:p>
             <w:r>
@@ -9002,7 +9002,7 @@
         </w:tc>
         <w:tc>
           <w:tcPr>
-            <w:tcW w:type="dxa" w:w="3654"/>
+            <w:tcW w:type="dxa" w:w="3068"/>
           </w:tcPr>
           <w:p>
             <w:r>
@@ -9015,7 +9015,7 @@
         </w:tc>
         <w:tc>
           <w:tcPr>
-            <w:tcW w:type="dxa" w:w="2729"/>
+            <w:tcW w:type="dxa" w:w="2826"/>
           </w:tcPr>
           <w:p>
             <w:r>
@@ -9030,7 +9030,7 @@
       <w:tr>
         <w:tc>
           <w:tcPr>
-            <w:tcW w:type="dxa" w:w="271"/>
+            <w:tcW w:type="dxa" w:w="618"/>
           </w:tcPr>
           <w:p>
             <w:r>
@@ -9043,7 +9043,7 @@
         </w:tc>
         <w:tc>
           <w:tcPr>
-            <w:tcW w:type="dxa" w:w="2707"/>
+            <w:tcW w:type="dxa" w:w="2848"/>
           </w:tcPr>
           <w:p>
             <w:r>
@@ -9056,7 +9056,7 @@
         </w:tc>
         <w:tc>
           <w:tcPr>
-            <w:tcW w:type="dxa" w:w="3654"/>
+            <w:tcW w:type="dxa" w:w="3068"/>
           </w:tcPr>
           <w:p>
             <w:r>
@@ -9069,7 +9069,7 @@
         </w:tc>
         <w:tc>
           <w:tcPr>
-            <w:tcW w:type="dxa" w:w="2729"/>
+            <w:tcW w:type="dxa" w:w="2826"/>
           </w:tcPr>
           <w:p>
             <w:r>
@@ -9084,7 +9084,7 @@
       <w:tr>
         <w:tc>
           <w:tcPr>
-            <w:tcW w:type="dxa" w:w="271"/>
+            <w:tcW w:type="dxa" w:w="618"/>
           </w:tcPr>
           <w:p>
             <w:r>
@@ -9097,7 +9097,7 @@
         </w:tc>
         <w:tc>
           <w:tcPr>
-            <w:tcW w:type="dxa" w:w="2707"/>
+            <w:tcW w:type="dxa" w:w="2848"/>
           </w:tcPr>
           <w:p>
             <w:r>
@@ -9110,7 +9110,7 @@
         </w:tc>
         <w:tc>
           <w:tcPr>
-            <w:tcW w:type="dxa" w:w="3654"/>
+            <w:tcW w:type="dxa" w:w="3068"/>
           </w:tcPr>
           <w:p>
             <w:r>
@@ -9123,7 +9123,7 @@
         </w:tc>
         <w:tc>
           <w:tcPr>
-            <w:tcW w:type="dxa" w:w="2729"/>
+            <w:tcW w:type="dxa" w:w="2826"/>
           </w:tcPr>
           <w:p>
             <w:r>
@@ -9138,7 +9138,7 @@
       <w:tr>
         <w:tc>
           <w:tcPr>
-            <w:tcW w:type="dxa" w:w="271"/>
+            <w:tcW w:type="dxa" w:w="618"/>
           </w:tcPr>
           <w:p>
             <w:r>
@@ -9151,7 +9151,7 @@
         </w:tc>
         <w:tc>
           <w:tcPr>
-            <w:tcW w:type="dxa" w:w="2707"/>
+            <w:tcW w:type="dxa" w:w="2848"/>
           </w:tcPr>
           <w:p>
             <w:r>
@@ -9164,7 +9164,7 @@
         </w:tc>
         <w:tc>
           <w:tcPr>
-            <w:tcW w:type="dxa" w:w="3654"/>
+            <w:tcW w:type="dxa" w:w="3068"/>
           </w:tcPr>
           <w:p>
             <w:r>
@@ -9177,7 +9177,7 @@
         </w:tc>
         <w:tc>
           <w:tcPr>
-            <w:tcW w:type="dxa" w:w="2729"/>
+            <w:tcW w:type="dxa" w:w="2826"/>
           </w:tcPr>
           <w:p>
             <w:r>
@@ -9192,7 +9192,7 @@
       <w:tr>
         <w:tc>
           <w:tcPr>
-            <w:tcW w:type="dxa" w:w="271"/>
+            <w:tcW w:type="dxa" w:w="618"/>
           </w:tcPr>
           <w:p>
             <w:r>
@@ -9205,7 +9205,7 @@
         </w:tc>
         <w:tc>
           <w:tcPr>
-            <w:tcW w:type="dxa" w:w="2707"/>
+            <w:tcW w:type="dxa" w:w="2848"/>
           </w:tcPr>
           <w:p>
             <w:r>
@@ -9218,7 +9218,7 @@
         </w:tc>
         <w:tc>
           <w:tcPr>
-            <w:tcW w:type="dxa" w:w="3654"/>
+            <w:tcW w:type="dxa" w:w="3068"/>
           </w:tcPr>
           <w:p>
             <w:r>
@@ -9231,7 +9231,7 @@
         </w:tc>
         <w:tc>
           <w:tcPr>
-            <w:tcW w:type="dxa" w:w="2729"/>
+            <w:tcW w:type="dxa" w:w="2826"/>
           </w:tcPr>
           <w:p>
             <w:r>
@@ -9246,7 +9246,7 @@
       <w:tr>
         <w:tc>
           <w:tcPr>
-            <w:tcW w:type="dxa" w:w="271"/>
+            <w:tcW w:type="dxa" w:w="618"/>
           </w:tcPr>
           <w:p>
             <w:r>
@@ -9259,7 +9259,7 @@
         </w:tc>
         <w:tc>
           <w:tcPr>
-            <w:tcW w:type="dxa" w:w="2707"/>
+            <w:tcW w:type="dxa" w:w="2848"/>
           </w:tcPr>
           <w:p>
             <w:r>
@@ -9272,7 +9272,7 @@
         </w:tc>
         <w:tc>
           <w:tcPr>
-            <w:tcW w:type="dxa" w:w="3654"/>
+            <w:tcW w:type="dxa" w:w="3068"/>
           </w:tcPr>
           <w:p>
             <w:r>
@@ -9285,7 +9285,7 @@
         </w:tc>
         <w:tc>
           <w:tcPr>
-            <w:tcW w:type="dxa" w:w="2729"/>
+            <w:tcW w:type="dxa" w:w="2826"/>
           </w:tcPr>
           <w:p>
             <w:r>
@@ -9300,7 +9300,7 @@
       <w:tr>
         <w:tc>
           <w:tcPr>
-            <w:tcW w:type="dxa" w:w="271"/>
+            <w:tcW w:type="dxa" w:w="618"/>
           </w:tcPr>
           <w:p>
             <w:r>
@@ -9313,7 +9313,7 @@
         </w:tc>
         <w:tc>
           <w:tcPr>
-            <w:tcW w:type="dxa" w:w="2707"/>
+            <w:tcW w:type="dxa" w:w="2848"/>
           </w:tcPr>
           <w:p>
             <w:r>
@@ -9326,7 +9326,7 @@
         </w:tc>
         <w:tc>
           <w:tcPr>
-            <w:tcW w:type="dxa" w:w="3654"/>
+            <w:tcW w:type="dxa" w:w="3068"/>
           </w:tcPr>
           <w:p>
             <w:r>
@@ -9339,7 +9339,7 @@
         </w:tc>
         <w:tc>
           <w:tcPr>
-            <w:tcW w:type="dxa" w:w="2729"/>
+            <w:tcW w:type="dxa" w:w="2826"/>
           </w:tcPr>
           <w:p>
             <w:r>
@@ -9354,7 +9354,7 @@
       <w:tr>
         <w:tc>
           <w:tcPr>
-            <w:tcW w:type="dxa" w:w="271"/>
+            <w:tcW w:type="dxa" w:w="618"/>
           </w:tcPr>
           <w:p>
             <w:r>
@@ -9367,7 +9367,7 @@
         </w:tc>
         <w:tc>
           <w:tcPr>
-            <w:tcW w:type="dxa" w:w="2707"/>
+            <w:tcW w:type="dxa" w:w="2848"/>
           </w:tcPr>
           <w:p>
             <w:r>
@@ -9380,7 +9380,7 @@
         </w:tc>
         <w:tc>
           <w:tcPr>
-            <w:tcW w:type="dxa" w:w="3654"/>
+            <w:tcW w:type="dxa" w:w="3068"/>
           </w:tcPr>
           <w:p>
             <w:r>
@@ -9393,7 +9393,7 @@
         </w:tc>
         <w:tc>
           <w:tcPr>
-            <w:tcW w:type="dxa" w:w="2729"/>
+            <w:tcW w:type="dxa" w:w="2826"/>
           </w:tcPr>
           <w:p>
             <w:r>
@@ -9407,6 +9407,11 @@
       </w:tr>
     </w:tbl>
     <w:p/>
+    <w:p>
+      <w:r>
+        <w:t>The agent's Market Analysis (both versions) and combined document also repeat R6, R8, R9 and R18 in their competitor tables. These repeats are not counted separately, and none is used here.</w:t>
+      </w:r>
+    </w:p>
     <w:p>
       <w:r>
         <w:br w:type="page"/>

</xml_diff>